<commit_message>
Use Korean-first deliverable titles
</commit_message>
<xml_diff>
--- a/docs/deliverables/docx/01_LLM_Operation_Management_Design.docx
+++ b/docs/deliverables/docx/01_LLM_Operation_Management_Design.docx
@@ -2,13 +2,13 @@
 <file path=word/document.xml><?xml version="1.0" encoding="utf-8"?>
 <w:document xmlns:w="http://schemas.openxmlformats.org/wordprocessingml/2006/main" xmlns:m="http://schemas.openxmlformats.org/officeDocument/2006/math" xmlns:r="http://schemas.openxmlformats.org/officeDocument/2006/relationships" xmlns:o="urn:schemas-microsoft-com:office:office" xmlns:v="urn:schemas-microsoft-com:vml" xmlns:w10="urn:schemas-microsoft-com:office:word" xmlns:a="http://schemas.openxmlformats.org/drawingml/2006/main" xmlns:pic="http://schemas.openxmlformats.org/drawingml/2006/picture" xmlns:wp="http://schemas.openxmlformats.org/drawingml/2006/wordprocessingDrawing">
   <w:body>
-    <w:bookmarkStart w:id="20" w:name="X93fc7662f4899d963d8960eb483e3257a61c4e9"/>
+    <w:bookmarkStart w:id="20" w:name="llm-운영-관리-구조-설계서"/>
     <w:p>
       <w:pPr>
         <w:pStyle w:val="Heading1"/>
       </w:pPr>
       <w:r>
-        <w:t xml:space="preserve">LLM Operation Management Structure Design</w:t>
+        <w:t xml:space="preserve">LLM 운영 관리 구조 설계서</w:t>
       </w:r>
     </w:p>
     <w:p>
@@ -16,7 +16,7 @@
         <w:pStyle w:val="FirstParagraph"/>
       </w:pPr>
       <w:r>
-        <w:t xml:space="preserve">LLM 운영 관리 구조 설계서</w:t>
+        <w:t xml:space="preserve">English title: LLM Operation Management Structure Design</w:t>
       </w:r>
     </w:p>
     <w:bookmarkStart w:id="9" w:name="purpose"/>
@@ -1235,13 +1235,13 @@
         <w:pStyle w:val="FirstParagraph"/>
       </w:pPr>
       <w:r>
-        <w:t xml:space="preserve">This design does not claim a final LLM benchmark result. It defines a prototype</w:t>
-      </w:r>
-      <w:r>
-        <w:t xml:space="preserve"> </w:t>
-      </w:r>
-      <w:r>
-        <w:t xml:space="preserve">policy-selection structure that can later be connected to standardized</w:t>
+        <w:t xml:space="preserve">This design does not claim standardized LLM evaluation completion. It defines a</w:t>
+      </w:r>
+      <w:r>
+        <w:t xml:space="preserve"> </w:t>
+      </w:r>
+      <w:r>
+        <w:t xml:space="preserve">prototype policy-selection structure that can later be connected to standardized</w:t>
       </w:r>
       <w:r>
         <w:t xml:space="preserve"> </w:t>

</xml_diff>

<commit_message>
Translate project documentation to Korean
</commit_message>
<xml_diff>
--- a/docs/deliverables/docx/01_LLM_Operation_Management_Design.docx
+++ b/docs/deliverables/docx/01_LLM_Operation_Management_Design.docx
@@ -16,16 +16,16 @@
         <w:pStyle w:val="FirstParagraph"/>
       </w:pPr>
       <w:r>
-        <w:t xml:space="preserve">English title: LLM Operation Management Structure Design</w:t>
-      </w:r>
-    </w:p>
-    <w:bookmarkStart w:id="9" w:name="purpose"/>
+        <w:t xml:space="preserve">영문 제목: LLM Operation Management Structure Design</w:t>
+      </w:r>
+    </w:p>
+    <w:bookmarkStart w:id="9" w:name="목적"/>
     <w:p>
       <w:pPr>
         <w:pStyle w:val="Heading2"/>
       </w:pPr>
       <w:r>
-        <w:t xml:space="preserve">1. Purpose</w:t>
+        <w:t xml:space="preserve">1. 목적</w:t>
       </w:r>
     </w:p>
     <w:p>
@@ -33,31 +33,7 @@
         <w:pStyle w:val="FirstParagraph"/>
       </w:pPr>
       <w:r>
-        <w:t xml:space="preserve">This document describes the LLM operation-management structure implemented in</w:t>
-      </w:r>
-      <w:r>
-        <w:t xml:space="preserve"> </w:t>
-      </w:r>
-      <w:r>
-        <w:t xml:space="preserve">the 1st-year Go-based prototype. The purpose of this design is to define how an</w:t>
-      </w:r>
-      <w:r>
-        <w:t xml:space="preserve"> </w:t>
-      </w:r>
-      <w:r>
-        <w:t xml:space="preserve">operation-oriented LLM candidate is selected, how the selected candidate is used</w:t>
-      </w:r>
-      <w:r>
-        <w:t xml:space="preserve"> </w:t>
-      </w:r>
-      <w:r>
-        <w:t xml:space="preserve">in the service-control flow, and how deterministic Go logic validates the</w:t>
-      </w:r>
-      <w:r>
-        <w:t xml:space="preserve"> </w:t>
-      </w:r>
-      <w:r>
-        <w:t xml:space="preserve">surrounding operation pipeline.</w:t>
+        <w:t xml:space="preserve">이 문서는 1차년도 Go 기반 프로토타입에 구현된 LLM 운영 관리 구조를 설명합니다. 목적은 운영 관점의 LLM 후보를 어떤 기준으로 선정하는지, 선정된 후보가 서비스 제어 흐름에서 어떻게 사용되는지, 그리고 주변 운영 pipeline을 Go 기반 결정론적 로직으로 어떻게 검증하는지 정의하는 것입니다.</w:t>
       </w:r>
     </w:p>
     <w:p>
@@ -65,29 +41,17 @@
         <w:pStyle w:val="BodyText"/>
       </w:pPr>
       <w:r>
-        <w:t xml:space="preserve">The document is written as an official design deliverable source file. It should</w:t>
-      </w:r>
-      <w:r>
-        <w:t xml:space="preserve"> </w:t>
-      </w:r>
-      <w:r>
-        <w:t xml:space="preserve">be reviewed together with the Go implementation, JSON policy configuration, and</w:t>
-      </w:r>
-      <w:r>
-        <w:t xml:space="preserve"> </w:t>
-      </w:r>
-      <w:r>
-        <w:t xml:space="preserve">submission validation records.</w:t>
+        <w:t xml:space="preserve">본 문서는 공식 설계 산출물 원본입니다. Go 구현, JSON 정책 설정, 제출 검증 기록과 함께 검토해야 합니다.</w:t>
       </w:r>
     </w:p>
     <w:bookmarkEnd w:id="9"/>
-    <w:bookmarkStart w:id="10" w:name="st-year-implementation-scope"/>
+    <w:bookmarkStart w:id="10" w:name="차년도-구현-범위"/>
     <w:p>
       <w:pPr>
         <w:pStyle w:val="Heading2"/>
       </w:pPr>
       <w:r>
-        <w:t xml:space="preserve">2. 1st-Year Implementation Scope</w:t>
+        <w:t xml:space="preserve">2. 1차년도 구현 범위</w:t>
       </w:r>
     </w:p>
     <w:p>
@@ -95,7 +59,7 @@
         <w:pStyle w:val="FirstParagraph"/>
       </w:pPr>
       <w:r>
-        <w:t xml:space="preserve">The implementation scope includes:</w:t>
+        <w:t xml:space="preserve">구현 범위는 다음과 같습니다.</w:t>
       </w:r>
     </w:p>
     <w:p>
@@ -107,7 +71,7 @@
         </w:numPr>
       </w:pPr>
       <w:r>
-        <w:t xml:space="preserve">Ops analysis and optimal LLM selection policy structure.</w:t>
+        <w:t xml:space="preserve">Ops 분석 및 최적 LLM 선정 정책 구조</w:t>
       </w:r>
     </w:p>
     <w:p>
@@ -119,7 +83,7 @@
         </w:numPr>
       </w:pPr>
       <w:r>
-        <w:t xml:space="preserve">AI LLM operation-management structure design.</w:t>
+        <w:t xml:space="preserve">AI LLM 운영 관리 구조 설계</w:t>
       </w:r>
     </w:p>
     <w:p>
@@ -131,7 +95,7 @@
         </w:numPr>
       </w:pPr>
       <w:r>
-        <w:t xml:space="preserve">Policy-based candidate ranking.</w:t>
+        <w:t xml:space="preserve">정책 기반 candidate ranking</w:t>
       </w:r>
     </w:p>
     <w:p>
@@ -143,7 +107,7 @@
         </w:numPr>
       </w:pPr>
       <w:r>
-        <w:t xml:space="preserve">Functional validation through Go CLI/API.</w:t>
+        <w:t xml:space="preserve">Go CLI/API 기반 기능 검증</w:t>
       </w:r>
     </w:p>
     <w:p>
@@ -155,13 +119,7 @@
         </w:numPr>
       </w:pPr>
       <w:r>
-        <w:t xml:space="preserve">Integration with agent registry, placement recommendation, and</w:t>
-      </w:r>
-      <w:r>
-        <w:t xml:space="preserve"> </w:t>
-      </w:r>
-      <w:r>
-        <w:t xml:space="preserve">service-operations readiness report.</w:t>
+        <w:t xml:space="preserve">에이전트 registry, 배치 추천, 서비스 운영 준비도 보고와의 통합</w:t>
       </w:r>
     </w:p>
     <w:p>
@@ -169,47 +127,17 @@
         <w:pStyle w:val="FirstParagraph"/>
       </w:pPr>
       <w:r>
-        <w:t xml:space="preserve">This document does not describe a complete production LLMOps platform. It</w:t>
-      </w:r>
-      <w:r>
-        <w:t xml:space="preserve"> </w:t>
-      </w:r>
-      <w:r>
-        <w:t xml:space="preserve">focuses on a policy-based LLM selection structure that can be implemented and</w:t>
-      </w:r>
-      <w:r>
-        <w:t xml:space="preserve"> </w:t>
-      </w:r>
-      <w:r>
-        <w:t xml:space="preserve">validated within the 1st-year research scope. The current implementation does</w:t>
-      </w:r>
-      <w:r>
-        <w:t xml:space="preserve"> </w:t>
-      </w:r>
-      <w:r>
-        <w:t xml:space="preserve">not replace a large-scale log analysis system or a real-time LLM serving</w:t>
-      </w:r>
-      <w:r>
-        <w:t xml:space="preserve"> </w:t>
-      </w:r>
-      <w:r>
-        <w:t xml:space="preserve">platform. Instead, it validates the selection policy, candidate ranking, and</w:t>
-      </w:r>
-      <w:r>
-        <w:t xml:space="preserve"> </w:t>
-      </w:r>
-      <w:r>
-        <w:t xml:space="preserve">service-control readiness reporting through Go API/CLI and JSON configuration.</w:t>
+        <w:t xml:space="preserve">이 문서는 완성형 production LLMOps platform을 설명하지 않습니다. 1차년도 연구 범위 안에서 구현 및 검증 가능한 정책 기반 LLM 선정 구조에 초점을 둡니다. 현재 구현은 대규모 log 분석 시스템이나 실시간 LLM serving platform을 대체하지 않으며, Go API/CLI와 JSON 설정을 통해 selection policy, candidate ranking, service-control readiness reporting을 검증합니다.</w:t>
       </w:r>
     </w:p>
     <w:bookmarkEnd w:id="10"/>
-    <w:bookmarkStart w:id="11" w:name="overall-design"/>
+    <w:bookmarkStart w:id="11" w:name="전체-구조"/>
     <w:p>
       <w:pPr>
         <w:pStyle w:val="Heading2"/>
       </w:pPr>
       <w:r>
-        <w:t xml:space="preserve">3. Overall Design</w:t>
+        <w:t xml:space="preserve">3. 전체 구조</w:t>
       </w:r>
     </w:p>
     <w:p>
@@ -282,41 +210,17 @@
         <w:pStyle w:val="FirstParagraph"/>
       </w:pPr>
       <w:r>
-        <w:t xml:space="preserve">The Go service-control layer keeps the LLM selection decision separate from</w:t>
-      </w:r>
-      <w:r>
-        <w:t xml:space="preserve"> </w:t>
-      </w:r>
-      <w:r>
-        <w:t xml:space="preserve">deterministic validation. The policy configuration provides candidate metrics</w:t>
-      </w:r>
-      <w:r>
-        <w:t xml:space="preserve"> </w:t>
-      </w:r>
-      <w:r>
-        <w:t xml:space="preserve">and policy weights. The Go logic ranks candidates, selects the runtime label,</w:t>
-      </w:r>
-      <w:r>
-        <w:t xml:space="preserve"> </w:t>
-      </w:r>
-      <w:r>
-        <w:t xml:space="preserve">and passes the selected candidate into the broader service-control readiness</w:t>
-      </w:r>
-      <w:r>
-        <w:t xml:space="preserve"> </w:t>
-      </w:r>
-      <w:r>
-        <w:t xml:space="preserve">flow.</w:t>
+        <w:t xml:space="preserve">Go service-control 계층은 LLM 선정 판단과 결정론적 검증을 분리합니다. 정책 설정은 candidate metric과 policy weight를 제공합니다. Go 로직은 후보를 ranking하고 runtime label을 선택한 뒤, 선택 결과를 더 넓은 service-control readiness 흐름에 전달합니다.</w:t>
       </w:r>
     </w:p>
     <w:bookmarkEnd w:id="11"/>
-    <w:bookmarkStart w:id="12" w:name="policy-configuration"/>
+    <w:bookmarkStart w:id="12" w:name="정책-설정"/>
     <w:p>
       <w:pPr>
         <w:pStyle w:val="Heading2"/>
       </w:pPr>
       <w:r>
-        <w:t xml:space="preserve">4. Policy Configuration</w:t>
+        <w:t xml:space="preserve">4. 정책 설정</w:t>
       </w:r>
     </w:p>
     <w:p>
@@ -324,7 +228,7 @@
         <w:pStyle w:val="FirstParagraph"/>
       </w:pPr>
       <w:r>
-        <w:t xml:space="preserve">The LLM policy configuration is maintained in:</w:t>
+        <w:t xml:space="preserve">LLM 정책 설정 파일은 다음 위치에 있습니다.</w:t>
       </w:r>
     </w:p>
     <w:p>
@@ -343,7 +247,7 @@
         <w:pStyle w:val="FirstParagraph"/>
       </w:pPr>
       <w:r>
-        <w:t xml:space="preserve">Important interpretation rules:</w:t>
+        <w:t xml:space="preserve">해석 규칙은 다음과 같습니다.</w:t>
       </w:r>
     </w:p>
     <w:p>
@@ -355,7 +259,7 @@
         </w:numPr>
       </w:pPr>
       <w:r>
-        <w:t xml:space="preserve">Current values are manually defined prototype policy baselines.</w:t>
+        <w:t xml:space="preserve">현재 값은 수동 정의된 프로토타입 정책 기준값입니다.</w:t>
       </w:r>
     </w:p>
     <w:p>
@@ -367,7 +271,7 @@
         </w:numPr>
       </w:pPr>
       <w:r>
-        <w:t xml:space="preserve">They are not final standardized benchmark results.</w:t>
+        <w:t xml:space="preserve">최종 표준 벤치마크 결과가 아닙니다.</w:t>
       </w:r>
     </w:p>
     <w:p>
@@ -379,13 +283,7 @@
         </w:numPr>
       </w:pPr>
       <w:r>
-        <w:t xml:space="preserve">Final quantitative reporting must regenerate values through controlled</w:t>
-      </w:r>
-      <w:r>
-        <w:t xml:space="preserve"> </w:t>
-      </w:r>
-      <w:r>
-        <w:t xml:space="preserve">per-model Ops evaluation runs.</w:t>
+        <w:t xml:space="preserve">최종 정량 보고에는 통제된 per-model Ops 평가로 재생성한 값이 필요합니다.</w:t>
       </w:r>
     </w:p>
     <w:p>
@@ -397,13 +295,7 @@
         </w:numPr>
       </w:pPr>
       <w:r>
-        <w:t xml:space="preserve">Fixed prompts, datasets, metric collection, and repeatable scoring rules are</w:t>
-      </w:r>
-      <w:r>
-        <w:t xml:space="preserve"> </w:t>
-      </w:r>
-      <w:r>
-        <w:t xml:space="preserve">required for final evaluation.</w:t>
+        <w:t xml:space="preserve">고정 프롬프트, 데이터셋, metric collection, 반복 가능한 scoring rule이 필요합니다.</w:t>
       </w:r>
     </w:p>
     <w:p>
@@ -415,13 +307,7 @@
         </w:numPr>
       </w:pPr>
       <w:r>
-        <w:t xml:space="preserve">Candidate names are prototype policy labels, not verified provider benchmark</w:t>
-      </w:r>
-      <w:r>
-        <w:t xml:space="preserve"> </w:t>
-      </w:r>
-      <w:r>
-        <w:t xml:space="preserve">claims.</w:t>
+        <w:t xml:space="preserve">candidate name은 prototype policy label이며 검증 완료된 provider benchmark claim이 아닙니다.</w:t>
       </w:r>
     </w:p>
     <w:p>
@@ -429,7 +315,7 @@
         <w:pStyle w:val="FirstParagraph"/>
       </w:pPr>
       <w:r>
-        <w:t xml:space="preserve">The configuration contains policy weights such as</w:t>
+        <w:t xml:space="preserve">설정 파일에는</w:t>
       </w:r>
       <w:r>
         <w:t xml:space="preserve"> </w:t>
@@ -441,10 +327,7 @@
         <w:t xml:space="preserve">quality_first</w:t>
       </w:r>
       <w:r>
-        <w:t xml:space="preserve"> </w:t>
-      </w:r>
-      <w:r>
-        <w:t xml:space="preserve">and</w:t>
+        <w:t xml:space="preserve">,</w:t>
       </w:r>
       <w:r>
         <w:t xml:space="preserve"> </w:t>
@@ -456,23 +339,157 @@
         <w:t xml:space="preserve">cost_first</w:t>
       </w:r>
       <w:r>
-        <w:t xml:space="preserve">, candidate role labels, and normalized score inputs used by the Go</w:t>
-      </w:r>
-      <w:r>
         <w:t xml:space="preserve"> </w:t>
       </w:r>
       <w:r>
-        <w:t xml:space="preserve">ranking function.</w:t>
+        <w:t xml:space="preserve">같은 policy weight, candidate role label, Go ranking function에서 사용하는 normalized score input이 포함됩니다.</w:t>
       </w:r>
     </w:p>
     <w:bookmarkEnd w:id="12"/>
-    <w:bookmarkStart w:id="13" w:name="candidate-roles"/>
+    <w:bookmarkStart w:id="13" w:name="후보-역할"/>
     <w:p>
       <w:pPr>
         <w:pStyle w:val="Heading2"/>
       </w:pPr>
       <w:r>
-        <w:t xml:space="preserve">5. Candidate Roles</w:t>
+        <w:t xml:space="preserve">5. 후보 역할</w:t>
+      </w:r>
+    </w:p>
+    <w:tbl>
+      <w:tblPr>
+        <w:tblStyle w:val="Table"/>
+        <w:tblW w:type="auto" w:w="0"/>
+        <w:tblLook w:firstRow="1" w:lastRow="0" w:firstColumn="0" w:lastColumn="0" w:noHBand="0" w:noVBand="0" w:val="0020"/>
+      </w:tblPr>
+      <w:tblGrid>
+        <w:gridCol w:w="3960"/>
+        <w:gridCol w:w="3960"/>
+      </w:tblGrid>
+      <w:tr>
+        <w:trPr>
+          <w:tblHeader w:val="on"/>
+        </w:trPr>
+        <w:tc>
+          <w:tcPr/>
+          <w:p>
+            <w:pPr>
+              <w:pStyle w:val="Compact"/>
+            </w:pPr>
+            <w:r>
+              <w:t xml:space="preserve">Candidate</w:t>
+            </w:r>
+          </w:p>
+        </w:tc>
+        <w:tc>
+          <w:tcPr/>
+          <w:p>
+            <w:pPr>
+              <w:pStyle w:val="Compact"/>
+            </w:pPr>
+            <w:r>
+              <w:t xml:space="preserve">역할</w:t>
+            </w:r>
+          </w:p>
+        </w:tc>
+      </w:tr>
+      <w:tr>
+        <w:tc>
+          <w:tcPr/>
+          <w:p>
+            <w:pPr>
+              <w:pStyle w:val="Compact"/>
+            </w:pPr>
+            <w:r>
+              <w:rPr>
+                <w:rStyle w:val="VerbatimChar"/>
+              </w:rPr>
+              <w:t xml:space="preserve">primary-ops-llm</w:t>
+            </w:r>
+          </w:p>
+        </w:tc>
+        <w:tc>
+          <w:tcPr/>
+          <w:p>
+            <w:pPr>
+              <w:pStyle w:val="Compact"/>
+            </w:pPr>
+            <w:r>
+              <w:t xml:space="preserve">서비스 제어 판단을 위한 기본 Ops reasoning 후보</w:t>
+            </w:r>
+          </w:p>
+        </w:tc>
+      </w:tr>
+      <w:tr>
+        <w:tc>
+          <w:tcPr/>
+          <w:p>
+            <w:pPr>
+              <w:pStyle w:val="Compact"/>
+            </w:pPr>
+            <w:r>
+              <w:rPr>
+                <w:rStyle w:val="VerbatimChar"/>
+              </w:rPr>
+              <w:t xml:space="preserve">low-cost-ops-llm</w:t>
+            </w:r>
+          </w:p>
+        </w:tc>
+        <w:tc>
+          <w:tcPr/>
+          <w:p>
+            <w:pPr>
+              <w:pStyle w:val="Compact"/>
+            </w:pPr>
+            <w:r>
+              <w:t xml:space="preserve">저비용 smoke-test 및 fallback 후보</w:t>
+            </w:r>
+          </w:p>
+        </w:tc>
+      </w:tr>
+      <w:tr>
+        <w:tc>
+          <w:tcPr/>
+          <w:p>
+            <w:pPr>
+              <w:pStyle w:val="Compact"/>
+            </w:pPr>
+            <w:r>
+              <w:rPr>
+                <w:rStyle w:val="VerbatimChar"/>
+              </w:rPr>
+              <w:t xml:space="preserve">code-cross-check-agent</w:t>
+            </w:r>
+          </w:p>
+        </w:tc>
+        <w:tc>
+          <w:tcPr/>
+          <w:p>
+            <w:pPr>
+              <w:pStyle w:val="Compact"/>
+            </w:pPr>
+            <w:r>
+              <w:t xml:space="preserve">코드와 문서 교차 검증 후보</w:t>
+            </w:r>
+          </w:p>
+        </w:tc>
+      </w:tr>
+    </w:tbl>
+    <w:p>
+      <w:pPr>
+        <w:pStyle w:val="BodyText"/>
+      </w:pPr>
+      <w:r>
+        <w:t xml:space="preserve">이 이름들은 프로토타입 정책 연결을 위한 role label입니다. 특정 상용 또는 오픈소스 LLM의 최종 벤치마크가 완료되었음을 의미하지 않습니다.</w:t>
+      </w:r>
+    </w:p>
+    <w:bookmarkEnd w:id="13"/>
+    <w:bookmarkStart w:id="14" w:name="점수-산정-방법"/>
+    <w:p>
+      <w:pPr>
+        <w:pStyle w:val="Heading2"/>
+      </w:pPr>
+      <w:r>
+        <w:t xml:space="preserve">6. 점수 산정 방법</w:t>
       </w:r>
     </w:p>
     <w:tbl>
@@ -497,18 +514,18 @@
               <w:pStyle w:val="Compact"/>
             </w:pPr>
             <w:r>
-              <w:t xml:space="preserve">Candidate</w:t>
-            </w:r>
-          </w:p>
-        </w:tc>
-        <w:tc>
-          <w:tcPr/>
-          <w:p>
-            <w:pPr>
-              <w:pStyle w:val="Compact"/>
-            </w:pPr>
-            <w:r>
-              <w:t xml:space="preserve">Role</w:t>
+              <w:t xml:space="preserve">Metric</w:t>
+            </w:r>
+          </w:p>
+        </w:tc>
+        <w:tc>
+          <w:tcPr/>
+          <w:p>
+            <w:pPr>
+              <w:pStyle w:val="Compact"/>
+            </w:pPr>
+            <w:r>
+              <w:t xml:space="preserve">의미</w:t>
             </w:r>
           </w:p>
         </w:tc>
@@ -524,18 +541,18 @@
               <w:rPr>
                 <w:rStyle w:val="VerbatimChar"/>
               </w:rPr>
-              <w:t xml:space="preserve">primary-ops-llm</w:t>
-            </w:r>
-          </w:p>
-        </w:tc>
-        <w:tc>
-          <w:tcPr/>
-          <w:p>
-            <w:pPr>
-              <w:pStyle w:val="Compact"/>
-            </w:pPr>
-            <w:r>
-              <w:t xml:space="preserve">Primary Ops reasoning candidate for service-control decisions</w:t>
+              <w:t xml:space="preserve">accuracy</w:t>
+            </w:r>
+          </w:p>
+        </w:tc>
+        <w:tc>
+          <w:tcPr/>
+          <w:p>
+            <w:pPr>
+              <w:pStyle w:val="Compact"/>
+            </w:pPr>
+            <w:r>
+              <w:t xml:space="preserve">운영 판단의 프로토타입 정확도 신호</w:t>
             </w:r>
           </w:p>
         </w:tc>
@@ -551,18 +568,18 @@
               <w:rPr>
                 <w:rStyle w:val="VerbatimChar"/>
               </w:rPr>
-              <w:t xml:space="preserve">low-cost-ops-llm</w:t>
-            </w:r>
-          </w:p>
-        </w:tc>
-        <w:tc>
-          <w:tcPr/>
-          <w:p>
-            <w:pPr>
-              <w:pStyle w:val="Compact"/>
-            </w:pPr>
-            <w:r>
-              <w:t xml:space="preserve">Low-cost smoke-test and fallback candidate</w:t>
+              <w:t xml:space="preserve">metric_success</w:t>
+            </w:r>
+          </w:p>
+        </w:tc>
+        <w:tc>
+          <w:tcPr/>
+          <w:p>
+            <w:pPr>
+              <w:pStyle w:val="Compact"/>
+            </w:pPr>
+            <w:r>
+              <w:t xml:space="preserve">사용 가능한 운영 metric 활용 능력</w:t>
             </w:r>
           </w:p>
         </w:tc>
@@ -578,18 +595,126 @@
               <w:rPr>
                 <w:rStyle w:val="VerbatimChar"/>
               </w:rPr>
-              <w:t xml:space="preserve">code-cross-check-agent</w:t>
-            </w:r>
-          </w:p>
-        </w:tc>
-        <w:tc>
-          <w:tcPr/>
-          <w:p>
-            <w:pPr>
-              <w:pStyle w:val="Compact"/>
-            </w:pPr>
-            <w:r>
-              <w:t xml:space="preserve">Code and documentation cross-check candidate</w:t>
+              <w:t xml:space="preserve">action_validity</w:t>
+            </w:r>
+          </w:p>
+        </w:tc>
+        <w:tc>
+          <w:tcPr/>
+          <w:p>
+            <w:pPr>
+              <w:pStyle w:val="Compact"/>
+            </w:pPr>
+            <w:r>
+              <w:t xml:space="preserve">제안 action이 bounded-control rule 안에 머무는지 여부</w:t>
+            </w:r>
+          </w:p>
+        </w:tc>
+      </w:tr>
+      <w:tr>
+        <w:tc>
+          <w:tcPr/>
+          <w:p>
+            <w:pPr>
+              <w:pStyle w:val="Compact"/>
+            </w:pPr>
+            <w:r>
+              <w:rPr>
+                <w:rStyle w:val="VerbatimChar"/>
+              </w:rPr>
+              <w:t xml:space="preserve">consistency</w:t>
+            </w:r>
+          </w:p>
+        </w:tc>
+        <w:tc>
+          <w:tcPr/>
+          <w:p>
+            <w:pPr>
+              <w:pStyle w:val="Compact"/>
+            </w:pPr>
+            <w:r>
+              <w:t xml:space="preserve">판단 반복 가능성</w:t>
+            </w:r>
+          </w:p>
+        </w:tc>
+      </w:tr>
+      <w:tr>
+        <w:tc>
+          <w:tcPr/>
+          <w:p>
+            <w:pPr>
+              <w:pStyle w:val="Compact"/>
+            </w:pPr>
+            <w:r>
+              <w:rPr>
+                <w:rStyle w:val="VerbatimChar"/>
+              </w:rPr>
+              <w:t xml:space="preserve">ttd</w:t>
+            </w:r>
+          </w:p>
+        </w:tc>
+        <w:tc>
+          <w:tcPr/>
+          <w:p>
+            <w:pPr>
+              <w:pStyle w:val="Compact"/>
+            </w:pPr>
+            <w:r>
+              <w:t xml:space="preserve">time-to-decision의 역방향 score</w:t>
+            </w:r>
+          </w:p>
+        </w:tc>
+      </w:tr>
+      <w:tr>
+        <w:tc>
+          <w:tcPr/>
+          <w:p>
+            <w:pPr>
+              <w:pStyle w:val="Compact"/>
+            </w:pPr>
+            <w:r>
+              <w:rPr>
+                <w:rStyle w:val="VerbatimChar"/>
+              </w:rPr>
+              <w:t xml:space="preserve">cost</w:t>
+            </w:r>
+          </w:p>
+        </w:tc>
+        <w:tc>
+          <w:tcPr/>
+          <w:p>
+            <w:pPr>
+              <w:pStyle w:val="Compact"/>
+            </w:pPr>
+            <w:r>
+              <w:t xml:space="preserve">추정 운영 비용의 역방향 score</w:t>
+            </w:r>
+          </w:p>
+        </w:tc>
+      </w:tr>
+      <w:tr>
+        <w:tc>
+          <w:tcPr/>
+          <w:p>
+            <w:pPr>
+              <w:pStyle w:val="Compact"/>
+            </w:pPr>
+            <w:r>
+              <w:rPr>
+                <w:rStyle w:val="VerbatimChar"/>
+              </w:rPr>
+              <w:t xml:space="preserve">latency</w:t>
+            </w:r>
+          </w:p>
+        </w:tc>
+        <w:tc>
+          <w:tcPr/>
+          <w:p>
+            <w:pPr>
+              <w:pStyle w:val="Compact"/>
+            </w:pPr>
+            <w:r>
+              <w:t xml:space="preserve">latency의 역방향 score</w:t>
             </w:r>
           </w:p>
         </w:tc>
@@ -600,23 +725,47 @@
         <w:pStyle w:val="BodyText"/>
       </w:pPr>
       <w:r>
-        <w:t xml:space="preserve">These names are role labels for prototype policy wiring. They do not claim that</w:t>
+        <w:t xml:space="preserve">각 policy는 normalized metric value와 설정된 weight를 조합합니다. 예를 들어</w:t>
       </w:r>
       <w:r>
         <w:t xml:space="preserve"> </w:t>
       </w:r>
       <w:r>
-        <w:t xml:space="preserve">a specific commercial or open-source LLM has been finally benchmarked.</w:t>
-      </w:r>
-    </w:p>
-    <w:bookmarkEnd w:id="13"/>
-    <w:bookmarkStart w:id="14" w:name="scoring-method"/>
+        <w:rPr>
+          <w:rStyle w:val="VerbatimChar"/>
+        </w:rPr>
+        <w:t xml:space="preserve">quality_first</w:t>
+      </w:r>
+      <w:r>
+        <w:t xml:space="preserve"> </w:t>
+      </w:r>
+      <w:r>
+        <w:t xml:space="preserve">policy는 운영 정확도, metric 활용, action validity, consistency를 우선하고,</w:t>
+      </w:r>
+      <w:r>
+        <w:t xml:space="preserve"> </w:t>
+      </w:r>
+      <w:r>
+        <w:rPr>
+          <w:rStyle w:val="VerbatimChar"/>
+        </w:rPr>
+        <w:t xml:space="preserve">cost_first</w:t>
+      </w:r>
+      <w:r>
+        <w:t xml:space="preserve"> </w:t>
+      </w:r>
+      <w:r>
+        <w:t xml:space="preserve">policy는 cost와 latency에 더 높은 가중치를 둡니다. 요청된 policy에서 weighted score가 가장 높은 candidate가 선택됩니다.</w:t>
+      </w:r>
+    </w:p>
+    <w:bookmarkEnd w:id="14"/>
+    <w:bookmarkStart w:id="15" w:name="go-구현"/>
     <w:p>
       <w:pPr>
         <w:pStyle w:val="Heading2"/>
       </w:pPr>
       <w:r>
-        <w:t xml:space="preserve">6. Scoring Method</w:t>
+        <w:t xml:space="preserve">7. Go 구현</w:t>
       </w:r>
     </w:p>
     <w:tbl>
@@ -641,23 +790,34 @@
               <w:pStyle w:val="Compact"/>
             </w:pPr>
             <w:r>
-              <w:t xml:space="preserve">Metric</w:t>
-            </w:r>
-          </w:p>
-        </w:tc>
-        <w:tc>
-          <w:tcPr/>
-          <w:p>
-            <w:pPr>
-              <w:pStyle w:val="Compact"/>
-            </w:pPr>
-            <w:r>
-              <w:t xml:space="preserve">Meaning</w:t>
+              <w:t xml:space="preserve">구성요소</w:t>
+            </w:r>
+          </w:p>
+        </w:tc>
+        <w:tc>
+          <w:tcPr/>
+          <w:p>
+            <w:pPr>
+              <w:pStyle w:val="Compact"/>
+            </w:pPr>
+            <w:r>
+              <w:t xml:space="preserve">경로</w:t>
             </w:r>
           </w:p>
         </w:tc>
       </w:tr>
       <w:tr>
+        <w:tc>
+          <w:tcPr/>
+          <w:p>
+            <w:pPr>
+              <w:pStyle w:val="Compact"/>
+            </w:pPr>
+            <w:r>
+              <w:t xml:space="preserve">서비스 로직</w:t>
+            </w:r>
+          </w:p>
+        </w:tc>
         <w:tc>
           <w:tcPr/>
           <w:p>
@@ -668,23 +828,23 @@
               <w:rPr>
                 <w:rStyle w:val="VerbatimChar"/>
               </w:rPr>
-              <w:t xml:space="preserve">accuracy</w:t>
-            </w:r>
-          </w:p>
-        </w:tc>
-        <w:tc>
-          <w:tcPr/>
-          <w:p>
-            <w:pPr>
-              <w:pStyle w:val="Compact"/>
-            </w:pPr>
-            <w:r>
-              <w:t xml:space="preserve">Prototype correctness signal for operation judgment</w:t>
+              <w:t xml:space="preserve">go/service-control-api/internal/api/service.go</w:t>
             </w:r>
           </w:p>
         </w:tc>
       </w:tr>
       <w:tr>
+        <w:tc>
+          <w:tcPr/>
+          <w:p>
+            <w:pPr>
+              <w:pStyle w:val="Compact"/>
+            </w:pPr>
+            <w:r>
+              <w:t xml:space="preserve">요청/응답 model</w:t>
+            </w:r>
+          </w:p>
+        </w:tc>
         <w:tc>
           <w:tcPr/>
           <w:p>
@@ -695,23 +855,23 @@
               <w:rPr>
                 <w:rStyle w:val="VerbatimChar"/>
               </w:rPr>
-              <w:t xml:space="preserve">metric_success</w:t>
-            </w:r>
-          </w:p>
-        </w:tc>
-        <w:tc>
-          <w:tcPr/>
-          <w:p>
-            <w:pPr>
-              <w:pStyle w:val="Compact"/>
-            </w:pPr>
-            <w:r>
-              <w:t xml:space="preserve">Ability to use available operation metrics</w:t>
+              <w:t xml:space="preserve">go/service-control-api/internal/api/models.go</w:t>
             </w:r>
           </w:p>
         </w:tc>
       </w:tr>
       <w:tr>
+        <w:tc>
+          <w:tcPr/>
+          <w:p>
+            <w:pPr>
+              <w:pStyle w:val="Compact"/>
+            </w:pPr>
+            <w:r>
+              <w:t xml:space="preserve">CLI entrypoint</w:t>
+            </w:r>
+          </w:p>
+        </w:tc>
         <w:tc>
           <w:tcPr/>
           <w:p>
@@ -722,23 +882,23 @@
               <w:rPr>
                 <w:rStyle w:val="VerbatimChar"/>
               </w:rPr>
-              <w:t xml:space="preserve">action_validity</w:t>
-            </w:r>
-          </w:p>
-        </w:tc>
-        <w:tc>
-          <w:tcPr/>
-          <w:p>
-            <w:pPr>
-              <w:pStyle w:val="Compact"/>
-            </w:pPr>
-            <w:r>
-              <w:t xml:space="preserve">Whether proposed actions remain inside bounded-control rules</w:t>
+              <w:t xml:space="preserve">go/service-control-api/cmd/aiops-service-control/main.go</w:t>
             </w:r>
           </w:p>
         </w:tc>
       </w:tr>
       <w:tr>
+        <w:tc>
+          <w:tcPr/>
+          <w:p>
+            <w:pPr>
+              <w:pStyle w:val="Compact"/>
+            </w:pPr>
+            <w:r>
+              <w:t xml:space="preserve">정책 설정</w:t>
+            </w:r>
+          </w:p>
+        </w:tc>
         <w:tc>
           <w:tcPr/>
           <w:p>
@@ -749,99 +909,7 @@
               <w:rPr>
                 <w:rStyle w:val="VerbatimChar"/>
               </w:rPr>
-              <w:t xml:space="preserve">consistency</w:t>
-            </w:r>
-          </w:p>
-        </w:tc>
-        <w:tc>
-          <w:tcPr/>
-          <w:p>
-            <w:pPr>
-              <w:pStyle w:val="Compact"/>
-            </w:pPr>
-            <w:r>
-              <w:t xml:space="preserve">Repeatability of decisions</w:t>
-            </w:r>
-          </w:p>
-        </w:tc>
-      </w:tr>
-      <w:tr>
-        <w:tc>
-          <w:tcPr/>
-          <w:p>
-            <w:pPr>
-              <w:pStyle w:val="Compact"/>
-            </w:pPr>
-            <w:r>
-              <w:rPr>
-                <w:rStyle w:val="VerbatimChar"/>
-              </w:rPr>
-              <w:t xml:space="preserve">ttd</w:t>
-            </w:r>
-          </w:p>
-        </w:tc>
-        <w:tc>
-          <w:tcPr/>
-          <w:p>
-            <w:pPr>
-              <w:pStyle w:val="Compact"/>
-            </w:pPr>
-            <w:r>
-              <w:t xml:space="preserve">Inverse time-to-decision score</w:t>
-            </w:r>
-          </w:p>
-        </w:tc>
-      </w:tr>
-      <w:tr>
-        <w:tc>
-          <w:tcPr/>
-          <w:p>
-            <w:pPr>
-              <w:pStyle w:val="Compact"/>
-            </w:pPr>
-            <w:r>
-              <w:rPr>
-                <w:rStyle w:val="VerbatimChar"/>
-              </w:rPr>
-              <w:t xml:space="preserve">cost</w:t>
-            </w:r>
-          </w:p>
-        </w:tc>
-        <w:tc>
-          <w:tcPr/>
-          <w:p>
-            <w:pPr>
-              <w:pStyle w:val="Compact"/>
-            </w:pPr>
-            <w:r>
-              <w:t xml:space="preserve">Inverse estimated operation cost score</w:t>
-            </w:r>
-          </w:p>
-        </w:tc>
-      </w:tr>
-      <w:tr>
-        <w:tc>
-          <w:tcPr/>
-          <w:p>
-            <w:pPr>
-              <w:pStyle w:val="Compact"/>
-            </w:pPr>
-            <w:r>
-              <w:rPr>
-                <w:rStyle w:val="VerbatimChar"/>
-              </w:rPr>
-              <w:t xml:space="preserve">latency</w:t>
-            </w:r>
-          </w:p>
-        </w:tc>
-        <w:tc>
-          <w:tcPr/>
-          <w:p>
-            <w:pPr>
-              <w:pStyle w:val="Compact"/>
-            </w:pPr>
-            <w:r>
-              <w:t xml:space="preserve">Inverse latency score</w:t>
+              <w:t xml:space="preserve">config/ops_llm_benchmark.json</w:t>
             </w:r>
           </w:p>
         </w:tc>
@@ -852,71 +920,157 @@
         <w:pStyle w:val="BodyText"/>
       </w:pPr>
       <w:r>
-        <w:t xml:space="preserve">Each policy combines normalized metric values using configured weights. For</w:t>
-      </w:r>
-      <w:r>
-        <w:t xml:space="preserve"> </w:t>
-      </w:r>
-      <w:r>
-        <w:t xml:space="preserve">example, the</w:t>
-      </w:r>
-      <w:r>
-        <w:t xml:space="preserve"> </w:t>
-      </w:r>
+        <w:t xml:space="preserve">구현은 JSON policy file을 읽고, 요청 policy를 검증하고, score input을 normalize한 뒤, weighted score를 계산하여 선택된 candidate와 ranking 결과를 반환합니다.</w:t>
+      </w:r>
+    </w:p>
+    <w:bookmarkEnd w:id="15"/>
+    <w:bookmarkStart w:id="16" w:name="cli-검증"/>
+    <w:p>
+      <w:pPr>
+        <w:pStyle w:val="Heading2"/>
+      </w:pPr>
+      <w:r>
+        <w:t xml:space="preserve">8. CLI 검증</w:t>
+      </w:r>
+    </w:p>
+    <w:p>
+      <w:pPr>
+        <w:pStyle w:val="SourceCode"/>
+      </w:pPr>
       <w:r>
         <w:rPr>
           <w:rStyle w:val="VerbatimChar"/>
         </w:rPr>
-        <w:t xml:space="preserve">quality_first</w:t>
-      </w:r>
-      <w:r>
-        <w:t xml:space="preserve"> </w:t>
-      </w:r>
-      <w:r>
-        <w:t xml:space="preserve">policy prioritizes operation correctness, metric</w:t>
-      </w:r>
-      <w:r>
-        <w:t xml:space="preserve"> </w:t>
-      </w:r>
-      <w:r>
-        <w:t xml:space="preserve">usage, action validity, and consistency, while the</w:t>
-      </w:r>
-      <w:r>
-        <w:t xml:space="preserve"> </w:t>
+        <w:t xml:space="preserve">cd go/service-control-api</w:t>
+      </w:r>
+      <w:r>
+        <w:br/>
       </w:r>
       <w:r>
         <w:rPr>
           <w:rStyle w:val="VerbatimChar"/>
         </w:rPr>
-        <w:t xml:space="preserve">cost_first</w:t>
-      </w:r>
-      <w:r>
-        <w:t xml:space="preserve"> </w:t>
-      </w:r>
-      <w:r>
-        <w:t xml:space="preserve">policy gives</w:t>
-      </w:r>
-      <w:r>
-        <w:t xml:space="preserve"> </w:t>
-      </w:r>
-      <w:r>
-        <w:t xml:space="preserve">more weight to cost and latency. The selected candidate is the one with the</w:t>
-      </w:r>
-      <w:r>
-        <w:t xml:space="preserve"> </w:t>
-      </w:r>
-      <w:r>
-        <w:t xml:space="preserve">highest weighted score under the requested policy.</w:t>
-      </w:r>
-    </w:p>
-    <w:bookmarkEnd w:id="14"/>
-    <w:bookmarkStart w:id="15" w:name="go-implementation"/>
+        <w:t xml:space="preserve">go run ./cmd/aiops-service-control select-ops-llm \</w:t>
+      </w:r>
+      <w:r>
+        <w:br/>
+      </w:r>
+      <w:r>
+        <w:rPr>
+          <w:rStyle w:val="VerbatimChar"/>
+        </w:rPr>
+        <w:t xml:space="preserve">  --config ../../config/ops_llm_benchmark.json \</w:t>
+      </w:r>
+      <w:r>
+        <w:br/>
+      </w:r>
+      <w:r>
+        <w:rPr>
+          <w:rStyle w:val="VerbatimChar"/>
+        </w:rPr>
+        <w:t xml:space="preserve">  --policy quality_first</w:t>
+      </w:r>
+    </w:p>
+    <w:p>
+      <w:pPr>
+        <w:pStyle w:val="FirstParagraph"/>
+      </w:pPr>
+      <w:r>
+        <w:t xml:space="preserve">기대 신호는 다음과 같습니다.</w:t>
+      </w:r>
+    </w:p>
+    <w:p>
+      <w:pPr>
+        <w:pStyle w:val="SourceCode"/>
+      </w:pPr>
+      <w:r>
+        <w:rPr>
+          <w:rStyle w:val="VerbatimChar"/>
+        </w:rPr>
+        <w:t xml:space="preserve">selected_model = primary-ops-llm</w:t>
+      </w:r>
+    </w:p>
+    <w:p>
+      <w:pPr>
+        <w:pStyle w:val="FirstParagraph"/>
+      </w:pPr>
+      <w:r>
+        <w:t xml:space="preserve">이 출력은 policy selection flow가 올바르게 연결되었음을 확인합니다. 최종 표준 LLM 성능 결과를 의미하지는 않습니다.</w:t>
+      </w:r>
+    </w:p>
+    <w:bookmarkEnd w:id="16"/>
+    <w:bookmarkStart w:id="17" w:name="api-검증"/>
     <w:p>
       <w:pPr>
         <w:pStyle w:val="Heading2"/>
       </w:pPr>
       <w:r>
-        <w:t xml:space="preserve">7. Go Implementation</w:t>
+        <w:t xml:space="preserve">9. API 검증</w:t>
+      </w:r>
+    </w:p>
+    <w:p>
+      <w:pPr>
+        <w:pStyle w:val="SourceCode"/>
+      </w:pPr>
+      <w:r>
+        <w:rPr>
+          <w:rStyle w:val="VerbatimChar"/>
+        </w:rPr>
+        <w:t xml:space="preserve">curl -s -X POST http://127.0.0.1:8080/api/v1/ops-llm/select \</w:t>
+      </w:r>
+      <w:r>
+        <w:br/>
+      </w:r>
+      <w:r>
+        <w:rPr>
+          <w:rStyle w:val="VerbatimChar"/>
+        </w:rPr>
+        <w:t xml:space="preserve">  -H 'content-type: application/json' \</w:t>
+      </w:r>
+      <w:r>
+        <w:br/>
+      </w:r>
+      <w:r>
+        <w:rPr>
+          <w:rStyle w:val="VerbatimChar"/>
+        </w:rPr>
+        <w:t xml:space="preserve">  -d '{"policy":"quality_first"}'</w:t>
+      </w:r>
+    </w:p>
+    <w:p>
+      <w:pPr>
+        <w:pStyle w:val="FirstParagraph"/>
+      </w:pPr>
+      <w:r>
+        <w:t xml:space="preserve">API는 선택된 candidate, score, ranked candidate list, rationale, validity flag를 반환합니다.</w:t>
+      </w:r>
+    </w:p>
+    <w:bookmarkEnd w:id="17"/>
+    <w:bookmarkStart w:id="18" w:name="설계-경계"/>
+    <w:p>
+      <w:pPr>
+        <w:pStyle w:val="Heading2"/>
+      </w:pPr>
+      <w:r>
+        <w:t xml:space="preserve">10. 설계 경계</w:t>
+      </w:r>
+    </w:p>
+    <w:p>
+      <w:pPr>
+        <w:pStyle w:val="FirstParagraph"/>
+      </w:pPr>
+      <w:r>
+        <w:t xml:space="preserve">이 설계서는 표준 LLM 평가 완료를 주장하지 않습니다. 향후 표준화된 평가 데이터와 연결 가능한 prototype policy-selection structure를 정의합니다. 현재 구현은 LLM 후보 선정이 AIOps service-control framework에 통합되는 방식을 보여주는 데 유용하지만, 운영 배포를 위해서는 실제 운영 trace, 반복 가능한 시험 scenario, provider별 model evaluation, monitoring, governance가 추가로 필요합니다.</w:t>
+      </w:r>
+    </w:p>
+    <w:bookmarkEnd w:id="18"/>
+    <w:bookmarkStart w:id="19" w:name="관련-산출물"/>
+    <w:p>
+      <w:pPr>
+        <w:pStyle w:val="Heading2"/>
+      </w:pPr>
+      <w:r>
+        <w:t xml:space="preserve">11. 관련 산출물</w:t>
       </w:r>
     </w:p>
     <w:tbl>
@@ -941,18 +1095,18 @@
               <w:pStyle w:val="Compact"/>
             </w:pPr>
             <w:r>
-              <w:t xml:space="preserve">Component</w:t>
-            </w:r>
-          </w:p>
-        </w:tc>
-        <w:tc>
-          <w:tcPr/>
-          <w:p>
-            <w:pPr>
-              <w:pStyle w:val="Compact"/>
-            </w:pPr>
-            <w:r>
-              <w:t xml:space="preserve">Path</w:t>
+              <w:t xml:space="preserve">산출물</w:t>
+            </w:r>
+          </w:p>
+        </w:tc>
+        <w:tc>
+          <w:tcPr/>
+          <w:p>
+            <w:pPr>
+              <w:pStyle w:val="Compact"/>
+            </w:pPr>
+            <w:r>
+              <w:t xml:space="preserve">경로</w:t>
             </w:r>
           </w:p>
         </w:tc>
@@ -965,7 +1119,34 @@
               <w:pStyle w:val="Compact"/>
             </w:pPr>
             <w:r>
-              <w:t xml:space="preserve">Service logic</w:t>
+              <w:t xml:space="preserve">LLM 정책 설정</w:t>
+            </w:r>
+          </w:p>
+        </w:tc>
+        <w:tc>
+          <w:tcPr/>
+          <w:p>
+            <w:pPr>
+              <w:pStyle w:val="Compact"/>
+            </w:pPr>
+            <w:r>
+              <w:rPr>
+                <w:rStyle w:val="VerbatimChar"/>
+              </w:rPr>
+              <w:t xml:space="preserve">config/ops_llm_benchmark.json</w:t>
+            </w:r>
+          </w:p>
+        </w:tc>
+      </w:tr>
+      <w:tr>
+        <w:tc>
+          <w:tcPr/>
+          <w:p>
+            <w:pPr>
+              <w:pStyle w:val="Compact"/>
+            </w:pPr>
+            <w:r>
+              <w:t xml:space="preserve">Go 서비스 로직</w:t>
             </w:r>
           </w:p>
         </w:tc>
@@ -992,7 +1173,7 @@
               <w:pStyle w:val="Compact"/>
             </w:pPr>
             <w:r>
-              <w:t xml:space="preserve">Request/response models</w:t>
+              <w:t xml:space="preserve">API/CLI model</w:t>
             </w:r>
           </w:p>
         </w:tc>
@@ -1046,399 +1227,7 @@
               <w:pStyle w:val="Compact"/>
             </w:pPr>
             <w:r>
-              <w:t xml:space="preserve">Policy configuration</w:t>
-            </w:r>
-          </w:p>
-        </w:tc>
-        <w:tc>
-          <w:tcPr/>
-          <w:p>
-            <w:pPr>
-              <w:pStyle w:val="Compact"/>
-            </w:pPr>
-            <w:r>
-              <w:rPr>
-                <w:rStyle w:val="VerbatimChar"/>
-              </w:rPr>
-              <w:t xml:space="preserve">config/ops_llm_benchmark.json</w:t>
-            </w:r>
-          </w:p>
-        </w:tc>
-      </w:tr>
-    </w:tbl>
-    <w:p>
-      <w:pPr>
-        <w:pStyle w:val="BodyText"/>
-      </w:pPr>
-      <w:r>
-        <w:t xml:space="preserve">The implementation loads the JSON policy file, validates the requested policy,</w:t>
-      </w:r>
-      <w:r>
-        <w:t xml:space="preserve"> </w:t>
-      </w:r>
-      <w:r>
-        <w:t xml:space="preserve">normalizes score inputs, computes weighted scores, and returns the selected</w:t>
-      </w:r>
-      <w:r>
-        <w:t xml:space="preserve"> </w:t>
-      </w:r>
-      <w:r>
-        <w:t xml:space="preserve">candidate and ranked alternatives.</w:t>
-      </w:r>
-    </w:p>
-    <w:bookmarkEnd w:id="15"/>
-    <w:bookmarkStart w:id="16" w:name="cli-validation"/>
-    <w:p>
-      <w:pPr>
-        <w:pStyle w:val="Heading2"/>
-      </w:pPr>
-      <w:r>
-        <w:t xml:space="preserve">8. CLI Validation</w:t>
-      </w:r>
-    </w:p>
-    <w:p>
-      <w:pPr>
-        <w:pStyle w:val="SourceCode"/>
-      </w:pPr>
-      <w:r>
-        <w:rPr>
-          <w:rStyle w:val="VerbatimChar"/>
-        </w:rPr>
-        <w:t xml:space="preserve">cd go/service-control-api</w:t>
-      </w:r>
-      <w:r>
-        <w:br/>
-      </w:r>
-      <w:r>
-        <w:rPr>
-          <w:rStyle w:val="VerbatimChar"/>
-        </w:rPr>
-        <w:t xml:space="preserve">go run ./cmd/aiops-service-control select-ops-llm \</w:t>
-      </w:r>
-      <w:r>
-        <w:br/>
-      </w:r>
-      <w:r>
-        <w:rPr>
-          <w:rStyle w:val="VerbatimChar"/>
-        </w:rPr>
-        <w:t xml:space="preserve">  --config ../../config/ops_llm_benchmark.json \</w:t>
-      </w:r>
-      <w:r>
-        <w:br/>
-      </w:r>
-      <w:r>
-        <w:rPr>
-          <w:rStyle w:val="VerbatimChar"/>
-        </w:rPr>
-        <w:t xml:space="preserve">  --policy quality_first</w:t>
-      </w:r>
-    </w:p>
-    <w:p>
-      <w:pPr>
-        <w:pStyle w:val="FirstParagraph"/>
-      </w:pPr>
-      <w:r>
-        <w:t xml:space="preserve">Expected prototype-level signal:</w:t>
-      </w:r>
-    </w:p>
-    <w:p>
-      <w:pPr>
-        <w:pStyle w:val="SourceCode"/>
-      </w:pPr>
-      <w:r>
-        <w:rPr>
-          <w:rStyle w:val="VerbatimChar"/>
-        </w:rPr>
-        <w:t xml:space="preserve">selected_model = primary-ops-llm</w:t>
-      </w:r>
-    </w:p>
-    <w:p>
-      <w:pPr>
-        <w:pStyle w:val="FirstParagraph"/>
-      </w:pPr>
-      <w:r>
-        <w:t xml:space="preserve">This output confirms that the policy selection flow is wired correctly. It does</w:t>
-      </w:r>
-      <w:r>
-        <w:t xml:space="preserve"> </w:t>
-      </w:r>
-      <w:r>
-        <w:t xml:space="preserve">not represent a final standardized LLM performance result.</w:t>
-      </w:r>
-    </w:p>
-    <w:bookmarkEnd w:id="16"/>
-    <w:bookmarkStart w:id="17" w:name="api-validation"/>
-    <w:p>
-      <w:pPr>
-        <w:pStyle w:val="Heading2"/>
-      </w:pPr>
-      <w:r>
-        <w:t xml:space="preserve">9. API Validation</w:t>
-      </w:r>
-    </w:p>
-    <w:p>
-      <w:pPr>
-        <w:pStyle w:val="SourceCode"/>
-      </w:pPr>
-      <w:r>
-        <w:rPr>
-          <w:rStyle w:val="VerbatimChar"/>
-        </w:rPr>
-        <w:t xml:space="preserve">curl -s -X POST http://127.0.0.1:8080/api/v1/ops-llm/select \</w:t>
-      </w:r>
-      <w:r>
-        <w:br/>
-      </w:r>
-      <w:r>
-        <w:rPr>
-          <w:rStyle w:val="VerbatimChar"/>
-        </w:rPr>
-        <w:t xml:space="preserve">  -H 'content-type: application/json' \</w:t>
-      </w:r>
-      <w:r>
-        <w:br/>
-      </w:r>
-      <w:r>
-        <w:rPr>
-          <w:rStyle w:val="VerbatimChar"/>
-        </w:rPr>
-        <w:t xml:space="preserve">  -d '{"policy":"quality_first"}'</w:t>
-      </w:r>
-    </w:p>
-    <w:p>
-      <w:pPr>
-        <w:pStyle w:val="FirstParagraph"/>
-      </w:pPr>
-      <w:r>
-        <w:t xml:space="preserve">The API returns the selected candidate, score, ranked candidate list, rationale,</w:t>
-      </w:r>
-      <w:r>
-        <w:t xml:space="preserve"> </w:t>
-      </w:r>
-      <w:r>
-        <w:t xml:space="preserve">and validity flag.</w:t>
-      </w:r>
-    </w:p>
-    <w:bookmarkEnd w:id="17"/>
-    <w:bookmarkStart w:id="18" w:name="design-boundary"/>
-    <w:p>
-      <w:pPr>
-        <w:pStyle w:val="Heading2"/>
-      </w:pPr>
-      <w:r>
-        <w:t xml:space="preserve">10. Design Boundary</w:t>
-      </w:r>
-    </w:p>
-    <w:p>
-      <w:pPr>
-        <w:pStyle w:val="FirstParagraph"/>
-      </w:pPr>
-      <w:r>
-        <w:t xml:space="preserve">This design does not claim standardized LLM evaluation completion. It defines a</w:t>
-      </w:r>
-      <w:r>
-        <w:t xml:space="preserve"> </w:t>
-      </w:r>
-      <w:r>
-        <w:t xml:space="preserve">prototype policy-selection structure that can later be connected to standardized</w:t>
-      </w:r>
-      <w:r>
-        <w:t xml:space="preserve"> </w:t>
-      </w:r>
-      <w:r>
-        <w:t xml:space="preserve">evaluation data. The current implementation is useful for demonstrating how LLM</w:t>
-      </w:r>
-      <w:r>
-        <w:t xml:space="preserve"> </w:t>
-      </w:r>
-      <w:r>
-        <w:t xml:space="preserve">candidate selection can be integrated into a broader AIOps service-control</w:t>
-      </w:r>
-      <w:r>
-        <w:t xml:space="preserve"> </w:t>
-      </w:r>
-      <w:r>
-        <w:t xml:space="preserve">framework, but production deployment would require real operation traces,</w:t>
-      </w:r>
-      <w:r>
-        <w:t xml:space="preserve"> </w:t>
-      </w:r>
-      <w:r>
-        <w:t xml:space="preserve">repeatable test scenarios, provider-specific model evaluation, monitoring, and</w:t>
-      </w:r>
-      <w:r>
-        <w:t xml:space="preserve"> </w:t>
-      </w:r>
-      <w:r>
-        <w:t xml:space="preserve">governance.</w:t>
-      </w:r>
-    </w:p>
-    <w:bookmarkEnd w:id="18"/>
-    <w:bookmarkStart w:id="19" w:name="related-artifacts"/>
-    <w:p>
-      <w:pPr>
-        <w:pStyle w:val="Heading2"/>
-      </w:pPr>
-      <w:r>
-        <w:t xml:space="preserve">11. Related Artifacts</w:t>
-      </w:r>
-    </w:p>
-    <w:tbl>
-      <w:tblPr>
-        <w:tblStyle w:val="Table"/>
-        <w:tblW w:type="pct" w:w="5000"/>
-        <w:tblLayout w:type="fixed"/>
-        <w:tblLook w:firstRow="1" w:lastRow="0" w:firstColumn="0" w:lastColumn="0" w:noHBand="0" w:noVBand="0" w:val="0020"/>
-      </w:tblPr>
-      <w:tblGrid>
-        <w:gridCol w:w="3960"/>
-        <w:gridCol w:w="3960"/>
-      </w:tblGrid>
-      <w:tr>
-        <w:trPr>
-          <w:tblHeader w:val="on"/>
-        </w:trPr>
-        <w:tc>
-          <w:tcPr/>
-          <w:p>
-            <w:pPr>
-              <w:pStyle w:val="Compact"/>
-            </w:pPr>
-            <w:r>
-              <w:t xml:space="preserve">Artifact</w:t>
-            </w:r>
-          </w:p>
-        </w:tc>
-        <w:tc>
-          <w:tcPr/>
-          <w:p>
-            <w:pPr>
-              <w:pStyle w:val="Compact"/>
-            </w:pPr>
-            <w:r>
-              <w:t xml:space="preserve">Path</w:t>
-            </w:r>
-          </w:p>
-        </w:tc>
-      </w:tr>
-      <w:tr>
-        <w:tc>
-          <w:tcPr/>
-          <w:p>
-            <w:pPr>
-              <w:pStyle w:val="Compact"/>
-            </w:pPr>
-            <w:r>
-              <w:t xml:space="preserve">LLM policy config</w:t>
-            </w:r>
-          </w:p>
-        </w:tc>
-        <w:tc>
-          <w:tcPr/>
-          <w:p>
-            <w:pPr>
-              <w:pStyle w:val="Compact"/>
-            </w:pPr>
-            <w:r>
-              <w:rPr>
-                <w:rStyle w:val="VerbatimChar"/>
-              </w:rPr>
-              <w:t xml:space="preserve">config/ops_llm_benchmark.json</w:t>
-            </w:r>
-          </w:p>
-        </w:tc>
-      </w:tr>
-      <w:tr>
-        <w:tc>
-          <w:tcPr/>
-          <w:p>
-            <w:pPr>
-              <w:pStyle w:val="Compact"/>
-            </w:pPr>
-            <w:r>
-              <w:t xml:space="preserve">Go service logic</w:t>
-            </w:r>
-          </w:p>
-        </w:tc>
-        <w:tc>
-          <w:tcPr/>
-          <w:p>
-            <w:pPr>
-              <w:pStyle w:val="Compact"/>
-            </w:pPr>
-            <w:r>
-              <w:rPr>
-                <w:rStyle w:val="VerbatimChar"/>
-              </w:rPr>
-              <w:t xml:space="preserve">go/service-control-api/internal/api/service.go</w:t>
-            </w:r>
-          </w:p>
-        </w:tc>
-      </w:tr>
-      <w:tr>
-        <w:tc>
-          <w:tcPr/>
-          <w:p>
-            <w:pPr>
-              <w:pStyle w:val="Compact"/>
-            </w:pPr>
-            <w:r>
-              <w:t xml:space="preserve">API/CLI models</w:t>
-            </w:r>
-          </w:p>
-        </w:tc>
-        <w:tc>
-          <w:tcPr/>
-          <w:p>
-            <w:pPr>
-              <w:pStyle w:val="Compact"/>
-            </w:pPr>
-            <w:r>
-              <w:rPr>
-                <w:rStyle w:val="VerbatimChar"/>
-              </w:rPr>
-              <w:t xml:space="preserve">go/service-control-api/internal/api/models.go</w:t>
-            </w:r>
-          </w:p>
-        </w:tc>
-      </w:tr>
-      <w:tr>
-        <w:tc>
-          <w:tcPr/>
-          <w:p>
-            <w:pPr>
-              <w:pStyle w:val="Compact"/>
-            </w:pPr>
-            <w:r>
-              <w:t xml:space="preserve">CLI entrypoint</w:t>
-            </w:r>
-          </w:p>
-        </w:tc>
-        <w:tc>
-          <w:tcPr/>
-          <w:p>
-            <w:pPr>
-              <w:pStyle w:val="Compact"/>
-            </w:pPr>
-            <w:r>
-              <w:rPr>
-                <w:rStyle w:val="VerbatimChar"/>
-              </w:rPr>
-              <w:t xml:space="preserve">go/service-control-api/cmd/aiops-service-control/main.go</w:t>
-            </w:r>
-          </w:p>
-        </w:tc>
-      </w:tr>
-      <w:tr>
-        <w:tc>
-          <w:tcPr/>
-          <w:p>
-            <w:pPr>
-              <w:pStyle w:val="Compact"/>
-            </w:pPr>
-            <w:r>
-              <w:t xml:space="preserve">Supporting selection guide</w:t>
+              <w:t xml:space="preserve">보조 선정 가이드</w:t>
             </w:r>
           </w:p>
         </w:tc>
@@ -1465,7 +1254,7 @@
               <w:pStyle w:val="Compact"/>
             </w:pPr>
             <w:r>
-              <w:t xml:space="preserve">Cross-validation design note</w:t>
+              <w:t xml:space="preserve">교차 검증 설계 노트</w:t>
             </w:r>
           </w:p>
         </w:tc>
@@ -1492,7 +1281,7 @@
               <w:pStyle w:val="Compact"/>
             </w:pPr>
             <w:r>
-              <w:t xml:space="preserve">Functional/API guide</w:t>
+              <w:t xml:space="preserve">기능/API 가이드</w:t>
             </w:r>
           </w:p>
         </w:tc>
@@ -1519,7 +1308,7 @@
               <w:pStyle w:val="Compact"/>
             </w:pPr>
             <w:r>
-              <w:t xml:space="preserve">Test guide</w:t>
+              <w:t xml:space="preserve">테스트 가이드</w:t>
             </w:r>
           </w:p>
         </w:tc>
@@ -1545,8 +1334,6 @@
       <w:footnotePr>
         <w:numRestart w:val="eachSect"/>
       </w:footnotePr>
-      <w:pgSz w:w="12240" w:h="15840"/>
-      <w:pgMar w:top="1440" w:bottom="1440" w:left="1440" w:right="1440"/>
     </w:sectPr>
   </w:body>
 </w:document>

</xml_diff>

<commit_message>
Simplify formal deliverable documents
</commit_message>
<xml_diff>
--- a/docs/deliverables/docx/01_LLM_Operation_Management_Design.docx
+++ b/docs/deliverables/docx/01_LLM_Operation_Management_Design.docx
@@ -2,7 +2,7 @@
 <file path=word/document.xml><?xml version="1.0" encoding="utf-8"?>
 <w:document xmlns:w="http://schemas.openxmlformats.org/wordprocessingml/2006/main" xmlns:m="http://schemas.openxmlformats.org/officeDocument/2006/math" xmlns:r="http://schemas.openxmlformats.org/officeDocument/2006/relationships" xmlns:o="urn:schemas-microsoft-com:office:office" xmlns:v="urn:schemas-microsoft-com:vml" xmlns:w10="urn:schemas-microsoft-com:office:word" xmlns:a="http://schemas.openxmlformats.org/drawingml/2006/main" xmlns:pic="http://schemas.openxmlformats.org/drawingml/2006/picture" xmlns:wp="http://schemas.openxmlformats.org/drawingml/2006/wordprocessingDrawing">
   <w:body>
-    <w:bookmarkStart w:id="20" w:name="llm-운영-관리-구조-설계서"/>
+    <w:bookmarkStart w:id="15" w:name="llm-운영-관리-구조-설계서"/>
     <w:p>
       <w:pPr>
         <w:pStyle w:val="Heading1"/>
@@ -19,477 +19,13 @@
         <w:t xml:space="preserve">영문 제목: LLM Operation Management Structure Design</w:t>
       </w:r>
     </w:p>
-    <w:bookmarkStart w:id="9" w:name="목적"/>
+    <w:bookmarkStart w:id="9" w:name="한눈에-보는-구조"/>
     <w:p>
       <w:pPr>
         <w:pStyle w:val="Heading2"/>
       </w:pPr>
       <w:r>
-        <w:t xml:space="preserve">1. 목적</w:t>
-      </w:r>
-    </w:p>
-    <w:p>
-      <w:pPr>
-        <w:pStyle w:val="FirstParagraph"/>
-      </w:pPr>
-      <w:r>
-        <w:t xml:space="preserve">이 문서는 1차년도 Go 기반 프로토타입에 구현된 LLM 운영 관리 구조를 설명합니다. 목적은 운영 관점의 LLM 후보를 어떤 기준으로 선정하는지, 선정된 후보가 서비스 제어 흐름에서 어떻게 사용되는지, 그리고 주변 운영 pipeline을 Go 기반 결정론적 로직으로 어떻게 검증하는지 정의하는 것입니다.</w:t>
-      </w:r>
-    </w:p>
-    <w:p>
-      <w:pPr>
-        <w:pStyle w:val="BodyText"/>
-      </w:pPr>
-      <w:r>
-        <w:t xml:space="preserve">본 문서는 공식 설계 산출물 원본입니다. Go 구현, JSON 정책 설정, 제출 검증 기록과 함께 검토해야 합니다.</w:t>
-      </w:r>
-    </w:p>
-    <w:bookmarkEnd w:id="9"/>
-    <w:bookmarkStart w:id="10" w:name="차년도-구현-범위"/>
-    <w:p>
-      <w:pPr>
-        <w:pStyle w:val="Heading2"/>
-      </w:pPr>
-      <w:r>
-        <w:t xml:space="preserve">2. 1차년도 구현 범위</w:t>
-      </w:r>
-    </w:p>
-    <w:p>
-      <w:pPr>
-        <w:pStyle w:val="FirstParagraph"/>
-      </w:pPr>
-      <w:r>
-        <w:t xml:space="preserve">구현 범위는 다음과 같습니다.</w:t>
-      </w:r>
-    </w:p>
-    <w:p>
-      <w:pPr>
-        <w:pStyle w:val="Compact"/>
-        <w:numPr>
-          <w:ilvl w:val="0"/>
-          <w:numId w:val="1001"/>
-        </w:numPr>
-      </w:pPr>
-      <w:r>
-        <w:t xml:space="preserve">Ops 분석 및 최적 LLM 선정 정책 구조</w:t>
-      </w:r>
-    </w:p>
-    <w:p>
-      <w:pPr>
-        <w:pStyle w:val="Compact"/>
-        <w:numPr>
-          <w:ilvl w:val="0"/>
-          <w:numId w:val="1001"/>
-        </w:numPr>
-      </w:pPr>
-      <w:r>
-        <w:t xml:space="preserve">AI LLM 운영 관리 구조 설계</w:t>
-      </w:r>
-    </w:p>
-    <w:p>
-      <w:pPr>
-        <w:pStyle w:val="Compact"/>
-        <w:numPr>
-          <w:ilvl w:val="0"/>
-          <w:numId w:val="1001"/>
-        </w:numPr>
-      </w:pPr>
-      <w:r>
-        <w:t xml:space="preserve">정책 기반 candidate ranking</w:t>
-      </w:r>
-    </w:p>
-    <w:p>
-      <w:pPr>
-        <w:pStyle w:val="Compact"/>
-        <w:numPr>
-          <w:ilvl w:val="0"/>
-          <w:numId w:val="1001"/>
-        </w:numPr>
-      </w:pPr>
-      <w:r>
-        <w:t xml:space="preserve">Go CLI/API 기반 기능 검증</w:t>
-      </w:r>
-    </w:p>
-    <w:p>
-      <w:pPr>
-        <w:pStyle w:val="Compact"/>
-        <w:numPr>
-          <w:ilvl w:val="0"/>
-          <w:numId w:val="1001"/>
-        </w:numPr>
-      </w:pPr>
-      <w:r>
-        <w:t xml:space="preserve">에이전트 registry, 배치 추천, 서비스 운영 준비도 보고와의 통합</w:t>
-      </w:r>
-    </w:p>
-    <w:p>
-      <w:pPr>
-        <w:pStyle w:val="FirstParagraph"/>
-      </w:pPr>
-      <w:r>
-        <w:t xml:space="preserve">이 문서는 완성형 production LLMOps platform을 설명하지 않습니다. 1차년도 연구 범위 안에서 구현 및 검증 가능한 정책 기반 LLM 선정 구조에 초점을 둡니다. 현재 구현은 대규모 log 분석 시스템이나 실시간 LLM serving platform을 대체하지 않으며, Go API/CLI와 JSON 설정을 통해 selection policy, candidate ranking, service-control readiness reporting을 검증합니다.</w:t>
-      </w:r>
-    </w:p>
-    <w:bookmarkEnd w:id="10"/>
-    <w:bookmarkStart w:id="11" w:name="전체-구조"/>
-    <w:p>
-      <w:pPr>
-        <w:pStyle w:val="Heading2"/>
-      </w:pPr>
-      <w:r>
-        <w:t xml:space="preserve">3. 전체 구조</w:t>
-      </w:r>
-    </w:p>
-    <w:p>
-      <w:pPr>
-        <w:pStyle w:val="SourceCode"/>
-      </w:pPr>
-      <w:r>
-        <w:rPr>
-          <w:rStyle w:val="VerbatimChar"/>
-        </w:rPr>
-        <w:t xml:space="preserve">Ops policy/config</w:t>
-      </w:r>
-      <w:r>
-        <w:br/>
-      </w:r>
-      <w:r>
-        <w:rPr>
-          <w:rStyle w:val="VerbatimChar"/>
-        </w:rPr>
-        <w:t xml:space="preserve">-&gt; Ops LLM candidate ranking</w:t>
-      </w:r>
-      <w:r>
-        <w:br/>
-      </w:r>
-      <w:r>
-        <w:rPr>
-          <w:rStyle w:val="VerbatimChar"/>
-        </w:rPr>
-        <w:t xml:space="preserve">-&gt; selected runtime candidate</w:t>
-      </w:r>
-      <w:r>
-        <w:br/>
-      </w:r>
-      <w:r>
-        <w:rPr>
-          <w:rStyle w:val="VerbatimChar"/>
-        </w:rPr>
-        <w:t xml:space="preserve">-&gt; agent registry validation</w:t>
-      </w:r>
-      <w:r>
-        <w:br/>
-      </w:r>
-      <w:r>
-        <w:rPr>
-          <w:rStyle w:val="VerbatimChar"/>
-        </w:rPr>
-        <w:t xml:space="preserve">-&gt; CPU/GPU VM placement recommendation</w:t>
-      </w:r>
-      <w:r>
-        <w:br/>
-      </w:r>
-      <w:r>
-        <w:rPr>
-          <w:rStyle w:val="VerbatimChar"/>
-        </w:rPr>
-        <w:t xml:space="preserve">-&gt; Kubernetes deployment-plan generation</w:t>
-      </w:r>
-      <w:r>
-        <w:br/>
-      </w:r>
-      <w:r>
-        <w:rPr>
-          <w:rStyle w:val="VerbatimChar"/>
-        </w:rPr>
-        <w:t xml:space="preserve">-&gt; service-operations readiness report</w:t>
-      </w:r>
-    </w:p>
-    <w:p>
-      <w:pPr>
-        <w:pStyle w:val="FirstParagraph"/>
-      </w:pPr>
-      <w:r>
-        <w:t xml:space="preserve">Go service-control 계층은 LLM 선정 판단과 결정론적 검증을 분리합니다. 정책 설정은 candidate metric과 policy weight를 제공합니다. Go 로직은 후보를 ranking하고 runtime label을 선택한 뒤, 선택 결과를 더 넓은 service-control readiness 흐름에 전달합니다.</w:t>
-      </w:r>
-    </w:p>
-    <w:bookmarkEnd w:id="11"/>
-    <w:bookmarkStart w:id="12" w:name="정책-설정"/>
-    <w:p>
-      <w:pPr>
-        <w:pStyle w:val="Heading2"/>
-      </w:pPr>
-      <w:r>
-        <w:t xml:space="preserve">4. 정책 설정</w:t>
-      </w:r>
-    </w:p>
-    <w:p>
-      <w:pPr>
-        <w:pStyle w:val="FirstParagraph"/>
-      </w:pPr>
-      <w:r>
-        <w:t xml:space="preserve">LLM 정책 설정 파일은 다음 위치에 있습니다.</w:t>
-      </w:r>
-    </w:p>
-    <w:p>
-      <w:pPr>
-        <w:pStyle w:val="SourceCode"/>
-      </w:pPr>
-      <w:r>
-        <w:rPr>
-          <w:rStyle w:val="VerbatimChar"/>
-        </w:rPr>
-        <w:t xml:space="preserve">config/ops_llm_benchmark.json</w:t>
-      </w:r>
-    </w:p>
-    <w:p>
-      <w:pPr>
-        <w:pStyle w:val="FirstParagraph"/>
-      </w:pPr>
-      <w:r>
-        <w:t xml:space="preserve">해석 규칙은 다음과 같습니다.</w:t>
-      </w:r>
-    </w:p>
-    <w:p>
-      <w:pPr>
-        <w:pStyle w:val="Compact"/>
-        <w:numPr>
-          <w:ilvl w:val="0"/>
-          <w:numId w:val="1002"/>
-        </w:numPr>
-      </w:pPr>
-      <w:r>
-        <w:t xml:space="preserve">현재 값은 수동 정의된 프로토타입 정책 기준값입니다.</w:t>
-      </w:r>
-    </w:p>
-    <w:p>
-      <w:pPr>
-        <w:pStyle w:val="Compact"/>
-        <w:numPr>
-          <w:ilvl w:val="0"/>
-          <w:numId w:val="1002"/>
-        </w:numPr>
-      </w:pPr>
-      <w:r>
-        <w:t xml:space="preserve">최종 표준 벤치마크 결과가 아닙니다.</w:t>
-      </w:r>
-    </w:p>
-    <w:p>
-      <w:pPr>
-        <w:pStyle w:val="Compact"/>
-        <w:numPr>
-          <w:ilvl w:val="0"/>
-          <w:numId w:val="1002"/>
-        </w:numPr>
-      </w:pPr>
-      <w:r>
-        <w:t xml:space="preserve">최종 정량 보고에는 통제된 per-model Ops 평가로 재생성한 값이 필요합니다.</w:t>
-      </w:r>
-    </w:p>
-    <w:p>
-      <w:pPr>
-        <w:pStyle w:val="Compact"/>
-        <w:numPr>
-          <w:ilvl w:val="0"/>
-          <w:numId w:val="1002"/>
-        </w:numPr>
-      </w:pPr>
-      <w:r>
-        <w:t xml:space="preserve">고정 프롬프트, 데이터셋, metric collection, 반복 가능한 scoring rule이 필요합니다.</w:t>
-      </w:r>
-    </w:p>
-    <w:p>
-      <w:pPr>
-        <w:pStyle w:val="Compact"/>
-        <w:numPr>
-          <w:ilvl w:val="0"/>
-          <w:numId w:val="1002"/>
-        </w:numPr>
-      </w:pPr>
-      <w:r>
-        <w:t xml:space="preserve">candidate name은 prototype policy label이며 검증 완료된 provider benchmark claim이 아닙니다.</w:t>
-      </w:r>
-    </w:p>
-    <w:p>
-      <w:pPr>
-        <w:pStyle w:val="FirstParagraph"/>
-      </w:pPr>
-      <w:r>
-        <w:t xml:space="preserve">설정 파일에는</w:t>
-      </w:r>
-      <w:r>
-        <w:t xml:space="preserve"> </w:t>
-      </w:r>
-      <w:r>
-        <w:rPr>
-          <w:rStyle w:val="VerbatimChar"/>
-        </w:rPr>
-        <w:t xml:space="preserve">quality_first</w:t>
-      </w:r>
-      <w:r>
-        <w:t xml:space="preserve">,</w:t>
-      </w:r>
-      <w:r>
-        <w:t xml:space="preserve"> </w:t>
-      </w:r>
-      <w:r>
-        <w:rPr>
-          <w:rStyle w:val="VerbatimChar"/>
-        </w:rPr>
-        <w:t xml:space="preserve">cost_first</w:t>
-      </w:r>
-      <w:r>
-        <w:t xml:space="preserve"> </w:t>
-      </w:r>
-      <w:r>
-        <w:t xml:space="preserve">같은 policy weight, candidate role label, Go ranking function에서 사용하는 normalized score input이 포함됩니다.</w:t>
-      </w:r>
-    </w:p>
-    <w:bookmarkEnd w:id="12"/>
-    <w:bookmarkStart w:id="13" w:name="후보-역할"/>
-    <w:p>
-      <w:pPr>
-        <w:pStyle w:val="Heading2"/>
-      </w:pPr>
-      <w:r>
-        <w:t xml:space="preserve">5. 후보 역할</w:t>
-      </w:r>
-    </w:p>
-    <w:tbl>
-      <w:tblPr>
-        <w:tblStyle w:val="Table"/>
-        <w:tblW w:type="auto" w:w="0"/>
-        <w:tblLook w:firstRow="1" w:lastRow="0" w:firstColumn="0" w:lastColumn="0" w:noHBand="0" w:noVBand="0" w:val="0020"/>
-      </w:tblPr>
-      <w:tblGrid>
-        <w:gridCol w:w="3960"/>
-        <w:gridCol w:w="3960"/>
-      </w:tblGrid>
-      <w:tr>
-        <w:trPr>
-          <w:tblHeader w:val="on"/>
-        </w:trPr>
-        <w:tc>
-          <w:tcPr/>
-          <w:p>
-            <w:pPr>
-              <w:pStyle w:val="Compact"/>
-            </w:pPr>
-            <w:r>
-              <w:t xml:space="preserve">Candidate</w:t>
-            </w:r>
-          </w:p>
-        </w:tc>
-        <w:tc>
-          <w:tcPr/>
-          <w:p>
-            <w:pPr>
-              <w:pStyle w:val="Compact"/>
-            </w:pPr>
-            <w:r>
-              <w:t xml:space="preserve">역할</w:t>
-            </w:r>
-          </w:p>
-        </w:tc>
-      </w:tr>
-      <w:tr>
-        <w:tc>
-          <w:tcPr/>
-          <w:p>
-            <w:pPr>
-              <w:pStyle w:val="Compact"/>
-            </w:pPr>
-            <w:r>
-              <w:rPr>
-                <w:rStyle w:val="VerbatimChar"/>
-              </w:rPr>
-              <w:t xml:space="preserve">primary-ops-llm</w:t>
-            </w:r>
-          </w:p>
-        </w:tc>
-        <w:tc>
-          <w:tcPr/>
-          <w:p>
-            <w:pPr>
-              <w:pStyle w:val="Compact"/>
-            </w:pPr>
-            <w:r>
-              <w:t xml:space="preserve">서비스 제어 판단을 위한 기본 Ops reasoning 후보</w:t>
-            </w:r>
-          </w:p>
-        </w:tc>
-      </w:tr>
-      <w:tr>
-        <w:tc>
-          <w:tcPr/>
-          <w:p>
-            <w:pPr>
-              <w:pStyle w:val="Compact"/>
-            </w:pPr>
-            <w:r>
-              <w:rPr>
-                <w:rStyle w:val="VerbatimChar"/>
-              </w:rPr>
-              <w:t xml:space="preserve">low-cost-ops-llm</w:t>
-            </w:r>
-          </w:p>
-        </w:tc>
-        <w:tc>
-          <w:tcPr/>
-          <w:p>
-            <w:pPr>
-              <w:pStyle w:val="Compact"/>
-            </w:pPr>
-            <w:r>
-              <w:t xml:space="preserve">저비용 smoke-test 및 fallback 후보</w:t>
-            </w:r>
-          </w:p>
-        </w:tc>
-      </w:tr>
-      <w:tr>
-        <w:tc>
-          <w:tcPr/>
-          <w:p>
-            <w:pPr>
-              <w:pStyle w:val="Compact"/>
-            </w:pPr>
-            <w:r>
-              <w:rPr>
-                <w:rStyle w:val="VerbatimChar"/>
-              </w:rPr>
-              <w:t xml:space="preserve">code-cross-check-agent</w:t>
-            </w:r>
-          </w:p>
-        </w:tc>
-        <w:tc>
-          <w:tcPr/>
-          <w:p>
-            <w:pPr>
-              <w:pStyle w:val="Compact"/>
-            </w:pPr>
-            <w:r>
-              <w:t xml:space="preserve">코드와 문서 교차 검증 후보</w:t>
-            </w:r>
-          </w:p>
-        </w:tc>
-      </w:tr>
-    </w:tbl>
-    <w:p>
-      <w:pPr>
-        <w:pStyle w:val="BodyText"/>
-      </w:pPr>
-      <w:r>
-        <w:t xml:space="preserve">이 이름들은 프로토타입 정책 연결을 위한 role label입니다. 특정 상용 또는 오픈소스 LLM의 최종 벤치마크가 완료되었음을 의미하지 않습니다.</w:t>
-      </w:r>
-    </w:p>
-    <w:bookmarkEnd w:id="13"/>
-    <w:bookmarkStart w:id="14" w:name="점수-산정-방법"/>
-    <w:p>
-      <w:pPr>
-        <w:pStyle w:val="Heading2"/>
-      </w:pPr>
-      <w:r>
-        <w:t xml:space="preserve">6. 점수 산정 방법</w:t>
+        <w:t xml:space="preserve">1. 한눈에 보는 구조</w:t>
       </w:r>
     </w:p>
     <w:tbl>
@@ -514,23 +50,58 @@
               <w:pStyle w:val="Compact"/>
             </w:pPr>
             <w:r>
-              <w:t xml:space="preserve">Metric</w:t>
-            </w:r>
-          </w:p>
-        </w:tc>
-        <w:tc>
-          <w:tcPr/>
-          <w:p>
-            <w:pPr>
-              <w:pStyle w:val="Compact"/>
-            </w:pPr>
-            <w:r>
-              <w:t xml:space="preserve">의미</w:t>
+              <w:t xml:space="preserve">항목</w:t>
+            </w:r>
+          </w:p>
+        </w:tc>
+        <w:tc>
+          <w:tcPr/>
+          <w:p>
+            <w:pPr>
+              <w:pStyle w:val="Compact"/>
+            </w:pPr>
+            <w:r>
+              <w:t xml:space="preserve">내용</w:t>
             </w:r>
           </w:p>
         </w:tc>
       </w:tr>
       <w:tr>
+        <w:tc>
+          <w:tcPr/>
+          <w:p>
+            <w:pPr>
+              <w:pStyle w:val="Compact"/>
+            </w:pPr>
+            <w:r>
+              <w:t xml:space="preserve">목적</w:t>
+            </w:r>
+          </w:p>
+        </w:tc>
+        <w:tc>
+          <w:tcPr/>
+          <w:p>
+            <w:pPr>
+              <w:pStyle w:val="Compact"/>
+            </w:pPr>
+            <w:r>
+              <w:t xml:space="preserve">Ops 상황에서 사용할 LLM 후보를 정책 기준으로 선정하고, 서비스 제어 흐름에 연결한다.</w:t>
+            </w:r>
+          </w:p>
+        </w:tc>
+      </w:tr>
+      <w:tr>
+        <w:tc>
+          <w:tcPr/>
+          <w:p>
+            <w:pPr>
+              <w:pStyle w:val="Compact"/>
+            </w:pPr>
+            <w:r>
+              <w:t xml:space="preserve">입력</w:t>
+            </w:r>
+          </w:p>
+        </w:tc>
         <w:tc>
           <w:tcPr/>
           <w:p>
@@ -541,18 +112,10 @@
               <w:rPr>
                 <w:rStyle w:val="VerbatimChar"/>
               </w:rPr>
-              <w:t xml:space="preserve">accuracy</w:t>
-            </w:r>
-          </w:p>
-        </w:tc>
-        <w:tc>
-          <w:tcPr/>
-          <w:p>
-            <w:pPr>
-              <w:pStyle w:val="Compact"/>
-            </w:pPr>
-            <w:r>
-              <w:t xml:space="preserve">운영 판단의 프로토타입 정확도 신호</w:t>
+              <w:t xml:space="preserve">config/ops_llm_benchmark.json</w:t>
+            </w:r>
+            <w:r>
+              <w:t xml:space="preserve">의 candidate, metric, policy weight</w:t>
             </w:r>
           </w:p>
         </w:tc>
@@ -565,21 +128,18 @@
               <w:pStyle w:val="Compact"/>
             </w:pPr>
             <w:r>
-              <w:rPr>
-                <w:rStyle w:val="VerbatimChar"/>
-              </w:rPr>
-              <w:t xml:space="preserve">metric_success</w:t>
-            </w:r>
-          </w:p>
-        </w:tc>
-        <w:tc>
-          <w:tcPr/>
-          <w:p>
-            <w:pPr>
-              <w:pStyle w:val="Compact"/>
-            </w:pPr>
-            <w:r>
-              <w:t xml:space="preserve">사용 가능한 운영 metric 활용 능력</w:t>
+              <w:t xml:space="preserve">처리</w:t>
+            </w:r>
+          </w:p>
+        </w:tc>
+        <w:tc>
+          <w:tcPr/>
+          <w:p>
+            <w:pPr>
+              <w:pStyle w:val="Compact"/>
+            </w:pPr>
+            <w:r>
+              <w:t xml:space="preserve">policy별 weighted score 계산 및 candidate ranking</w:t>
             </w:r>
           </w:p>
         </w:tc>
@@ -592,21 +152,18 @@
               <w:pStyle w:val="Compact"/>
             </w:pPr>
             <w:r>
-              <w:rPr>
-                <w:rStyle w:val="VerbatimChar"/>
-              </w:rPr>
-              <w:t xml:space="preserve">action_validity</w:t>
-            </w:r>
-          </w:p>
-        </w:tc>
-        <w:tc>
-          <w:tcPr/>
-          <w:p>
-            <w:pPr>
-              <w:pStyle w:val="Compact"/>
-            </w:pPr>
-            <w:r>
-              <w:t xml:space="preserve">제안 action이 bounded-control rule 안에 머무는지 여부</w:t>
+              <w:t xml:space="preserve">출력</w:t>
+            </w:r>
+          </w:p>
+        </w:tc>
+        <w:tc>
+          <w:tcPr/>
+          <w:p>
+            <w:pPr>
+              <w:pStyle w:val="Compact"/>
+            </w:pPr>
+            <w:r>
+              <w:t xml:space="preserve">selected model, score, ranking, 선정 사유</w:t>
             </w:r>
           </w:p>
         </w:tc>
@@ -619,160 +176,120 @@
               <w:pStyle w:val="Compact"/>
             </w:pPr>
             <w:r>
-              <w:rPr>
-                <w:rStyle w:val="VerbatimChar"/>
-              </w:rPr>
-              <w:t xml:space="preserve">consistency</w:t>
-            </w:r>
-          </w:p>
-        </w:tc>
-        <w:tc>
-          <w:tcPr/>
-          <w:p>
-            <w:pPr>
-              <w:pStyle w:val="Compact"/>
-            </w:pPr>
-            <w:r>
-              <w:t xml:space="preserve">판단 반복 가능성</w:t>
-            </w:r>
-          </w:p>
-        </w:tc>
-      </w:tr>
-      <w:tr>
-        <w:tc>
-          <w:tcPr/>
-          <w:p>
-            <w:pPr>
-              <w:pStyle w:val="Compact"/>
-            </w:pPr>
-            <w:r>
-              <w:rPr>
-                <w:rStyle w:val="VerbatimChar"/>
-              </w:rPr>
-              <w:t xml:space="preserve">ttd</w:t>
-            </w:r>
-          </w:p>
-        </w:tc>
-        <w:tc>
-          <w:tcPr/>
-          <w:p>
-            <w:pPr>
-              <w:pStyle w:val="Compact"/>
-            </w:pPr>
-            <w:r>
-              <w:t xml:space="preserve">time-to-decision의 역방향 score</w:t>
-            </w:r>
-          </w:p>
-        </w:tc>
-      </w:tr>
-      <w:tr>
-        <w:tc>
-          <w:tcPr/>
-          <w:p>
-            <w:pPr>
-              <w:pStyle w:val="Compact"/>
-            </w:pPr>
-            <w:r>
-              <w:rPr>
-                <w:rStyle w:val="VerbatimChar"/>
-              </w:rPr>
-              <w:t xml:space="preserve">cost</w:t>
-            </w:r>
-          </w:p>
-        </w:tc>
-        <w:tc>
-          <w:tcPr/>
-          <w:p>
-            <w:pPr>
-              <w:pStyle w:val="Compact"/>
-            </w:pPr>
-            <w:r>
-              <w:t xml:space="preserve">추정 운영 비용의 역방향 score</w:t>
-            </w:r>
-          </w:p>
-        </w:tc>
-      </w:tr>
-      <w:tr>
-        <w:tc>
-          <w:tcPr/>
-          <w:p>
-            <w:pPr>
-              <w:pStyle w:val="Compact"/>
-            </w:pPr>
-            <w:r>
-              <w:rPr>
-                <w:rStyle w:val="VerbatimChar"/>
-              </w:rPr>
-              <w:t xml:space="preserve">latency</w:t>
-            </w:r>
-          </w:p>
-        </w:tc>
-        <w:tc>
-          <w:tcPr/>
-          <w:p>
-            <w:pPr>
-              <w:pStyle w:val="Compact"/>
-            </w:pPr>
-            <w:r>
-              <w:t xml:space="preserve">latency의 역방향 score</w:t>
+              <w:t xml:space="preserve">검증</w:t>
+            </w:r>
+          </w:p>
+        </w:tc>
+        <w:tc>
+          <w:tcPr/>
+          <w:p>
+            <w:pPr>
+              <w:pStyle w:val="Compact"/>
+            </w:pPr>
+            <w:r>
+              <w:t xml:space="preserve">Go CLI/API로 LLM 선정 결과를 재현</w:t>
             </w:r>
           </w:p>
         </w:tc>
       </w:tr>
     </w:tbl>
+    <w:bookmarkEnd w:id="9"/>
+    <w:bookmarkStart w:id="10" w:name="운영-흐름"/>
     <w:p>
       <w:pPr>
-        <w:pStyle w:val="BodyText"/>
-      </w:pPr>
-      <w:r>
-        <w:t xml:space="preserve">각 policy는 normalized metric value와 설정된 weight를 조합합니다. 예를 들어</w:t>
-      </w:r>
-      <w:r>
-        <w:t xml:space="preserve"> </w:t>
-      </w:r>
+        <w:pStyle w:val="Heading2"/>
+      </w:pPr>
+      <w:r>
+        <w:t xml:space="preserve">2. 운영 흐름</w:t>
+      </w:r>
+    </w:p>
+    <w:p>
+      <w:pPr>
+        <w:pStyle w:val="SourceCode"/>
+      </w:pPr>
       <w:r>
         <w:rPr>
           <w:rStyle w:val="VerbatimChar"/>
         </w:rPr>
-        <w:t xml:space="preserve">quality_first</w:t>
-      </w:r>
-      <w:r>
-        <w:t xml:space="preserve"> </w:t>
-      </w:r>
-      <w:r>
-        <w:t xml:space="preserve">policy는 운영 정확도, metric 활용, action validity, consistency를 우선하고,</w:t>
-      </w:r>
-      <w:r>
-        <w:t xml:space="preserve"> </w:t>
+        <w:t xml:space="preserve">Ops policy/config</w:t>
+      </w:r>
+      <w:r>
+        <w:br/>
       </w:r>
       <w:r>
         <w:rPr>
           <w:rStyle w:val="VerbatimChar"/>
         </w:rPr>
-        <w:t xml:space="preserve">cost_first</w:t>
-      </w:r>
-      <w:r>
-        <w:t xml:space="preserve"> </w:t>
-      </w:r>
-      <w:r>
-        <w:t xml:space="preserve">policy는 cost와 latency에 더 높은 가중치를 둡니다. 요청된 policy에서 weighted score가 가장 높은 candidate가 선택됩니다.</w:t>
+        <w:t xml:space="preserve">-&gt; LLM candidate ranking</w:t>
+      </w:r>
+      <w:r>
+        <w:br/>
+      </w:r>
+      <w:r>
+        <w:rPr>
+          <w:rStyle w:val="VerbatimChar"/>
+        </w:rPr>
+        <w:t xml:space="preserve">-&gt; selected runtime candidate</w:t>
+      </w:r>
+      <w:r>
+        <w:br/>
+      </w:r>
+      <w:r>
+        <w:rPr>
+          <w:rStyle w:val="VerbatimChar"/>
+        </w:rPr>
+        <w:t xml:space="preserve">-&gt; agent registry validation</w:t>
+      </w:r>
+      <w:r>
+        <w:br/>
+      </w:r>
+      <w:r>
+        <w:rPr>
+          <w:rStyle w:val="VerbatimChar"/>
+        </w:rPr>
+        <w:t xml:space="preserve">-&gt; CPU/GPU placement</w:t>
+      </w:r>
+      <w:r>
+        <w:br/>
+      </w:r>
+      <w:r>
+        <w:rPr>
+          <w:rStyle w:val="VerbatimChar"/>
+        </w:rPr>
+        <w:t xml:space="preserve">-&gt; deployment plan</w:t>
+      </w:r>
+      <w:r>
+        <w:br/>
+      </w:r>
+      <w:r>
+        <w:rPr>
+          <w:rStyle w:val="VerbatimChar"/>
+        </w:rPr>
+        <w:t xml:space="preserve">-&gt; service readiness report</w:t>
       </w:r>
     </w:p>
-    <w:bookmarkEnd w:id="14"/>
-    <w:bookmarkStart w:id="15" w:name="go-구현"/>
     <w:p>
       <w:pPr>
+        <w:pStyle w:val="FirstParagraph"/>
+      </w:pPr>
+      <w:r>
+        <w:t xml:space="preserve">LLM은 판단 후보를 제안하는 역할이고, 최종 검증은 Go service-control layer가 담당합니다.</w:t>
+      </w:r>
+    </w:p>
+    <w:bookmarkEnd w:id="10"/>
+    <w:bookmarkStart w:id="11" w:name="선정-정책"/>
+    <w:p>
+      <w:pPr>
         <w:pStyle w:val="Heading2"/>
       </w:pPr>
       <w:r>
-        <w:t xml:space="preserve">7. Go 구현</w:t>
+        <w:t xml:space="preserve">3. 선정 정책</w:t>
       </w:r>
     </w:p>
     <w:tbl>
       <w:tblPr>
         <w:tblStyle w:val="Table"/>
-        <w:tblW w:type="pct" w:w="5000"/>
-        <w:tblLayout w:type="fixed"/>
+        <w:tblW w:type="auto" w:w="0"/>
         <w:tblLook w:firstRow="1" w:lastRow="0" w:firstColumn="0" w:lastColumn="0" w:noHBand="0" w:noVBand="0" w:val="0020"/>
       </w:tblPr>
       <w:tblGrid>
@@ -790,18 +307,18 @@
               <w:pStyle w:val="Compact"/>
             </w:pPr>
             <w:r>
-              <w:t xml:space="preserve">구성요소</w:t>
-            </w:r>
-          </w:p>
-        </w:tc>
-        <w:tc>
-          <w:tcPr/>
-          <w:p>
-            <w:pPr>
-              <w:pStyle w:val="Compact"/>
-            </w:pPr>
-            <w:r>
-              <w:t xml:space="preserve">경로</w:t>
+              <w:t xml:space="preserve">요소</w:t>
+            </w:r>
+          </w:p>
+        </w:tc>
+        <w:tc>
+          <w:tcPr/>
+          <w:p>
+            <w:pPr>
+              <w:pStyle w:val="Compact"/>
+            </w:pPr>
+            <w:r>
+              <w:t xml:space="preserve">설명</w:t>
             </w:r>
           </w:p>
         </w:tc>
@@ -814,7 +331,55 @@
               <w:pStyle w:val="Compact"/>
             </w:pPr>
             <w:r>
-              <w:t xml:space="preserve">서비스 로직</w:t>
+              <w:t xml:space="preserve">candidate</w:t>
+            </w:r>
+          </w:p>
+        </w:tc>
+        <w:tc>
+          <w:tcPr/>
+          <w:p>
+            <w:pPr>
+              <w:pStyle w:val="Compact"/>
+            </w:pPr>
+            <w:r>
+              <w:t xml:space="preserve">운영 판단에 사용할 LLM 역할 label</w:t>
+            </w:r>
+          </w:p>
+        </w:tc>
+      </w:tr>
+      <w:tr>
+        <w:tc>
+          <w:tcPr/>
+          <w:p>
+            <w:pPr>
+              <w:pStyle w:val="Compact"/>
+            </w:pPr>
+            <w:r>
+              <w:t xml:space="preserve">metric</w:t>
+            </w:r>
+          </w:p>
+        </w:tc>
+        <w:tc>
+          <w:tcPr/>
+          <w:p>
+            <w:pPr>
+              <w:pStyle w:val="Compact"/>
+            </w:pPr>
+            <w:r>
+              <w:t xml:space="preserve">accuracy, consistency, latency, cost 등 비교 기준</w:t>
+            </w:r>
+          </w:p>
+        </w:tc>
+      </w:tr>
+      <w:tr>
+        <w:tc>
+          <w:tcPr/>
+          <w:p>
+            <w:pPr>
+              <w:pStyle w:val="Compact"/>
+            </w:pPr>
+            <w:r>
+              <w:t xml:space="preserve">policy</w:t>
             </w:r>
           </w:p>
         </w:tc>
@@ -828,34 +393,25 @@
               <w:rPr>
                 <w:rStyle w:val="VerbatimChar"/>
               </w:rPr>
-              <w:t xml:space="preserve">go/service-control-api/internal/api/service.go</w:t>
-            </w:r>
-          </w:p>
-        </w:tc>
-      </w:tr>
-      <w:tr>
-        <w:tc>
-          <w:tcPr/>
-          <w:p>
-            <w:pPr>
-              <w:pStyle w:val="Compact"/>
-            </w:pPr>
-            <w:r>
-              <w:t xml:space="preserve">요청/응답 model</w:t>
-            </w:r>
-          </w:p>
-        </w:tc>
-        <w:tc>
-          <w:tcPr/>
-          <w:p>
-            <w:pPr>
-              <w:pStyle w:val="Compact"/>
-            </w:pPr>
+              <w:t xml:space="preserve">quality_first</w:t>
+            </w:r>
+            <w:r>
+              <w:t xml:space="preserve">,</w:t>
+            </w:r>
+            <w:r>
+              <w:t xml:space="preserve"> </w:t>
+            </w:r>
             <w:r>
               <w:rPr>
                 <w:rStyle w:val="VerbatimChar"/>
               </w:rPr>
-              <w:t xml:space="preserve">go/service-control-api/internal/api/models.go</w:t>
+              <w:t xml:space="preserve">cost_first</w:t>
+            </w:r>
+            <w:r>
+              <w:t xml:space="preserve"> </w:t>
+            </w:r>
+            <w:r>
+              <w:t xml:space="preserve">등 가중치 조합</w:t>
             </w:r>
           </w:p>
         </w:tc>
@@ -868,21 +424,18 @@
               <w:pStyle w:val="Compact"/>
             </w:pPr>
             <w:r>
-              <w:t xml:space="preserve">CLI entrypoint</w:t>
-            </w:r>
-          </w:p>
-        </w:tc>
-        <w:tc>
-          <w:tcPr/>
-          <w:p>
-            <w:pPr>
-              <w:pStyle w:val="Compact"/>
-            </w:pPr>
-            <w:r>
-              <w:rPr>
-                <w:rStyle w:val="VerbatimChar"/>
-              </w:rPr>
-              <w:t xml:space="preserve">go/service-control-api/cmd/aiops-service-control/main.go</w:t>
+              <w:t xml:space="preserve">ranking</w:t>
+            </w:r>
+          </w:p>
+        </w:tc>
+        <w:tc>
+          <w:tcPr/>
+          <w:p>
+            <w:pPr>
+              <w:pStyle w:val="Compact"/>
+            </w:pPr>
+            <w:r>
+              <w:t xml:space="preserve">policy에 따른 후보별 score 정렬</w:t>
             </w:r>
           </w:p>
         </w:tc>
@@ -895,189 +448,37 @@
               <w:pStyle w:val="Compact"/>
             </w:pPr>
             <w:r>
-              <w:t xml:space="preserve">정책 설정</w:t>
-            </w:r>
-          </w:p>
-        </w:tc>
-        <w:tc>
-          <w:tcPr/>
-          <w:p>
-            <w:pPr>
-              <w:pStyle w:val="Compact"/>
-            </w:pPr>
-            <w:r>
-              <w:rPr>
-                <w:rStyle w:val="VerbatimChar"/>
-              </w:rPr>
-              <w:t xml:space="preserve">config/ops_llm_benchmark.json</w:t>
+              <w:t xml:space="preserve">selected_model</w:t>
+            </w:r>
+          </w:p>
+        </w:tc>
+        <w:tc>
+          <w:tcPr/>
+          <w:p>
+            <w:pPr>
+              <w:pStyle w:val="Compact"/>
+            </w:pPr>
+            <w:r>
+              <w:t xml:space="preserve">가장 높은 score를 받은 runtime candidate</w:t>
             </w:r>
           </w:p>
         </w:tc>
       </w:tr>
     </w:tbl>
+    <w:bookmarkEnd w:id="11"/>
+    <w:bookmarkStart w:id="12" w:name="candidate-역할"/>
     <w:p>
       <w:pPr>
-        <w:pStyle w:val="BodyText"/>
-      </w:pPr>
-      <w:r>
-        <w:t xml:space="preserve">구현은 JSON policy file을 읽고, 요청 policy를 검증하고, score input을 normalize한 뒤, weighted score를 계산하여 선택된 candidate와 ranking 결과를 반환합니다.</w:t>
-      </w:r>
-    </w:p>
-    <w:bookmarkEnd w:id="15"/>
-    <w:bookmarkStart w:id="16" w:name="cli-검증"/>
-    <w:p>
-      <w:pPr>
         <w:pStyle w:val="Heading2"/>
       </w:pPr>
       <w:r>
-        <w:t xml:space="preserve">8. CLI 검증</w:t>
-      </w:r>
-    </w:p>
-    <w:p>
-      <w:pPr>
-        <w:pStyle w:val="SourceCode"/>
-      </w:pPr>
-      <w:r>
-        <w:rPr>
-          <w:rStyle w:val="VerbatimChar"/>
-        </w:rPr>
-        <w:t xml:space="preserve">cd go/service-control-api</w:t>
-      </w:r>
-      <w:r>
-        <w:br/>
-      </w:r>
-      <w:r>
-        <w:rPr>
-          <w:rStyle w:val="VerbatimChar"/>
-        </w:rPr>
-        <w:t xml:space="preserve">go run ./cmd/aiops-service-control select-ops-llm \</w:t>
-      </w:r>
-      <w:r>
-        <w:br/>
-      </w:r>
-      <w:r>
-        <w:rPr>
-          <w:rStyle w:val="VerbatimChar"/>
-        </w:rPr>
-        <w:t xml:space="preserve">  --config ../../config/ops_llm_benchmark.json \</w:t>
-      </w:r>
-      <w:r>
-        <w:br/>
-      </w:r>
-      <w:r>
-        <w:rPr>
-          <w:rStyle w:val="VerbatimChar"/>
-        </w:rPr>
-        <w:t xml:space="preserve">  --policy quality_first</w:t>
-      </w:r>
-    </w:p>
-    <w:p>
-      <w:pPr>
-        <w:pStyle w:val="FirstParagraph"/>
-      </w:pPr>
-      <w:r>
-        <w:t xml:space="preserve">기대 신호는 다음과 같습니다.</w:t>
-      </w:r>
-    </w:p>
-    <w:p>
-      <w:pPr>
-        <w:pStyle w:val="SourceCode"/>
-      </w:pPr>
-      <w:r>
-        <w:rPr>
-          <w:rStyle w:val="VerbatimChar"/>
-        </w:rPr>
-        <w:t xml:space="preserve">selected_model = primary-ops-llm</w:t>
-      </w:r>
-    </w:p>
-    <w:p>
-      <w:pPr>
-        <w:pStyle w:val="FirstParagraph"/>
-      </w:pPr>
-      <w:r>
-        <w:t xml:space="preserve">이 출력은 policy selection flow가 올바르게 연결되었음을 확인합니다. 최종 표준 LLM 성능 결과를 의미하지는 않습니다.</w:t>
-      </w:r>
-    </w:p>
-    <w:bookmarkEnd w:id="16"/>
-    <w:bookmarkStart w:id="17" w:name="api-검증"/>
-    <w:p>
-      <w:pPr>
-        <w:pStyle w:val="Heading2"/>
-      </w:pPr>
-      <w:r>
-        <w:t xml:space="preserve">9. API 검증</w:t>
-      </w:r>
-    </w:p>
-    <w:p>
-      <w:pPr>
-        <w:pStyle w:val="SourceCode"/>
-      </w:pPr>
-      <w:r>
-        <w:rPr>
-          <w:rStyle w:val="VerbatimChar"/>
-        </w:rPr>
-        <w:t xml:space="preserve">curl -s -X POST http://127.0.0.1:8080/api/v1/ops-llm/select \</w:t>
-      </w:r>
-      <w:r>
-        <w:br/>
-      </w:r>
-      <w:r>
-        <w:rPr>
-          <w:rStyle w:val="VerbatimChar"/>
-        </w:rPr>
-        <w:t xml:space="preserve">  -H 'content-type: application/json' \</w:t>
-      </w:r>
-      <w:r>
-        <w:br/>
-      </w:r>
-      <w:r>
-        <w:rPr>
-          <w:rStyle w:val="VerbatimChar"/>
-        </w:rPr>
-        <w:t xml:space="preserve">  -d '{"policy":"quality_first"}'</w:t>
-      </w:r>
-    </w:p>
-    <w:p>
-      <w:pPr>
-        <w:pStyle w:val="FirstParagraph"/>
-      </w:pPr>
-      <w:r>
-        <w:t xml:space="preserve">API는 선택된 candidate, score, ranked candidate list, rationale, validity flag를 반환합니다.</w:t>
-      </w:r>
-    </w:p>
-    <w:bookmarkEnd w:id="17"/>
-    <w:bookmarkStart w:id="18" w:name="설계-경계"/>
-    <w:p>
-      <w:pPr>
-        <w:pStyle w:val="Heading2"/>
-      </w:pPr>
-      <w:r>
-        <w:t xml:space="preserve">10. 설계 경계</w:t>
-      </w:r>
-    </w:p>
-    <w:p>
-      <w:pPr>
-        <w:pStyle w:val="FirstParagraph"/>
-      </w:pPr>
-      <w:r>
-        <w:t xml:space="preserve">이 설계서는 표준 LLM 평가 완료를 주장하지 않습니다. 향후 표준화된 평가 데이터와 연결 가능한 prototype policy-selection structure를 정의합니다. 현재 구현은 LLM 후보 선정이 AIOps service-control framework에 통합되는 방식을 보여주는 데 유용하지만, 운영 배포를 위해서는 실제 운영 trace, 반복 가능한 시험 scenario, provider별 model evaluation, monitoring, governance가 추가로 필요합니다.</w:t>
-      </w:r>
-    </w:p>
-    <w:bookmarkEnd w:id="18"/>
-    <w:bookmarkStart w:id="19" w:name="관련-산출물"/>
-    <w:p>
-      <w:pPr>
-        <w:pStyle w:val="Heading2"/>
-      </w:pPr>
-      <w:r>
-        <w:t xml:space="preserve">11. 관련 산출물</w:t>
+        <w:t xml:space="preserve">4. Candidate 역할</w:t>
       </w:r>
     </w:p>
     <w:tbl>
       <w:tblPr>
         <w:tblStyle w:val="Table"/>
-        <w:tblW w:type="pct" w:w="5000"/>
-        <w:tblLayout w:type="fixed"/>
+        <w:tblW w:type="auto" w:w="0"/>
         <w:tblLook w:firstRow="1" w:lastRow="0" w:firstColumn="0" w:lastColumn="0" w:noHBand="0" w:noVBand="0" w:val="0020"/>
       </w:tblPr>
       <w:tblGrid>
@@ -1095,34 +496,23 @@
               <w:pStyle w:val="Compact"/>
             </w:pPr>
             <w:r>
-              <w:t xml:space="preserve">산출물</w:t>
-            </w:r>
-          </w:p>
-        </w:tc>
-        <w:tc>
-          <w:tcPr/>
-          <w:p>
-            <w:pPr>
-              <w:pStyle w:val="Compact"/>
-            </w:pPr>
-            <w:r>
-              <w:t xml:space="preserve">경로</w:t>
+              <w:t xml:space="preserve">Candidate</w:t>
+            </w:r>
+          </w:p>
+        </w:tc>
+        <w:tc>
+          <w:tcPr/>
+          <w:p>
+            <w:pPr>
+              <w:pStyle w:val="Compact"/>
+            </w:pPr>
+            <w:r>
+              <w:t xml:space="preserve">역할</w:t>
             </w:r>
           </w:p>
         </w:tc>
       </w:tr>
       <w:tr>
-        <w:tc>
-          <w:tcPr/>
-          <w:p>
-            <w:pPr>
-              <w:pStyle w:val="Compact"/>
-            </w:pPr>
-            <w:r>
-              <w:t xml:space="preserve">LLM 정책 설정</w:t>
-            </w:r>
-          </w:p>
-        </w:tc>
         <w:tc>
           <w:tcPr/>
           <w:p>
@@ -1133,23 +523,23 @@
               <w:rPr>
                 <w:rStyle w:val="VerbatimChar"/>
               </w:rPr>
-              <w:t xml:space="preserve">config/ops_llm_benchmark.json</w:t>
+              <w:t xml:space="preserve">primary-ops-llm</w:t>
+            </w:r>
+          </w:p>
+        </w:tc>
+        <w:tc>
+          <w:tcPr/>
+          <w:p>
+            <w:pPr>
+              <w:pStyle w:val="Compact"/>
+            </w:pPr>
+            <w:r>
+              <w:t xml:space="preserve">운영 판단 품질을 우선하는 기본 후보</w:t>
             </w:r>
           </w:p>
         </w:tc>
       </w:tr>
       <w:tr>
-        <w:tc>
-          <w:tcPr/>
-          <w:p>
-            <w:pPr>
-              <w:pStyle w:val="Compact"/>
-            </w:pPr>
-            <w:r>
-              <w:t xml:space="preserve">Go 서비스 로직</w:t>
-            </w:r>
-          </w:p>
-        </w:tc>
         <w:tc>
           <w:tcPr/>
           <w:p>
@@ -1160,23 +550,23 @@
               <w:rPr>
                 <w:rStyle w:val="VerbatimChar"/>
               </w:rPr>
-              <w:t xml:space="preserve">go/service-control-api/internal/api/service.go</w:t>
+              <w:t xml:space="preserve">low-cost-ops-llm</w:t>
+            </w:r>
+          </w:p>
+        </w:tc>
+        <w:tc>
+          <w:tcPr/>
+          <w:p>
+            <w:pPr>
+              <w:pStyle w:val="Compact"/>
+            </w:pPr>
+            <w:r>
+              <w:t xml:space="preserve">비용을 줄인 smoke-test 및 fallback 후보</w:t>
             </w:r>
           </w:p>
         </w:tc>
       </w:tr>
       <w:tr>
-        <w:tc>
-          <w:tcPr/>
-          <w:p>
-            <w:pPr>
-              <w:pStyle w:val="Compact"/>
-            </w:pPr>
-            <w:r>
-              <w:t xml:space="preserve">API/CLI model</w:t>
-            </w:r>
-          </w:p>
-        </w:tc>
         <w:tc>
           <w:tcPr/>
           <w:p>
@@ -1187,149 +577,150 @@
               <w:rPr>
                 <w:rStyle w:val="VerbatimChar"/>
               </w:rPr>
-              <w:t xml:space="preserve">go/service-control-api/internal/api/models.go</w:t>
-            </w:r>
-          </w:p>
-        </w:tc>
-      </w:tr>
-      <w:tr>
-        <w:tc>
-          <w:tcPr/>
-          <w:p>
-            <w:pPr>
-              <w:pStyle w:val="Compact"/>
-            </w:pPr>
-            <w:r>
-              <w:t xml:space="preserve">CLI entrypoint</w:t>
-            </w:r>
-          </w:p>
-        </w:tc>
-        <w:tc>
-          <w:tcPr/>
-          <w:p>
-            <w:pPr>
-              <w:pStyle w:val="Compact"/>
-            </w:pPr>
-            <w:r>
-              <w:rPr>
-                <w:rStyle w:val="VerbatimChar"/>
-              </w:rPr>
-              <w:t xml:space="preserve">go/service-control-api/cmd/aiops-service-control/main.go</w:t>
-            </w:r>
-          </w:p>
-        </w:tc>
-      </w:tr>
-      <w:tr>
-        <w:tc>
-          <w:tcPr/>
-          <w:p>
-            <w:pPr>
-              <w:pStyle w:val="Compact"/>
-            </w:pPr>
-            <w:r>
-              <w:t xml:space="preserve">보조 선정 가이드</w:t>
-            </w:r>
-          </w:p>
-        </w:tc>
-        <w:tc>
-          <w:tcPr/>
-          <w:p>
-            <w:pPr>
-              <w:pStyle w:val="Compact"/>
-            </w:pPr>
-            <w:r>
-              <w:rPr>
-                <w:rStyle w:val="VerbatimChar"/>
-              </w:rPr>
-              <w:t xml:space="preserve">docs/design/ops_llm_selection_guide.md</w:t>
-            </w:r>
-          </w:p>
-        </w:tc>
-      </w:tr>
-      <w:tr>
-        <w:tc>
-          <w:tcPr/>
-          <w:p>
-            <w:pPr>
-              <w:pStyle w:val="Compact"/>
-            </w:pPr>
-            <w:r>
-              <w:t xml:space="preserve">교차 검증 설계 노트</w:t>
-            </w:r>
-          </w:p>
-        </w:tc>
-        <w:tc>
-          <w:tcPr/>
-          <w:p>
-            <w:pPr>
-              <w:pStyle w:val="Compact"/>
-            </w:pPr>
-            <w:r>
-              <w:rPr>
-                <w:rStyle w:val="VerbatimChar"/>
-              </w:rPr>
-              <w:t xml:space="preserve">docs/design/go_and_llm_cross_validation.md</w:t>
-            </w:r>
-          </w:p>
-        </w:tc>
-      </w:tr>
-      <w:tr>
-        <w:tc>
-          <w:tcPr/>
-          <w:p>
-            <w:pPr>
-              <w:pStyle w:val="Compact"/>
-            </w:pPr>
-            <w:r>
-              <w:t xml:space="preserve">기능/API 가이드</w:t>
-            </w:r>
-          </w:p>
-        </w:tc>
-        <w:tc>
-          <w:tcPr/>
-          <w:p>
-            <w:pPr>
-              <w:pStyle w:val="Compact"/>
-            </w:pPr>
-            <w:r>
-              <w:rPr>
-                <w:rStyle w:val="VerbatimChar"/>
-              </w:rPr>
-              <w:t xml:space="preserve">docs/submission/functional_api_guide.md</w:t>
-            </w:r>
-          </w:p>
-        </w:tc>
-      </w:tr>
-      <w:tr>
-        <w:tc>
-          <w:tcPr/>
-          <w:p>
-            <w:pPr>
-              <w:pStyle w:val="Compact"/>
-            </w:pPr>
-            <w:r>
-              <w:t xml:space="preserve">테스트 가이드</w:t>
-            </w:r>
-          </w:p>
-        </w:tc>
-        <w:tc>
-          <w:tcPr/>
-          <w:p>
-            <w:pPr>
-              <w:pStyle w:val="Compact"/>
-            </w:pPr>
-            <w:r>
-              <w:rPr>
-                <w:rStyle w:val="VerbatimChar"/>
-              </w:rPr>
-              <w:t xml:space="preserve">docs/submission/test_guide.md</w:t>
+              <w:t xml:space="preserve">code-cross-check-agent</w:t>
+            </w:r>
+          </w:p>
+        </w:tc>
+        <w:tc>
+          <w:tcPr/>
+          <w:p>
+            <w:pPr>
+              <w:pStyle w:val="Compact"/>
+            </w:pPr>
+            <w:r>
+              <w:t xml:space="preserve">코드와 문서 교차 검토 후보</w:t>
             </w:r>
           </w:p>
         </w:tc>
       </w:tr>
     </w:tbl>
-    <w:bookmarkEnd w:id="19"/>
-    <w:bookmarkEnd w:id="20"/>
+    <w:bookmarkEnd w:id="12"/>
+    <w:bookmarkStart w:id="13" w:name="검증-방법"/>
+    <w:p>
+      <w:pPr>
+        <w:pStyle w:val="Heading2"/>
+      </w:pPr>
+      <w:r>
+        <w:t xml:space="preserve">5. 검증 방법</w:t>
+      </w:r>
+    </w:p>
+    <w:p>
+      <w:pPr>
+        <w:pStyle w:val="SourceCode"/>
+      </w:pPr>
+      <w:r>
+        <w:rPr>
+          <w:rStyle w:val="VerbatimChar"/>
+        </w:rPr>
+        <w:t xml:space="preserve">cd go/service-control-api</w:t>
+      </w:r>
+      <w:r>
+        <w:br/>
+      </w:r>
+      <w:r>
+        <w:rPr>
+          <w:rStyle w:val="VerbatimChar"/>
+        </w:rPr>
+        <w:t xml:space="preserve">go run ./cmd/aiops-service-control select-ops-llm \</w:t>
+      </w:r>
+      <w:r>
+        <w:br/>
+      </w:r>
+      <w:r>
+        <w:rPr>
+          <w:rStyle w:val="VerbatimChar"/>
+        </w:rPr>
+        <w:t xml:space="preserve">  --config ../../config/ops_llm_benchmark.json \</w:t>
+      </w:r>
+      <w:r>
+        <w:br/>
+      </w:r>
+      <w:r>
+        <w:rPr>
+          <w:rStyle w:val="VerbatimChar"/>
+        </w:rPr>
+        <w:t xml:space="preserve">  --policy quality_first</w:t>
+      </w:r>
+    </w:p>
+    <w:p>
+      <w:pPr>
+        <w:pStyle w:val="FirstParagraph"/>
+      </w:pPr>
+      <w:r>
+        <w:t xml:space="preserve">기대 신호:</w:t>
+      </w:r>
+    </w:p>
+    <w:p>
+      <w:pPr>
+        <w:pStyle w:val="SourceCode"/>
+      </w:pPr>
+      <w:r>
+        <w:rPr>
+          <w:rStyle w:val="VerbatimChar"/>
+        </w:rPr>
+        <w:t xml:space="preserve">selected_model = primary-ops-llm</w:t>
+      </w:r>
+    </w:p>
+    <w:bookmarkEnd w:id="13"/>
+    <w:bookmarkStart w:id="14" w:name="설계-경계"/>
+    <w:p>
+      <w:pPr>
+        <w:pStyle w:val="Heading2"/>
+      </w:pPr>
+      <w:r>
+        <w:t xml:space="preserve">6. 설계 경계</w:t>
+      </w:r>
+    </w:p>
+    <w:p>
+      <w:pPr>
+        <w:pStyle w:val="Compact"/>
+        <w:numPr>
+          <w:ilvl w:val="0"/>
+          <w:numId w:val="1001"/>
+        </w:numPr>
+      </w:pPr>
+      <w:r>
+        <w:t xml:space="preserve">현재 score는 prototype policy baseline이다.</w:t>
+      </w:r>
+    </w:p>
+    <w:p>
+      <w:pPr>
+        <w:pStyle w:val="Compact"/>
+        <w:numPr>
+          <w:ilvl w:val="0"/>
+          <w:numId w:val="1001"/>
+        </w:numPr>
+      </w:pPr>
+      <w:r>
+        <w:t xml:space="preserve">최종 LLM benchmark 결과가 아니다.</w:t>
+      </w:r>
+    </w:p>
+    <w:p>
+      <w:pPr>
+        <w:pStyle w:val="Compact"/>
+        <w:numPr>
+          <w:ilvl w:val="0"/>
+          <w:numId w:val="1001"/>
+        </w:numPr>
+      </w:pPr>
+      <w:r>
+        <w:t xml:space="preserve">정량 평가에는 고정 prompt, dataset, metric, scoring rule이 별도로 필요하다.</w:t>
+      </w:r>
+    </w:p>
+    <w:p>
+      <w:pPr>
+        <w:pStyle w:val="Compact"/>
+        <w:numPr>
+          <w:ilvl w:val="0"/>
+          <w:numId w:val="1001"/>
+        </w:numPr>
+      </w:pPr>
+      <w:r>
+        <w:t xml:space="preserve">LLM 판단은 Go 기반 action validation을 통과해야 서비스 제어 결과로 사용할 수 있다.</w:t>
+      </w:r>
+    </w:p>
+    <w:bookmarkEnd w:id="14"/>
+    <w:bookmarkEnd w:id="15"/>
     <w:sectPr>
       <w:footnotePr>
         <w:numRestart w:val="eachSect"/>
@@ -1547,9 +938,6 @@
     <w:abstractNumId w:val="990"/>
   </w:num>
   <w:num w:numId="1001">
-    <w:abstractNumId w:val="991"/>
-  </w:num>
-  <w:num w:numId="1002">
     <w:abstractNumId w:val="991"/>
   </w:num>
 </w:numbering>

</xml_diff>

<commit_message>
Balance deliverable detail and readability
</commit_message>
<xml_diff>
--- a/docs/deliverables/docx/01_LLM_Operation_Management_Design.docx
+++ b/docs/deliverables/docx/01_LLM_Operation_Management_Design.docx
@@ -2,7 +2,7 @@
 <file path=word/document.xml><?xml version="1.0" encoding="utf-8"?>
 <w:document xmlns:w="http://schemas.openxmlformats.org/wordprocessingml/2006/main" xmlns:m="http://schemas.openxmlformats.org/officeDocument/2006/math" xmlns:r="http://schemas.openxmlformats.org/officeDocument/2006/relationships" xmlns:o="urn:schemas-microsoft-com:office:office" xmlns:v="urn:schemas-microsoft-com:vml" xmlns:w10="urn:schemas-microsoft-com:office:word" xmlns:a="http://schemas.openxmlformats.org/drawingml/2006/main" xmlns:pic="http://schemas.openxmlformats.org/drawingml/2006/picture" xmlns:wp="http://schemas.openxmlformats.org/drawingml/2006/wordprocessingDrawing">
   <w:body>
-    <w:bookmarkStart w:id="15" w:name="llm-운영-관리-구조-설계서"/>
+    <w:bookmarkStart w:id="17" w:name="llm-운영-관리-구조-설계서"/>
     <w:p>
       <w:pPr>
         <w:pStyle w:val="Heading1"/>
@@ -19,13 +19,282 @@
         <w:t xml:space="preserve">영문 제목: LLM Operation Management Structure Design</w:t>
       </w:r>
     </w:p>
-    <w:bookmarkStart w:id="9" w:name="한눈에-보는-구조"/>
+    <w:bookmarkStart w:id="9" w:name="설계-목적"/>
     <w:p>
       <w:pPr>
         <w:pStyle w:val="Heading2"/>
       </w:pPr>
       <w:r>
-        <w:t xml:space="preserve">1. 한눈에 보는 구조</w:t>
+        <w:t xml:space="preserve">1. 설계 목적</w:t>
+      </w:r>
+    </w:p>
+    <w:p>
+      <w:pPr>
+        <w:pStyle w:val="FirstParagraph"/>
+      </w:pPr>
+      <w:r>
+        <w:t xml:space="preserve">본 설계서는 Ops 분석 시험을 통해 서비스 제어에 적합한 LLM 후보를 선정하고, 선정 결과를 AI 운영 관리 흐름에 연결하는 구조를 정의합니다. 핵심은 LLM 판단을 그대로 실행하지 않고, Go 기반 검증 로직과 결합하여 운영 준비도 판단에 사용하는 것입니다.</w:t>
+      </w:r>
+    </w:p>
+    <w:bookmarkEnd w:id="9"/>
+    <w:bookmarkStart w:id="10" w:name="한눈에-보는-구조"/>
+    <w:p>
+      <w:pPr>
+        <w:pStyle w:val="Heading2"/>
+      </w:pPr>
+      <w:r>
+        <w:t xml:space="preserve">2. 한눈에 보는 구조</w:t>
+      </w:r>
+    </w:p>
+    <w:tbl>
+      <w:tblPr>
+        <w:tblStyle w:val="Table"/>
+        <w:tblW w:type="auto" w:w="0"/>
+        <w:tblLook w:firstRow="1" w:lastRow="0" w:firstColumn="0" w:lastColumn="0" w:noHBand="0" w:noVBand="0" w:val="0020"/>
+      </w:tblPr>
+      <w:tblGrid>
+        <w:gridCol w:w="3960"/>
+        <w:gridCol w:w="3960"/>
+      </w:tblGrid>
+      <w:tr>
+        <w:trPr>
+          <w:tblHeader w:val="on"/>
+        </w:trPr>
+        <w:tc>
+          <w:tcPr/>
+          <w:p>
+            <w:pPr>
+              <w:pStyle w:val="Compact"/>
+            </w:pPr>
+            <w:r>
+              <w:t xml:space="preserve">항목</w:t>
+            </w:r>
+          </w:p>
+        </w:tc>
+        <w:tc>
+          <w:tcPr/>
+          <w:p>
+            <w:pPr>
+              <w:pStyle w:val="Compact"/>
+            </w:pPr>
+            <w:r>
+              <w:t xml:space="preserve">내용</w:t>
+            </w:r>
+          </w:p>
+        </w:tc>
+      </w:tr>
+      <w:tr>
+        <w:tc>
+          <w:tcPr/>
+          <w:p>
+            <w:pPr>
+              <w:pStyle w:val="Compact"/>
+            </w:pPr>
+            <w:r>
+              <w:t xml:space="preserve">입력</w:t>
+            </w:r>
+          </w:p>
+        </w:tc>
+        <w:tc>
+          <w:tcPr/>
+          <w:p>
+            <w:pPr>
+              <w:pStyle w:val="Compact"/>
+            </w:pPr>
+            <w:r>
+              <w:t xml:space="preserve">LLM candidate, metric, policy weight</w:t>
+            </w:r>
+          </w:p>
+        </w:tc>
+      </w:tr>
+      <w:tr>
+        <w:tc>
+          <w:tcPr/>
+          <w:p>
+            <w:pPr>
+              <w:pStyle w:val="Compact"/>
+            </w:pPr>
+            <w:r>
+              <w:t xml:space="preserve">처리</w:t>
+            </w:r>
+          </w:p>
+        </w:tc>
+        <w:tc>
+          <w:tcPr/>
+          <w:p>
+            <w:pPr>
+              <w:pStyle w:val="Compact"/>
+            </w:pPr>
+            <w:r>
+              <w:t xml:space="preserve">policy별 weighted score 계산과 ranking</w:t>
+            </w:r>
+          </w:p>
+        </w:tc>
+      </w:tr>
+      <w:tr>
+        <w:tc>
+          <w:tcPr/>
+          <w:p>
+            <w:pPr>
+              <w:pStyle w:val="Compact"/>
+            </w:pPr>
+            <w:r>
+              <w:t xml:space="preserve">출력</w:t>
+            </w:r>
+          </w:p>
+        </w:tc>
+        <w:tc>
+          <w:tcPr/>
+          <w:p>
+            <w:pPr>
+              <w:pStyle w:val="Compact"/>
+            </w:pPr>
+            <w:r>
+              <w:t xml:space="preserve">selected model, score, ranking, rationale</w:t>
+            </w:r>
+          </w:p>
+        </w:tc>
+      </w:tr>
+      <w:tr>
+        <w:tc>
+          <w:tcPr/>
+          <w:p>
+            <w:pPr>
+              <w:pStyle w:val="Compact"/>
+            </w:pPr>
+            <w:r>
+              <w:t xml:space="preserve">연계</w:t>
+            </w:r>
+          </w:p>
+        </w:tc>
+        <w:tc>
+          <w:tcPr/>
+          <w:p>
+            <w:pPr>
+              <w:pStyle w:val="Compact"/>
+            </w:pPr>
+            <w:r>
+              <w:t xml:space="preserve">agent registry, CPU/GPU placement, deployment plan</w:t>
+            </w:r>
+          </w:p>
+        </w:tc>
+      </w:tr>
+      <w:tr>
+        <w:tc>
+          <w:tcPr/>
+          <w:p>
+            <w:pPr>
+              <w:pStyle w:val="Compact"/>
+            </w:pPr>
+            <w:r>
+              <w:t xml:space="preserve">검증</w:t>
+            </w:r>
+          </w:p>
+        </w:tc>
+        <w:tc>
+          <w:tcPr/>
+          <w:p>
+            <w:pPr>
+              <w:pStyle w:val="Compact"/>
+            </w:pPr>
+            <w:r>
+              <w:t xml:space="preserve">Go CLI/API 기반 재현 검증</w:t>
+            </w:r>
+          </w:p>
+        </w:tc>
+      </w:tr>
+    </w:tbl>
+    <w:bookmarkEnd w:id="10"/>
+    <w:bookmarkStart w:id="11" w:name="운영-흐름"/>
+    <w:p>
+      <w:pPr>
+        <w:pStyle w:val="Heading2"/>
+      </w:pPr>
+      <w:r>
+        <w:t xml:space="preserve">3. 운영 흐름</w:t>
+      </w:r>
+    </w:p>
+    <w:p>
+      <w:pPr>
+        <w:pStyle w:val="SourceCode"/>
+      </w:pPr>
+      <w:r>
+        <w:rPr>
+          <w:rStyle w:val="VerbatimChar"/>
+        </w:rPr>
+        <w:t xml:space="preserve">Ops policy/config</w:t>
+      </w:r>
+      <w:r>
+        <w:br/>
+      </w:r>
+      <w:r>
+        <w:rPr>
+          <w:rStyle w:val="VerbatimChar"/>
+        </w:rPr>
+        <w:t xml:space="preserve">-&gt; LLM candidate ranking</w:t>
+      </w:r>
+      <w:r>
+        <w:br/>
+      </w:r>
+      <w:r>
+        <w:rPr>
+          <w:rStyle w:val="VerbatimChar"/>
+        </w:rPr>
+        <w:t xml:space="preserve">-&gt; selected runtime candidate</w:t>
+      </w:r>
+      <w:r>
+        <w:br/>
+      </w:r>
+      <w:r>
+        <w:rPr>
+          <w:rStyle w:val="VerbatimChar"/>
+        </w:rPr>
+        <w:t xml:space="preserve">-&gt; agent registry validation</w:t>
+      </w:r>
+      <w:r>
+        <w:br/>
+      </w:r>
+      <w:r>
+        <w:rPr>
+          <w:rStyle w:val="VerbatimChar"/>
+        </w:rPr>
+        <w:t xml:space="preserve">-&gt; CPU/GPU VM placement</w:t>
+      </w:r>
+      <w:r>
+        <w:br/>
+      </w:r>
+      <w:r>
+        <w:rPr>
+          <w:rStyle w:val="VerbatimChar"/>
+        </w:rPr>
+        <w:t xml:space="preserve">-&gt; deployment plan</w:t>
+      </w:r>
+      <w:r>
+        <w:br/>
+      </w:r>
+      <w:r>
+        <w:rPr>
+          <w:rStyle w:val="VerbatimChar"/>
+        </w:rPr>
+        <w:t xml:space="preserve">-&gt; service readiness report</w:t>
+      </w:r>
+    </w:p>
+    <w:p>
+      <w:pPr>
+        <w:pStyle w:val="FirstParagraph"/>
+      </w:pPr>
+      <w:r>
+        <w:t xml:space="preserve">LLM은 운영 판단 후보를 제공하고, Go service-control layer는 선정 결과와 후속 action이 허용 범위 안에 있는지 검증합니다.</w:t>
+      </w:r>
+    </w:p>
+    <w:bookmarkEnd w:id="11"/>
+    <w:bookmarkStart w:id="12" w:name="정책-설정"/>
+    <w:p>
+      <w:pPr>
+        <w:pStyle w:val="Heading2"/>
+      </w:pPr>
+      <w:r>
+        <w:t xml:space="preserve">4. 정책 설정</w:t>
       </w:r>
     </w:p>
     <w:tbl>
@@ -61,44 +330,20 @@
               <w:pStyle w:val="Compact"/>
             </w:pPr>
             <w:r>
-              <w:t xml:space="preserve">내용</w:t>
-            </w:r>
-          </w:p>
-        </w:tc>
-      </w:tr>
-      <w:tr>
-        <w:tc>
-          <w:tcPr/>
-          <w:p>
-            <w:pPr>
-              <w:pStyle w:val="Compact"/>
-            </w:pPr>
-            <w:r>
-              <w:t xml:space="preserve">목적</w:t>
-            </w:r>
-          </w:p>
-        </w:tc>
-        <w:tc>
-          <w:tcPr/>
-          <w:p>
-            <w:pPr>
-              <w:pStyle w:val="Compact"/>
-            </w:pPr>
-            <w:r>
-              <w:t xml:space="preserve">Ops 상황에서 사용할 LLM 후보를 정책 기준으로 선정하고, 서비스 제어 흐름에 연결한다.</w:t>
-            </w:r>
-          </w:p>
-        </w:tc>
-      </w:tr>
-      <w:tr>
-        <w:tc>
-          <w:tcPr/>
-          <w:p>
-            <w:pPr>
-              <w:pStyle w:val="Compact"/>
-            </w:pPr>
-            <w:r>
-              <w:t xml:space="preserve">입력</w:t>
+              <w:t xml:space="preserve">설명</w:t>
+            </w:r>
+          </w:p>
+        </w:tc>
+      </w:tr>
+      <w:tr>
+        <w:tc>
+          <w:tcPr/>
+          <w:p>
+            <w:pPr>
+              <w:pStyle w:val="Compact"/>
+            </w:pPr>
+            <w:r>
+              <w:t xml:space="preserve">설정 파일</w:t>
             </w:r>
           </w:p>
         </w:tc>
@@ -114,176 +359,331 @@
               </w:rPr>
               <w:t xml:space="preserve">config/ops_llm_benchmark.json</w:t>
             </w:r>
-            <w:r>
-              <w:t xml:space="preserve">의 candidate, metric, policy weight</w:t>
-            </w:r>
-          </w:p>
-        </w:tc>
-      </w:tr>
-      <w:tr>
-        <w:tc>
-          <w:tcPr/>
-          <w:p>
-            <w:pPr>
-              <w:pStyle w:val="Compact"/>
-            </w:pPr>
-            <w:r>
-              <w:t xml:space="preserve">처리</w:t>
-            </w:r>
-          </w:p>
-        </w:tc>
-        <w:tc>
-          <w:tcPr/>
-          <w:p>
-            <w:pPr>
-              <w:pStyle w:val="Compact"/>
-            </w:pPr>
-            <w:r>
-              <w:t xml:space="preserve">policy별 weighted score 계산 및 candidate ranking</w:t>
-            </w:r>
-          </w:p>
-        </w:tc>
-      </w:tr>
-      <w:tr>
-        <w:tc>
-          <w:tcPr/>
-          <w:p>
-            <w:pPr>
-              <w:pStyle w:val="Compact"/>
-            </w:pPr>
-            <w:r>
-              <w:t xml:space="preserve">출력</w:t>
-            </w:r>
-          </w:p>
-        </w:tc>
-        <w:tc>
-          <w:tcPr/>
-          <w:p>
-            <w:pPr>
-              <w:pStyle w:val="Compact"/>
-            </w:pPr>
-            <w:r>
-              <w:t xml:space="preserve">selected model, score, ranking, 선정 사유</w:t>
-            </w:r>
-          </w:p>
-        </w:tc>
-      </w:tr>
-      <w:tr>
-        <w:tc>
-          <w:tcPr/>
-          <w:p>
-            <w:pPr>
-              <w:pStyle w:val="Compact"/>
-            </w:pPr>
-            <w:r>
-              <w:t xml:space="preserve">검증</w:t>
-            </w:r>
-          </w:p>
-        </w:tc>
-        <w:tc>
-          <w:tcPr/>
-          <w:p>
-            <w:pPr>
-              <w:pStyle w:val="Compact"/>
-            </w:pPr>
-            <w:r>
-              <w:t xml:space="preserve">Go CLI/API로 LLM 선정 결과를 재현</w:t>
+          </w:p>
+        </w:tc>
+      </w:tr>
+      <w:tr>
+        <w:tc>
+          <w:tcPr/>
+          <w:p>
+            <w:pPr>
+              <w:pStyle w:val="Compact"/>
+            </w:pPr>
+            <w:r>
+              <w:t xml:space="preserve">policy 예시</w:t>
+            </w:r>
+          </w:p>
+        </w:tc>
+        <w:tc>
+          <w:tcPr/>
+          <w:p>
+            <w:pPr>
+              <w:pStyle w:val="Compact"/>
+            </w:pPr>
+            <w:r>
+              <w:rPr>
+                <w:rStyle w:val="VerbatimChar"/>
+              </w:rPr>
+              <w:t xml:space="preserve">quality_first</w:t>
+            </w:r>
+            <w:r>
+              <w:t xml:space="preserve">,</w:t>
+            </w:r>
+            <w:r>
+              <w:t xml:space="preserve"> </w:t>
+            </w:r>
+            <w:r>
+              <w:rPr>
+                <w:rStyle w:val="VerbatimChar"/>
+              </w:rPr>
+              <w:t xml:space="preserve">cost_first</w:t>
+            </w:r>
+          </w:p>
+        </w:tc>
+      </w:tr>
+      <w:tr>
+        <w:tc>
+          <w:tcPr/>
+          <w:p>
+            <w:pPr>
+              <w:pStyle w:val="Compact"/>
+            </w:pPr>
+            <w:r>
+              <w:t xml:space="preserve">candidate 예시</w:t>
+            </w:r>
+          </w:p>
+        </w:tc>
+        <w:tc>
+          <w:tcPr/>
+          <w:p>
+            <w:pPr>
+              <w:pStyle w:val="Compact"/>
+            </w:pPr>
+            <w:r>
+              <w:rPr>
+                <w:rStyle w:val="VerbatimChar"/>
+              </w:rPr>
+              <w:t xml:space="preserve">primary-ops-llm</w:t>
+            </w:r>
+            <w:r>
+              <w:t xml:space="preserve">,</w:t>
+            </w:r>
+            <w:r>
+              <w:t xml:space="preserve"> </w:t>
+            </w:r>
+            <w:r>
+              <w:rPr>
+                <w:rStyle w:val="VerbatimChar"/>
+              </w:rPr>
+              <w:t xml:space="preserve">low-cost-ops-llm</w:t>
+            </w:r>
+            <w:r>
+              <w:t xml:space="preserve">,</w:t>
+            </w:r>
+            <w:r>
+              <w:t xml:space="preserve"> </w:t>
+            </w:r>
+            <w:r>
+              <w:rPr>
+                <w:rStyle w:val="VerbatimChar"/>
+              </w:rPr>
+              <w:t xml:space="preserve">code-cross-check-agent</w:t>
+            </w:r>
+          </w:p>
+        </w:tc>
+      </w:tr>
+      <w:tr>
+        <w:tc>
+          <w:tcPr/>
+          <w:p>
+            <w:pPr>
+              <w:pStyle w:val="Compact"/>
+            </w:pPr>
+            <w:r>
+              <w:t xml:space="preserve">score 성격</w:t>
+            </w:r>
+          </w:p>
+        </w:tc>
+        <w:tc>
+          <w:tcPr/>
+          <w:p>
+            <w:pPr>
+              <w:pStyle w:val="Compact"/>
+            </w:pPr>
+            <w:r>
+              <w:t xml:space="preserve">prototype policy baseline</w:t>
+            </w:r>
+          </w:p>
+        </w:tc>
+      </w:tr>
+      <w:tr>
+        <w:tc>
+          <w:tcPr/>
+          <w:p>
+            <w:pPr>
+              <w:pStyle w:val="Compact"/>
+            </w:pPr>
+            <w:r>
+              <w:t xml:space="preserve">주의점</w:t>
+            </w:r>
+          </w:p>
+        </w:tc>
+        <w:tc>
+          <w:tcPr/>
+          <w:p>
+            <w:pPr>
+              <w:pStyle w:val="Compact"/>
+            </w:pPr>
+            <w:r>
+              <w:t xml:space="preserve">최종 표준 benchmark 결과가 아님</w:t>
             </w:r>
           </w:p>
         </w:tc>
       </w:tr>
     </w:tbl>
-    <w:bookmarkEnd w:id="9"/>
-    <w:bookmarkStart w:id="10" w:name="운영-흐름"/>
+    <w:bookmarkEnd w:id="12"/>
+    <w:bookmarkStart w:id="13" w:name="candidate-역할"/>
     <w:p>
       <w:pPr>
         <w:pStyle w:val="Heading2"/>
       </w:pPr>
       <w:r>
-        <w:t xml:space="preserve">2. 운영 흐름</w:t>
+        <w:t xml:space="preserve">5. Candidate 역할</w:t>
       </w:r>
     </w:p>
+    <w:tbl>
+      <w:tblPr>
+        <w:tblStyle w:val="Table"/>
+        <w:tblW w:type="pct" w:w="5000"/>
+        <w:tblLayout w:type="fixed"/>
+        <w:tblLook w:firstRow="1" w:lastRow="0" w:firstColumn="0" w:lastColumn="0" w:noHBand="0" w:noVBand="0" w:val="0020"/>
+      </w:tblPr>
+      <w:tblGrid>
+        <w:gridCol w:w="2640"/>
+        <w:gridCol w:w="2640"/>
+        <w:gridCol w:w="2640"/>
+      </w:tblGrid>
+      <w:tr>
+        <w:trPr>
+          <w:tblHeader w:val="on"/>
+        </w:trPr>
+        <w:tc>
+          <w:tcPr/>
+          <w:p>
+            <w:pPr>
+              <w:pStyle w:val="Compact"/>
+            </w:pPr>
+            <w:r>
+              <w:t xml:space="preserve">Candidate</w:t>
+            </w:r>
+          </w:p>
+        </w:tc>
+        <w:tc>
+          <w:tcPr/>
+          <w:p>
+            <w:pPr>
+              <w:pStyle w:val="Compact"/>
+            </w:pPr>
+            <w:r>
+              <w:t xml:space="preserve">역할</w:t>
+            </w:r>
+          </w:p>
+        </w:tc>
+        <w:tc>
+          <w:tcPr/>
+          <w:p>
+            <w:pPr>
+              <w:pStyle w:val="Compact"/>
+            </w:pPr>
+            <w:r>
+              <w:t xml:space="preserve">사용 의도</w:t>
+            </w:r>
+          </w:p>
+        </w:tc>
+      </w:tr>
+      <w:tr>
+        <w:tc>
+          <w:tcPr/>
+          <w:p>
+            <w:pPr>
+              <w:pStyle w:val="Compact"/>
+            </w:pPr>
+            <w:r>
+              <w:rPr>
+                <w:rStyle w:val="VerbatimChar"/>
+              </w:rPr>
+              <w:t xml:space="preserve">primary-ops-llm</w:t>
+            </w:r>
+          </w:p>
+        </w:tc>
+        <w:tc>
+          <w:tcPr/>
+          <w:p>
+            <w:pPr>
+              <w:pStyle w:val="Compact"/>
+            </w:pPr>
+            <w:r>
+              <w:t xml:space="preserve">기본 운영 판단 후보</w:t>
+            </w:r>
+          </w:p>
+        </w:tc>
+        <w:tc>
+          <w:tcPr/>
+          <w:p>
+            <w:pPr>
+              <w:pStyle w:val="Compact"/>
+            </w:pPr>
+            <w:r>
+              <w:t xml:space="preserve">품질 중심 정책에서 우선 선택</w:t>
+            </w:r>
+          </w:p>
+        </w:tc>
+      </w:tr>
+      <w:tr>
+        <w:tc>
+          <w:tcPr/>
+          <w:p>
+            <w:pPr>
+              <w:pStyle w:val="Compact"/>
+            </w:pPr>
+            <w:r>
+              <w:rPr>
+                <w:rStyle w:val="VerbatimChar"/>
+              </w:rPr>
+              <w:t xml:space="preserve">low-cost-ops-llm</w:t>
+            </w:r>
+          </w:p>
+        </w:tc>
+        <w:tc>
+          <w:tcPr/>
+          <w:p>
+            <w:pPr>
+              <w:pStyle w:val="Compact"/>
+            </w:pPr>
+            <w:r>
+              <w:t xml:space="preserve">저비용 후보</w:t>
+            </w:r>
+          </w:p>
+        </w:tc>
+        <w:tc>
+          <w:tcPr/>
+          <w:p>
+            <w:pPr>
+              <w:pStyle w:val="Compact"/>
+            </w:pPr>
+            <w:r>
+              <w:t xml:space="preserve">smoke-test 또는 비용 중심 검증</w:t>
+            </w:r>
+          </w:p>
+        </w:tc>
+      </w:tr>
+      <w:tr>
+        <w:tc>
+          <w:tcPr/>
+          <w:p>
+            <w:pPr>
+              <w:pStyle w:val="Compact"/>
+            </w:pPr>
+            <w:r>
+              <w:rPr>
+                <w:rStyle w:val="VerbatimChar"/>
+              </w:rPr>
+              <w:t xml:space="preserve">code-cross-check-agent</w:t>
+            </w:r>
+          </w:p>
+        </w:tc>
+        <w:tc>
+          <w:tcPr/>
+          <w:p>
+            <w:pPr>
+              <w:pStyle w:val="Compact"/>
+            </w:pPr>
+            <w:r>
+              <w:t xml:space="preserve">교차 검토 후보</w:t>
+            </w:r>
+          </w:p>
+        </w:tc>
+        <w:tc>
+          <w:tcPr/>
+          <w:p>
+            <w:pPr>
+              <w:pStyle w:val="Compact"/>
+            </w:pPr>
+            <w:r>
+              <w:t xml:space="preserve">코드/문서 consistency 확인</w:t>
+            </w:r>
+          </w:p>
+        </w:tc>
+      </w:tr>
+    </w:tbl>
+    <w:bookmarkEnd w:id="13"/>
+    <w:bookmarkStart w:id="14" w:name="score-구성"/>
     <w:p>
       <w:pPr>
-        <w:pStyle w:val="SourceCode"/>
-      </w:pPr>
-      <w:r>
-        <w:rPr>
-          <w:rStyle w:val="VerbatimChar"/>
-        </w:rPr>
-        <w:t xml:space="preserve">Ops policy/config</w:t>
-      </w:r>
-      <w:r>
-        <w:br/>
-      </w:r>
-      <w:r>
-        <w:rPr>
-          <w:rStyle w:val="VerbatimChar"/>
-        </w:rPr>
-        <w:t xml:space="preserve">-&gt; LLM candidate ranking</w:t>
-      </w:r>
-      <w:r>
-        <w:br/>
-      </w:r>
-      <w:r>
-        <w:rPr>
-          <w:rStyle w:val="VerbatimChar"/>
-        </w:rPr>
-        <w:t xml:space="preserve">-&gt; selected runtime candidate</w:t>
-      </w:r>
-      <w:r>
-        <w:br/>
-      </w:r>
-      <w:r>
-        <w:rPr>
-          <w:rStyle w:val="VerbatimChar"/>
-        </w:rPr>
-        <w:t xml:space="preserve">-&gt; agent registry validation</w:t>
-      </w:r>
-      <w:r>
-        <w:br/>
-      </w:r>
-      <w:r>
-        <w:rPr>
-          <w:rStyle w:val="VerbatimChar"/>
-        </w:rPr>
-        <w:t xml:space="preserve">-&gt; CPU/GPU placement</w:t>
-      </w:r>
-      <w:r>
-        <w:br/>
-      </w:r>
-      <w:r>
-        <w:rPr>
-          <w:rStyle w:val="VerbatimChar"/>
-        </w:rPr>
-        <w:t xml:space="preserve">-&gt; deployment plan</w:t>
-      </w:r>
-      <w:r>
-        <w:br/>
-      </w:r>
-      <w:r>
-        <w:rPr>
-          <w:rStyle w:val="VerbatimChar"/>
-        </w:rPr>
-        <w:t xml:space="preserve">-&gt; service readiness report</w:t>
-      </w:r>
-    </w:p>
-    <w:p>
-      <w:pPr>
-        <w:pStyle w:val="FirstParagraph"/>
-      </w:pPr>
-      <w:r>
-        <w:t xml:space="preserve">LLM은 판단 후보를 제안하는 역할이고, 최종 검증은 Go service-control layer가 담당합니다.</w:t>
-      </w:r>
-    </w:p>
-    <w:bookmarkEnd w:id="10"/>
-    <w:bookmarkStart w:id="11" w:name="선정-정책"/>
-    <w:p>
-      <w:pPr>
         <w:pStyle w:val="Heading2"/>
       </w:pPr>
       <w:r>
-        <w:t xml:space="preserve">3. 선정 정책</w:t>
+        <w:t xml:space="preserve">6. Score 구성</w:t>
       </w:r>
     </w:p>
     <w:tbl>
@@ -307,82 +707,23 @@
               <w:pStyle w:val="Compact"/>
             </w:pPr>
             <w:r>
-              <w:t xml:space="preserve">요소</w:t>
-            </w:r>
-          </w:p>
-        </w:tc>
-        <w:tc>
-          <w:tcPr/>
-          <w:p>
-            <w:pPr>
-              <w:pStyle w:val="Compact"/>
-            </w:pPr>
-            <w:r>
-              <w:t xml:space="preserve">설명</w:t>
-            </w:r>
-          </w:p>
-        </w:tc>
-      </w:tr>
-      <w:tr>
-        <w:tc>
-          <w:tcPr/>
-          <w:p>
-            <w:pPr>
-              <w:pStyle w:val="Compact"/>
-            </w:pPr>
-            <w:r>
-              <w:t xml:space="preserve">candidate</w:t>
-            </w:r>
-          </w:p>
-        </w:tc>
-        <w:tc>
-          <w:tcPr/>
-          <w:p>
-            <w:pPr>
-              <w:pStyle w:val="Compact"/>
-            </w:pPr>
-            <w:r>
-              <w:t xml:space="preserve">운영 판단에 사용할 LLM 역할 label</w:t>
-            </w:r>
-          </w:p>
-        </w:tc>
-      </w:tr>
-      <w:tr>
-        <w:tc>
-          <w:tcPr/>
-          <w:p>
-            <w:pPr>
-              <w:pStyle w:val="Compact"/>
-            </w:pPr>
-            <w:r>
-              <w:t xml:space="preserve">metric</w:t>
-            </w:r>
-          </w:p>
-        </w:tc>
-        <w:tc>
-          <w:tcPr/>
-          <w:p>
-            <w:pPr>
-              <w:pStyle w:val="Compact"/>
-            </w:pPr>
-            <w:r>
-              <w:t xml:space="preserve">accuracy, consistency, latency, cost 등 비교 기준</w:t>
-            </w:r>
-          </w:p>
-        </w:tc>
-      </w:tr>
-      <w:tr>
-        <w:tc>
-          <w:tcPr/>
-          <w:p>
-            <w:pPr>
-              <w:pStyle w:val="Compact"/>
-            </w:pPr>
-            <w:r>
-              <w:t xml:space="preserve">policy</w:t>
-            </w:r>
-          </w:p>
-        </w:tc>
+              <w:t xml:space="preserve">Metric</w:t>
+            </w:r>
+          </w:p>
+        </w:tc>
+        <w:tc>
+          <w:tcPr/>
+          <w:p>
+            <w:pPr>
+              <w:pStyle w:val="Compact"/>
+            </w:pPr>
+            <w:r>
+              <w:t xml:space="preserve">의미</w:t>
+            </w:r>
+          </w:p>
+        </w:tc>
+      </w:tr>
+      <w:tr>
         <w:tc>
           <w:tcPr/>
           <w:p>
@@ -393,92 +734,312 @@
               <w:rPr>
                 <w:rStyle w:val="VerbatimChar"/>
               </w:rPr>
-              <w:t xml:space="preserve">quality_first</w:t>
-            </w:r>
-            <w:r>
-              <w:t xml:space="preserve">,</w:t>
-            </w:r>
-            <w:r>
-              <w:t xml:space="preserve"> </w:t>
-            </w:r>
+              <w:t xml:space="preserve">accuracy</w:t>
+            </w:r>
+          </w:p>
+        </w:tc>
+        <w:tc>
+          <w:tcPr/>
+          <w:p>
+            <w:pPr>
+              <w:pStyle w:val="Compact"/>
+            </w:pPr>
+            <w:r>
+              <w:t xml:space="preserve">운영 판단 정확도 기준</w:t>
+            </w:r>
+          </w:p>
+        </w:tc>
+      </w:tr>
+      <w:tr>
+        <w:tc>
+          <w:tcPr/>
+          <w:p>
+            <w:pPr>
+              <w:pStyle w:val="Compact"/>
+            </w:pPr>
             <w:r>
               <w:rPr>
                 <w:rStyle w:val="VerbatimChar"/>
               </w:rPr>
-              <w:t xml:space="preserve">cost_first</w:t>
-            </w:r>
-            <w:r>
-              <w:t xml:space="preserve"> </w:t>
-            </w:r>
-            <w:r>
-              <w:t xml:space="preserve">등 가중치 조합</w:t>
-            </w:r>
-          </w:p>
-        </w:tc>
-      </w:tr>
-      <w:tr>
-        <w:tc>
-          <w:tcPr/>
-          <w:p>
-            <w:pPr>
-              <w:pStyle w:val="Compact"/>
-            </w:pPr>
-            <w:r>
-              <w:t xml:space="preserve">ranking</w:t>
-            </w:r>
-          </w:p>
-        </w:tc>
-        <w:tc>
-          <w:tcPr/>
-          <w:p>
-            <w:pPr>
-              <w:pStyle w:val="Compact"/>
-            </w:pPr>
-            <w:r>
-              <w:t xml:space="preserve">policy에 따른 후보별 score 정렬</w:t>
-            </w:r>
-          </w:p>
-        </w:tc>
-      </w:tr>
-      <w:tr>
-        <w:tc>
-          <w:tcPr/>
-          <w:p>
-            <w:pPr>
-              <w:pStyle w:val="Compact"/>
-            </w:pPr>
-            <w:r>
-              <w:t xml:space="preserve">selected_model</w:t>
-            </w:r>
-          </w:p>
-        </w:tc>
-        <w:tc>
-          <w:tcPr/>
-          <w:p>
-            <w:pPr>
-              <w:pStyle w:val="Compact"/>
-            </w:pPr>
-            <w:r>
-              <w:t xml:space="preserve">가장 높은 score를 받은 runtime candidate</w:t>
+              <w:t xml:space="preserve">metric_success</w:t>
+            </w:r>
+          </w:p>
+        </w:tc>
+        <w:tc>
+          <w:tcPr/>
+          <w:p>
+            <w:pPr>
+              <w:pStyle w:val="Compact"/>
+            </w:pPr>
+            <w:r>
+              <w:t xml:space="preserve">운영 metric 활용 가능성</w:t>
+            </w:r>
+          </w:p>
+        </w:tc>
+      </w:tr>
+      <w:tr>
+        <w:tc>
+          <w:tcPr/>
+          <w:p>
+            <w:pPr>
+              <w:pStyle w:val="Compact"/>
+            </w:pPr>
+            <w:r>
+              <w:rPr>
+                <w:rStyle w:val="VerbatimChar"/>
+              </w:rPr>
+              <w:t xml:space="preserve">action_validity</w:t>
+            </w:r>
+          </w:p>
+        </w:tc>
+        <w:tc>
+          <w:tcPr/>
+          <w:p>
+            <w:pPr>
+              <w:pStyle w:val="Compact"/>
+            </w:pPr>
+            <w:r>
+              <w:t xml:space="preserve">제안 action이 허용 범위에 들어오는 정도</w:t>
+            </w:r>
+          </w:p>
+        </w:tc>
+      </w:tr>
+      <w:tr>
+        <w:tc>
+          <w:tcPr/>
+          <w:p>
+            <w:pPr>
+              <w:pStyle w:val="Compact"/>
+            </w:pPr>
+            <w:r>
+              <w:rPr>
+                <w:rStyle w:val="VerbatimChar"/>
+              </w:rPr>
+              <w:t xml:space="preserve">consistency</w:t>
+            </w:r>
+          </w:p>
+        </w:tc>
+        <w:tc>
+          <w:tcPr/>
+          <w:p>
+            <w:pPr>
+              <w:pStyle w:val="Compact"/>
+            </w:pPr>
+            <w:r>
+              <w:t xml:space="preserve">반복 판단 안정성</w:t>
+            </w:r>
+          </w:p>
+        </w:tc>
+      </w:tr>
+      <w:tr>
+        <w:tc>
+          <w:tcPr/>
+          <w:p>
+            <w:pPr>
+              <w:pStyle w:val="Compact"/>
+            </w:pPr>
+            <w:r>
+              <w:rPr>
+                <w:rStyle w:val="VerbatimChar"/>
+              </w:rPr>
+              <w:t xml:space="preserve">ttd</w:t>
+            </w:r>
+          </w:p>
+        </w:tc>
+        <w:tc>
+          <w:tcPr/>
+          <w:p>
+            <w:pPr>
+              <w:pStyle w:val="Compact"/>
+            </w:pPr>
+            <w:r>
+              <w:t xml:space="preserve">time-to-decision 기준</w:t>
+            </w:r>
+          </w:p>
+        </w:tc>
+      </w:tr>
+      <w:tr>
+        <w:tc>
+          <w:tcPr/>
+          <w:p>
+            <w:pPr>
+              <w:pStyle w:val="Compact"/>
+            </w:pPr>
+            <w:r>
+              <w:rPr>
+                <w:rStyle w:val="VerbatimChar"/>
+              </w:rPr>
+              <w:t xml:space="preserve">cost</w:t>
+            </w:r>
+          </w:p>
+        </w:tc>
+        <w:tc>
+          <w:tcPr/>
+          <w:p>
+            <w:pPr>
+              <w:pStyle w:val="Compact"/>
+            </w:pPr>
+            <w:r>
+              <w:t xml:space="preserve">비용 기준</w:t>
+            </w:r>
+          </w:p>
+        </w:tc>
+      </w:tr>
+      <w:tr>
+        <w:tc>
+          <w:tcPr/>
+          <w:p>
+            <w:pPr>
+              <w:pStyle w:val="Compact"/>
+            </w:pPr>
+            <w:r>
+              <w:rPr>
+                <w:rStyle w:val="VerbatimChar"/>
+              </w:rPr>
+              <w:t xml:space="preserve">latency</w:t>
+            </w:r>
+          </w:p>
+        </w:tc>
+        <w:tc>
+          <w:tcPr/>
+          <w:p>
+            <w:pPr>
+              <w:pStyle w:val="Compact"/>
+            </w:pPr>
+            <w:r>
+              <w:t xml:space="preserve">응답 지연 기준</w:t>
             </w:r>
           </w:p>
         </w:tc>
       </w:tr>
     </w:tbl>
-    <w:bookmarkEnd w:id="11"/>
-    <w:bookmarkStart w:id="12" w:name="candidate-역할"/>
     <w:p>
       <w:pPr>
+        <w:pStyle w:val="BodyText"/>
+      </w:pPr>
+      <w:r>
+        <w:t xml:space="preserve">정책별 weight를 적용해 candidate score를 계산하고, 가장 높은 score를 받은 후보를 runtime model로 선택합니다.</w:t>
+      </w:r>
+    </w:p>
+    <w:bookmarkEnd w:id="14"/>
+    <w:bookmarkStart w:id="15" w:name="apicli-검증"/>
+    <w:p>
+      <w:pPr>
         <w:pStyle w:val="Heading2"/>
       </w:pPr>
       <w:r>
-        <w:t xml:space="preserve">4. Candidate 역할</w:t>
+        <w:t xml:space="preserve">7. API/CLI 검증</w:t>
+      </w:r>
+    </w:p>
+    <w:p>
+      <w:pPr>
+        <w:pStyle w:val="SourceCode"/>
+      </w:pPr>
+      <w:r>
+        <w:rPr>
+          <w:rStyle w:val="VerbatimChar"/>
+        </w:rPr>
+        <w:t xml:space="preserve">cd go/service-control-api</w:t>
+      </w:r>
+      <w:r>
+        <w:br/>
+      </w:r>
+      <w:r>
+        <w:rPr>
+          <w:rStyle w:val="VerbatimChar"/>
+        </w:rPr>
+        <w:t xml:space="preserve">go run ./cmd/aiops-service-control select-ops-llm \</w:t>
+      </w:r>
+      <w:r>
+        <w:br/>
+      </w:r>
+      <w:r>
+        <w:rPr>
+          <w:rStyle w:val="VerbatimChar"/>
+        </w:rPr>
+        <w:t xml:space="preserve">  --config ../../config/ops_llm_benchmark.json \</w:t>
+      </w:r>
+      <w:r>
+        <w:br/>
+      </w:r>
+      <w:r>
+        <w:rPr>
+          <w:rStyle w:val="VerbatimChar"/>
+        </w:rPr>
+        <w:t xml:space="preserve">  --policy quality_first</w:t>
+      </w:r>
+    </w:p>
+    <w:p>
+      <w:pPr>
+        <w:pStyle w:val="FirstParagraph"/>
+      </w:pPr>
+      <w:r>
+        <w:t xml:space="preserve">기대 신호:</w:t>
+      </w:r>
+    </w:p>
+    <w:p>
+      <w:pPr>
+        <w:pStyle w:val="SourceCode"/>
+      </w:pPr>
+      <w:r>
+        <w:rPr>
+          <w:rStyle w:val="VerbatimChar"/>
+        </w:rPr>
+        <w:t xml:space="preserve">selected_model = primary-ops-llm</w:t>
+      </w:r>
+    </w:p>
+    <w:p>
+      <w:pPr>
+        <w:pStyle w:val="FirstParagraph"/>
+      </w:pPr>
+      <w:r>
+        <w:t xml:space="preserve">API 검증:</w:t>
+      </w:r>
+    </w:p>
+    <w:p>
+      <w:pPr>
+        <w:pStyle w:val="SourceCode"/>
+      </w:pPr>
+      <w:r>
+        <w:rPr>
+          <w:rStyle w:val="VerbatimChar"/>
+        </w:rPr>
+        <w:t xml:space="preserve">curl -s -X POST http://127.0.0.1:8080/api/v1/ops-llm/select \</w:t>
+      </w:r>
+      <w:r>
+        <w:br/>
+      </w:r>
+      <w:r>
+        <w:rPr>
+          <w:rStyle w:val="VerbatimChar"/>
+        </w:rPr>
+        <w:t xml:space="preserve">  -H 'content-type: application/json' \</w:t>
+      </w:r>
+      <w:r>
+        <w:br/>
+      </w:r>
+      <w:r>
+        <w:rPr>
+          <w:rStyle w:val="VerbatimChar"/>
+        </w:rPr>
+        <w:t xml:space="preserve">  -d '{"policy":"quality_first"}'</w:t>
+      </w:r>
+    </w:p>
+    <w:bookmarkEnd w:id="15"/>
+    <w:bookmarkStart w:id="16" w:name="설계-경계"/>
+    <w:p>
+      <w:pPr>
+        <w:pStyle w:val="Heading2"/>
+      </w:pPr>
+      <w:r>
+        <w:t xml:space="preserve">8. 설계 경계</w:t>
       </w:r>
     </w:p>
     <w:tbl>
       <w:tblPr>
         <w:tblStyle w:val="Table"/>
-        <w:tblW w:type="auto" w:w="0"/>
+        <w:tblW w:type="pct" w:w="5000"/>
+        <w:tblLayout w:type="fixed"/>
         <w:tblLook w:firstRow="1" w:lastRow="0" w:firstColumn="0" w:lastColumn="0" w:noHBand="0" w:noVBand="0" w:val="0020"/>
       </w:tblPr>
       <w:tblGrid>
@@ -496,231 +1057,121 @@
               <w:pStyle w:val="Compact"/>
             </w:pPr>
             <w:r>
-              <w:t xml:space="preserve">Candidate</w:t>
-            </w:r>
-          </w:p>
-        </w:tc>
-        <w:tc>
-          <w:tcPr/>
-          <w:p>
-            <w:pPr>
-              <w:pStyle w:val="Compact"/>
-            </w:pPr>
-            <w:r>
-              <w:t xml:space="preserve">역할</w:t>
-            </w:r>
-          </w:p>
-        </w:tc>
-      </w:tr>
-      <w:tr>
-        <w:tc>
-          <w:tcPr/>
-          <w:p>
-            <w:pPr>
-              <w:pStyle w:val="Compact"/>
-            </w:pPr>
-            <w:r>
-              <w:rPr>
-                <w:rStyle w:val="VerbatimChar"/>
-              </w:rPr>
-              <w:t xml:space="preserve">primary-ops-llm</w:t>
-            </w:r>
-          </w:p>
-        </w:tc>
-        <w:tc>
-          <w:tcPr/>
-          <w:p>
-            <w:pPr>
-              <w:pStyle w:val="Compact"/>
-            </w:pPr>
-            <w:r>
-              <w:t xml:space="preserve">운영 판단 품질을 우선하는 기본 후보</w:t>
-            </w:r>
-          </w:p>
-        </w:tc>
-      </w:tr>
-      <w:tr>
-        <w:tc>
-          <w:tcPr/>
-          <w:p>
-            <w:pPr>
-              <w:pStyle w:val="Compact"/>
-            </w:pPr>
-            <w:r>
-              <w:rPr>
-                <w:rStyle w:val="VerbatimChar"/>
-              </w:rPr>
-              <w:t xml:space="preserve">low-cost-ops-llm</w:t>
-            </w:r>
-          </w:p>
-        </w:tc>
-        <w:tc>
-          <w:tcPr/>
-          <w:p>
-            <w:pPr>
-              <w:pStyle w:val="Compact"/>
-            </w:pPr>
-            <w:r>
-              <w:t xml:space="preserve">비용을 줄인 smoke-test 및 fallback 후보</w:t>
-            </w:r>
-          </w:p>
-        </w:tc>
-      </w:tr>
-      <w:tr>
-        <w:tc>
-          <w:tcPr/>
-          <w:p>
-            <w:pPr>
-              <w:pStyle w:val="Compact"/>
-            </w:pPr>
-            <w:r>
-              <w:rPr>
-                <w:rStyle w:val="VerbatimChar"/>
-              </w:rPr>
-              <w:t xml:space="preserve">code-cross-check-agent</w:t>
-            </w:r>
-          </w:p>
-        </w:tc>
-        <w:tc>
-          <w:tcPr/>
-          <w:p>
-            <w:pPr>
-              <w:pStyle w:val="Compact"/>
-            </w:pPr>
-            <w:r>
-              <w:t xml:space="preserve">코드와 문서 교차 검토 후보</w:t>
+              <w:t xml:space="preserve">경계</w:t>
+            </w:r>
+          </w:p>
+        </w:tc>
+        <w:tc>
+          <w:tcPr/>
+          <w:p>
+            <w:pPr>
+              <w:pStyle w:val="Compact"/>
+            </w:pPr>
+            <w:r>
+              <w:t xml:space="preserve">설명</w:t>
+            </w:r>
+          </w:p>
+        </w:tc>
+      </w:tr>
+      <w:tr>
+        <w:tc>
+          <w:tcPr/>
+          <w:p>
+            <w:pPr>
+              <w:pStyle w:val="Compact"/>
+            </w:pPr>
+            <w:r>
+              <w:t xml:space="preserve">Benchmark 경계</w:t>
+            </w:r>
+          </w:p>
+        </w:tc>
+        <w:tc>
+          <w:tcPr/>
+          <w:p>
+            <w:pPr>
+              <w:pStyle w:val="Compact"/>
+            </w:pPr>
+            <w:r>
+              <w:t xml:space="preserve">현재 score는 prototype baseline이며 최종 LLM benchmark가 아니다.</w:t>
+            </w:r>
+          </w:p>
+        </w:tc>
+      </w:tr>
+      <w:tr>
+        <w:tc>
+          <w:tcPr/>
+          <w:p>
+            <w:pPr>
+              <w:pStyle w:val="Compact"/>
+            </w:pPr>
+            <w:r>
+              <w:t xml:space="preserve">실행 경계</w:t>
+            </w:r>
+          </w:p>
+        </w:tc>
+        <w:tc>
+          <w:tcPr/>
+          <w:p>
+            <w:pPr>
+              <w:pStyle w:val="Compact"/>
+            </w:pPr>
+            <w:r>
+              <w:t xml:space="preserve">LLM이 직접 infrastructure action을 실행하지 않는다.</w:t>
+            </w:r>
+          </w:p>
+        </w:tc>
+      </w:tr>
+      <w:tr>
+        <w:tc>
+          <w:tcPr/>
+          <w:p>
+            <w:pPr>
+              <w:pStyle w:val="Compact"/>
+            </w:pPr>
+            <w:r>
+              <w:t xml:space="preserve">검증 경계</w:t>
+            </w:r>
+          </w:p>
+        </w:tc>
+        <w:tc>
+          <w:tcPr/>
+          <w:p>
+            <w:pPr>
+              <w:pStyle w:val="Compact"/>
+            </w:pPr>
+            <w:r>
+              <w:t xml:space="preserve">Go layer가 action validity와 readiness를 검증한다.</w:t>
+            </w:r>
+          </w:p>
+        </w:tc>
+      </w:tr>
+      <w:tr>
+        <w:tc>
+          <w:tcPr/>
+          <w:p>
+            <w:pPr>
+              <w:pStyle w:val="Compact"/>
+            </w:pPr>
+            <w:r>
+              <w:t xml:space="preserve">확장 경계</w:t>
+            </w:r>
+          </w:p>
+        </w:tc>
+        <w:tc>
+          <w:tcPr/>
+          <w:p>
+            <w:pPr>
+              <w:pStyle w:val="Compact"/>
+            </w:pPr>
+            <w:r>
+              <w:t xml:space="preserve">향후 실제 Ops dataset과 반복 평가 metric을 연결할 수 있다.</w:t>
             </w:r>
           </w:p>
         </w:tc>
       </w:tr>
     </w:tbl>
-    <w:bookmarkEnd w:id="12"/>
-    <w:bookmarkStart w:id="13" w:name="검증-방법"/>
-    <w:p>
-      <w:pPr>
-        <w:pStyle w:val="Heading2"/>
-      </w:pPr>
-      <w:r>
-        <w:t xml:space="preserve">5. 검증 방법</w:t>
-      </w:r>
-    </w:p>
-    <w:p>
-      <w:pPr>
-        <w:pStyle w:val="SourceCode"/>
-      </w:pPr>
-      <w:r>
-        <w:rPr>
-          <w:rStyle w:val="VerbatimChar"/>
-        </w:rPr>
-        <w:t xml:space="preserve">cd go/service-control-api</w:t>
-      </w:r>
-      <w:r>
-        <w:br/>
-      </w:r>
-      <w:r>
-        <w:rPr>
-          <w:rStyle w:val="VerbatimChar"/>
-        </w:rPr>
-        <w:t xml:space="preserve">go run ./cmd/aiops-service-control select-ops-llm \</w:t>
-      </w:r>
-      <w:r>
-        <w:br/>
-      </w:r>
-      <w:r>
-        <w:rPr>
-          <w:rStyle w:val="VerbatimChar"/>
-        </w:rPr>
-        <w:t xml:space="preserve">  --config ../../config/ops_llm_benchmark.json \</w:t>
-      </w:r>
-      <w:r>
-        <w:br/>
-      </w:r>
-      <w:r>
-        <w:rPr>
-          <w:rStyle w:val="VerbatimChar"/>
-        </w:rPr>
-        <w:t xml:space="preserve">  --policy quality_first</w:t>
-      </w:r>
-    </w:p>
-    <w:p>
-      <w:pPr>
-        <w:pStyle w:val="FirstParagraph"/>
-      </w:pPr>
-      <w:r>
-        <w:t xml:space="preserve">기대 신호:</w:t>
-      </w:r>
-    </w:p>
-    <w:p>
-      <w:pPr>
-        <w:pStyle w:val="SourceCode"/>
-      </w:pPr>
-      <w:r>
-        <w:rPr>
-          <w:rStyle w:val="VerbatimChar"/>
-        </w:rPr>
-        <w:t xml:space="preserve">selected_model = primary-ops-llm</w:t>
-      </w:r>
-    </w:p>
-    <w:bookmarkEnd w:id="13"/>
-    <w:bookmarkStart w:id="14" w:name="설계-경계"/>
-    <w:p>
-      <w:pPr>
-        <w:pStyle w:val="Heading2"/>
-      </w:pPr>
-      <w:r>
-        <w:t xml:space="preserve">6. 설계 경계</w:t>
-      </w:r>
-    </w:p>
-    <w:p>
-      <w:pPr>
-        <w:pStyle w:val="Compact"/>
-        <w:numPr>
-          <w:ilvl w:val="0"/>
-          <w:numId w:val="1001"/>
-        </w:numPr>
-      </w:pPr>
-      <w:r>
-        <w:t xml:space="preserve">현재 score는 prototype policy baseline이다.</w:t>
-      </w:r>
-    </w:p>
-    <w:p>
-      <w:pPr>
-        <w:pStyle w:val="Compact"/>
-        <w:numPr>
-          <w:ilvl w:val="0"/>
-          <w:numId w:val="1001"/>
-        </w:numPr>
-      </w:pPr>
-      <w:r>
-        <w:t xml:space="preserve">최종 LLM benchmark 결과가 아니다.</w:t>
-      </w:r>
-    </w:p>
-    <w:p>
-      <w:pPr>
-        <w:pStyle w:val="Compact"/>
-        <w:numPr>
-          <w:ilvl w:val="0"/>
-          <w:numId w:val="1001"/>
-        </w:numPr>
-      </w:pPr>
-      <w:r>
-        <w:t xml:space="preserve">정량 평가에는 고정 prompt, dataset, metric, scoring rule이 별도로 필요하다.</w:t>
-      </w:r>
-    </w:p>
-    <w:p>
-      <w:pPr>
-        <w:pStyle w:val="Compact"/>
-        <w:numPr>
-          <w:ilvl w:val="0"/>
-          <w:numId w:val="1001"/>
-        </w:numPr>
-      </w:pPr>
-      <w:r>
-        <w:t xml:space="preserve">LLM 판단은 Go 기반 action validation을 통과해야 서비스 제어 결과로 사용할 수 있다.</w:t>
-      </w:r>
-    </w:p>
-    <w:bookmarkEnd w:id="14"/>
-    <w:bookmarkEnd w:id="15"/>
+    <w:bookmarkEnd w:id="16"/>
+    <w:bookmarkEnd w:id="17"/>
     <w:sectPr>
       <w:footnotePr>
         <w:numRestart w:val="eachSect"/>
@@ -831,114 +1282,8 @@
       </w:pPr>
     </w:lvl>
   </w:abstractNum>
-  <w:abstractNum w:abstractNumId="991">
-    <w:nsid w:val="0000A991"/>
-    <w:multiLevelType w:val="multilevel"/>
-    <w:lvl w:ilvl="0">
-      <w:numFmt w:val="bullet"/>
-      <w:lvlText w:val=""/>
-      <w:lvlJc w:val="left"/>
-      <w:pPr>
-        <w:ind w:left="720" w:hanging="360"/>
-      </w:pPr>
-      <w:rPr>
-        <w:rFonts w:ascii="Symbol" w:hAnsi="Symbol" w:cs="Symbol" w:hint="default"/>
-      </w:rPr>
-    </w:lvl>
-    <w:lvl w:ilvl="1">
-      <w:numFmt w:val="bullet"/>
-      <w:lvlText w:val="o"/>
-      <w:lvlJc w:val="left"/>
-      <w:pPr>
-        <w:ind w:left="1440" w:hanging="360"/>
-      </w:pPr>
-      <w:rPr>
-        <w:rFonts w:ascii="Courier New" w:hAnsi="Courier New" w:cs="Courier New" w:hint="default"/>
-      </w:rPr>
-    </w:lvl>
-    <w:lvl w:ilvl="2">
-      <w:numFmt w:val="bullet"/>
-      <w:lvlText w:val=""/>
-      <w:lvlJc w:val="left"/>
-      <w:pPr>
-        <w:ind w:left="2160" w:hanging="360"/>
-      </w:pPr>
-      <w:rPr>
-        <w:rFonts w:ascii="Wingdings" w:hAnsi="Wingdings" w:cs="Wingdings" w:hint="default"/>
-      </w:rPr>
-    </w:lvl>
-    <w:lvl w:ilvl="3">
-      <w:numFmt w:val="bullet"/>
-      <w:lvlText w:val=""/>
-      <w:lvlJc w:val="left"/>
-      <w:pPr>
-        <w:ind w:left="2880" w:hanging="360"/>
-      </w:pPr>
-      <w:rPr>
-        <w:rFonts w:ascii="Symbol" w:hAnsi="Symbol" w:cs="Symbol" w:hint="default"/>
-      </w:rPr>
-    </w:lvl>
-    <w:lvl w:ilvl="4">
-      <w:numFmt w:val="bullet"/>
-      <w:lvlText w:val="o"/>
-      <w:lvlJc w:val="left"/>
-      <w:pPr>
-        <w:ind w:left="3600" w:hanging="360"/>
-      </w:pPr>
-      <w:rPr>
-        <w:rFonts w:ascii="Courier New" w:hAnsi="Courier New" w:cs="Courier New" w:hint="default"/>
-      </w:rPr>
-    </w:lvl>
-    <w:lvl w:ilvl="5">
-      <w:numFmt w:val="bullet"/>
-      <w:lvlText w:val=""/>
-      <w:lvlJc w:val="left"/>
-      <w:pPr>
-        <w:ind w:left="4320" w:hanging="360"/>
-      </w:pPr>
-      <w:rPr>
-        <w:rFonts w:ascii="Wingdings" w:hAnsi="Wingdings" w:cs="Wingdings" w:hint="default"/>
-      </w:rPr>
-    </w:lvl>
-    <w:lvl w:ilvl="6">
-      <w:numFmt w:val="bullet"/>
-      <w:lvlText w:val=""/>
-      <w:lvlJc w:val="left"/>
-      <w:pPr>
-        <w:ind w:left="5040" w:hanging="360"/>
-      </w:pPr>
-      <w:rPr>
-        <w:rFonts w:ascii="Symbol" w:hAnsi="Symbol" w:cs="Symbol" w:hint="default"/>
-      </w:rPr>
-    </w:lvl>
-    <w:lvl w:ilvl="7">
-      <w:numFmt w:val="bullet"/>
-      <w:lvlText w:val="o"/>
-      <w:lvlJc w:val="left"/>
-      <w:pPr>
-        <w:ind w:left="5760" w:hanging="360"/>
-      </w:pPr>
-      <w:rPr>
-        <w:rFonts w:ascii="Courier New" w:hAnsi="Courier New" w:cs="Courier New" w:hint="default"/>
-      </w:rPr>
-    </w:lvl>
-    <w:lvl w:ilvl="8">
-      <w:numFmt w:val="bullet"/>
-      <w:lvlText w:val=""/>
-      <w:lvlJc w:val="left"/>
-      <w:pPr>
-        <w:ind w:left="6480" w:hanging="360"/>
-      </w:pPr>
-      <w:rPr>
-        <w:rFonts w:ascii="Wingdings" w:hAnsi="Wingdings" w:cs="Wingdings" w:hint="default"/>
-      </w:rPr>
-    </w:lvl>
-  </w:abstractNum>
   <w:num w:numId="1000">
     <w:abstractNumId w:val="990"/>
-  </w:num>
-  <w:num w:numId="1001">
-    <w:abstractNumId w:val="991"/>
   </w:num>
 </w:numbering>
 </file>

</xml_diff>

<commit_message>
Clarify deployment plan wording
</commit_message>
<xml_diff>
--- a/docs/deliverables/docx/01_LLM_Operation_Management_Design.docx
+++ b/docs/deliverables/docx/01_LLM_Operation_Management_Design.docx
@@ -174,7 +174,7 @@
               <w:pStyle w:val="Compact"/>
             </w:pPr>
             <w:r>
-              <w:t xml:space="preserve">agent registry, CPU/GPU placement, deployment plan</w:t>
+              <w:t xml:space="preserve">agent registry, CPU/GPU placement, AI 응용 배포·제어 계획</w:t>
             </w:r>
           </w:p>
         </w:tc>
@@ -267,7 +267,7 @@
         <w:rPr>
           <w:rStyle w:val="VerbatimChar"/>
         </w:rPr>
-        <w:t xml:space="preserve">-&gt; deployment plan</w:t>
+        <w:t xml:space="preserve">-&gt; AI 응용 배포·제어 계획</w:t>
       </w:r>
       <w:r>
         <w:br/>

</xml_diff>

<commit_message>
Document service-control package with diagrams
</commit_message>
<xml_diff>
--- a/docs/deliverables/docx/01_LLM_Operation_Management_Design.docx
+++ b/docs/deliverables/docx/01_LLM_Operation_Management_Design.docx
@@ -2,7 +2,7 @@
 <file path=word/document.xml><?xml version="1.0" encoding="utf-8"?>
 <w:document xmlns:w="http://schemas.openxmlformats.org/wordprocessingml/2006/main" xmlns:m="http://schemas.openxmlformats.org/officeDocument/2006/math" xmlns:r="http://schemas.openxmlformats.org/officeDocument/2006/relationships" xmlns:o="urn:schemas-microsoft-com:office:office" xmlns:v="urn:schemas-microsoft-com:vml" xmlns:w10="urn:schemas-microsoft-com:office:word" xmlns:a="http://schemas.openxmlformats.org/drawingml/2006/main" xmlns:pic="http://schemas.openxmlformats.org/drawingml/2006/picture" xmlns:wp="http://schemas.openxmlformats.org/drawingml/2006/wordprocessingDrawing">
   <w:body>
-    <w:bookmarkStart w:id="17" w:name="llm-운영-관리-구조-설계서"/>
+    <w:bookmarkStart w:id="21" w:name="llm-운영-관리-구조-설계서"/>
     <w:p>
       <w:pPr>
         <w:pStyle w:val="Heading1"/>
@@ -37,13 +37,68 @@
       </w:r>
     </w:p>
     <w:bookmarkEnd w:id="9"/>
-    <w:bookmarkStart w:id="10" w:name="한눈에-보는-구조"/>
+    <w:bookmarkStart w:id="13" w:name="한눈에-보는-구조"/>
     <w:p>
       <w:pPr>
         <w:pStyle w:val="Heading2"/>
       </w:pPr>
       <w:r>
         <w:t xml:space="preserve">2. 한눈에 보는 구조</w:t>
+      </w:r>
+    </w:p>
+    <w:p>
+      <w:pPr>
+        <w:pStyle w:val="CaptionedFigure"/>
+      </w:pPr>
+      <w:r>
+        <w:drawing>
+          <wp:inline>
+            <wp:extent cx="5334000" cy="1849693"/>
+            <wp:effectExtent b="0" l="0" r="0" t="0"/>
+            <wp:docPr descr="LLM 운영 관리 흐름도" title="" id="11" name="Picture"/>
+            <a:graphic>
+              <a:graphicData uri="http://schemas.openxmlformats.org/drawingml/2006/picture">
+                <pic:pic>
+                  <pic:nvPicPr>
+                    <pic:cNvPr descr="../images/llm_operation_flow.png" id="12" name="Picture"/>
+                    <pic:cNvPicPr>
+                      <a:picLocks noChangeArrowheads="1" noChangeAspect="1"/>
+                    </pic:cNvPicPr>
+                  </pic:nvPicPr>
+                  <pic:blipFill>
+                    <a:blip r:embed="rId10"/>
+                    <a:stretch>
+                      <a:fillRect/>
+                    </a:stretch>
+                  </pic:blipFill>
+                  <pic:spPr bwMode="auto">
+                    <a:xfrm>
+                      <a:off x="0" y="0"/>
+                      <a:ext cx="5334000" cy="1849693"/>
+                    </a:xfrm>
+                    <a:prstGeom prst="rect">
+                      <a:avLst/>
+                    </a:prstGeom>
+                    <a:noFill/>
+                    <a:ln w="9525">
+                      <a:noFill/>
+                      <a:headEnd/>
+                      <a:tailEnd/>
+                    </a:ln>
+                  </pic:spPr>
+                </pic:pic>
+              </a:graphicData>
+            </a:graphic>
+          </wp:inline>
+        </w:drawing>
+      </w:r>
+    </w:p>
+    <w:p>
+      <w:pPr>
+        <w:pStyle w:val="ImageCaption"/>
+      </w:pPr>
+      <w:r>
+        <w:t xml:space="preserve">LLM 운영 관리 흐름도</w:t>
       </w:r>
     </w:p>
     <w:tbl>
@@ -204,8 +259,8 @@
         </w:tc>
       </w:tr>
     </w:tbl>
-    <w:bookmarkEnd w:id="10"/>
-    <w:bookmarkStart w:id="11" w:name="운영-흐름"/>
+    <w:bookmarkEnd w:id="13"/>
+    <w:bookmarkStart w:id="14" w:name="운영-흐름"/>
     <w:p>
       <w:pPr>
         <w:pStyle w:val="Heading2"/>
@@ -287,8 +342,8 @@
         <w:t xml:space="preserve">LLM은 운영 판단 후보를 제공하고, Go service-control layer는 선정 결과와 후속 action이 허용 범위 안에 있는지 검증합니다.</w:t>
       </w:r>
     </w:p>
-    <w:bookmarkEnd w:id="11"/>
-    <w:bookmarkStart w:id="12" w:name="정책-설정"/>
+    <w:bookmarkEnd w:id="14"/>
+    <w:bookmarkStart w:id="15" w:name="정책-설정"/>
     <w:p>
       <w:pPr>
         <w:pStyle w:val="Heading2"/>
@@ -370,6 +425,60 @@
               <w:pStyle w:val="Compact"/>
             </w:pPr>
             <w:r>
+              <w:t xml:space="preserve">실제 모델 연결</w:t>
+            </w:r>
+          </w:p>
+        </w:tc>
+        <w:tc>
+          <w:tcPr/>
+          <w:p>
+            <w:pPr>
+              <w:pStyle w:val="Compact"/>
+            </w:pPr>
+            <w:r>
+              <w:rPr>
+                <w:rStyle w:val="VerbatimChar"/>
+              </w:rPr>
+              <w:t xml:space="preserve">config/ops_llm_eval_candidates.json</w:t>
+            </w:r>
+          </w:p>
+        </w:tc>
+      </w:tr>
+      <w:tr>
+        <w:tc>
+          <w:tcPr/>
+          <w:p>
+            <w:pPr>
+              <w:pStyle w:val="Compact"/>
+            </w:pPr>
+            <w:r>
+              <w:t xml:space="preserve">평가 scenario</w:t>
+            </w:r>
+          </w:p>
+        </w:tc>
+        <w:tc>
+          <w:tcPr/>
+          <w:p>
+            <w:pPr>
+              <w:pStyle w:val="Compact"/>
+            </w:pPr>
+            <w:r>
+              <w:rPr>
+                <w:rStyle w:val="VerbatimChar"/>
+              </w:rPr>
+              <w:t xml:space="preserve">data/ops_llm_eval_scenarios.jsonl</w:t>
+            </w:r>
+          </w:p>
+        </w:tc>
+      </w:tr>
+      <w:tr>
+        <w:tc>
+          <w:tcPr/>
+          <w:p>
+            <w:pPr>
+              <w:pStyle w:val="Compact"/>
+            </w:pPr>
+            <w:r>
               <w:t xml:space="preserve">policy 예시</w:t>
             </w:r>
           </w:p>
@@ -501,8 +610,8 @@
         </w:tc>
       </w:tr>
     </w:tbl>
-    <w:bookmarkEnd w:id="12"/>
-    <w:bookmarkStart w:id="13" w:name="candidate-역할"/>
+    <w:bookmarkEnd w:id="15"/>
+    <w:bookmarkStart w:id="16" w:name="candidate-역할"/>
     <w:p>
       <w:pPr>
         <w:pStyle w:val="Heading2"/>
@@ -676,8 +785,79 @@
         </w:tc>
       </w:tr>
     </w:tbl>
-    <w:bookmarkEnd w:id="13"/>
-    <w:bookmarkStart w:id="14" w:name="score-구성"/>
+    <w:p>
+      <w:pPr>
+        <w:pStyle w:val="BodyText"/>
+      </w:pPr>
+      <w:r>
+        <w:t xml:space="preserve">위 candidate 값은 내부 역할 label입니다. 실제 provider model 이름은</w:t>
+      </w:r>
+      <w:r>
+        <w:t xml:space="preserve"> </w:t>
+      </w:r>
+      <w:r>
+        <w:rPr>
+          <w:rStyle w:val="VerbatimChar"/>
+        </w:rPr>
+        <w:t xml:space="preserve">actual_model</w:t>
+      </w:r>
+      <w:r>
+        <w:t xml:space="preserve">,</w:t>
+      </w:r>
+      <w:r>
+        <w:t xml:space="preserve"> </w:t>
+      </w:r>
+      <w:r>
+        <w:rPr>
+          <w:rStyle w:val="VerbatimChar"/>
+        </w:rPr>
+        <w:t xml:space="preserve">selected_actual_model</w:t>
+      </w:r>
+      <w:r>
+        <w:t xml:space="preserve">,</w:t>
+      </w:r>
+      <w:r>
+        <w:t xml:space="preserve"> </w:t>
+      </w:r>
+      <w:r>
+        <w:rPr>
+          <w:rStyle w:val="VerbatimChar"/>
+        </w:rPr>
+        <w:t xml:space="preserve">selected_provider</w:t>
+      </w:r>
+      <w:r>
+        <w:t xml:space="preserve">,</w:t>
+      </w:r>
+      <w:r>
+        <w:t xml:space="preserve"> </w:t>
+      </w:r>
+      <w:r>
+        <w:rPr>
+          <w:rStyle w:val="VerbatimChar"/>
+        </w:rPr>
+        <w:t xml:space="preserve">benchmark_status</w:t>
+      </w:r>
+      <w:r>
+        <w:t xml:space="preserve"> </w:t>
+      </w:r>
+      <w:r>
+        <w:t xml:space="preserve">필드로 분리합니다. 현재 기본 benchmark status는</w:t>
+      </w:r>
+      <w:r>
+        <w:t xml:space="preserve"> </w:t>
+      </w:r>
+      <w:r>
+        <w:rPr>
+          <w:rStyle w:val="VerbatimChar"/>
+        </w:rPr>
+        <w:t xml:space="preserve">not_executed</w:t>
+      </w:r>
+      <w:r>
+        <w:t xml:space="preserve">이며, 실제 모델 API 평가가 완료된 상태로 해석하지 않습니다.</w:t>
+      </w:r>
+    </w:p>
+    <w:bookmarkEnd w:id="16"/>
+    <w:bookmarkStart w:id="17" w:name="score-구성"/>
     <w:p>
       <w:pPr>
         <w:pStyle w:val="Heading2"/>
@@ -921,8 +1101,8 @@
         <w:t xml:space="preserve">정책별 weight를 적용해 candidate score를 계산하고, 가장 높은 score를 받은 후보를 runtime model로 선택합니다.</w:t>
       </w:r>
     </w:p>
-    <w:bookmarkEnd w:id="14"/>
-    <w:bookmarkStart w:id="15" w:name="apicli-검증"/>
+    <w:bookmarkEnd w:id="17"/>
+    <w:bookmarkStart w:id="18" w:name="apicli-검증"/>
     <w:p>
       <w:pPr>
         <w:pStyle w:val="Heading2"/>
@@ -987,6 +1167,24 @@
         </w:rPr>
         <w:t xml:space="preserve">selected_model = primary-ops-llm</w:t>
       </w:r>
+      <w:r>
+        <w:br/>
+      </w:r>
+      <w:r>
+        <w:rPr>
+          <w:rStyle w:val="VerbatimChar"/>
+        </w:rPr>
+        <w:t xml:space="preserve">selected_actual_model = to-be-evaluated-primary-model</w:t>
+      </w:r>
+      <w:r>
+        <w:br/>
+      </w:r>
+      <w:r>
+        <w:rPr>
+          <w:rStyle w:val="VerbatimChar"/>
+        </w:rPr>
+        <w:t xml:space="preserve">benchmark_status = not_executed</w:t>
+      </w:r>
     </w:p>
     <w:p>
       <w:pPr>
@@ -1025,14 +1223,159 @@
         <w:t xml:space="preserve">  -d '{"policy":"quality_first"}'</w:t>
       </w:r>
     </w:p>
-    <w:bookmarkEnd w:id="15"/>
-    <w:bookmarkStart w:id="16" w:name="설계-경계"/>
+    <w:bookmarkEnd w:id="18"/>
+    <w:bookmarkStart w:id="19" w:name="ops-llm-평가-dry-run"/>
     <w:p>
       <w:pPr>
         <w:pStyle w:val="Heading2"/>
       </w:pPr>
       <w:r>
-        <w:t xml:space="preserve">8. 설계 경계</w:t>
+        <w:t xml:space="preserve">8. Ops LLM 평가 Dry-Run</w:t>
+      </w:r>
+    </w:p>
+    <w:p>
+      <w:pPr>
+        <w:pStyle w:val="FirstParagraph"/>
+      </w:pPr>
+      <w:r>
+        <w:t xml:space="preserve">실제 provider API를 호출하지 않고 scenario/candidate 연결과 evaluator 구조를 검증합니다.</w:t>
+      </w:r>
+    </w:p>
+    <w:p>
+      <w:pPr>
+        <w:pStyle w:val="SourceCode"/>
+      </w:pPr>
+      <w:r>
+        <w:rPr>
+          <w:rStyle w:val="VerbatimChar"/>
+        </w:rPr>
+        <w:t xml:space="preserve">cd go/service-control-api</w:t>
+      </w:r>
+      <w:r>
+        <w:br/>
+      </w:r>
+      <w:r>
+        <w:rPr>
+          <w:rStyle w:val="VerbatimChar"/>
+        </w:rPr>
+        <w:t xml:space="preserve">go run ./cmd/aiops-service-control run-ops-llm-benchmark \</w:t>
+      </w:r>
+      <w:r>
+        <w:br/>
+      </w:r>
+      <w:r>
+        <w:rPr>
+          <w:rStyle w:val="VerbatimChar"/>
+        </w:rPr>
+        <w:t xml:space="preserve">  --scenarios ../../data/ops_llm_eval_scenarios.jsonl \</w:t>
+      </w:r>
+      <w:r>
+        <w:br/>
+      </w:r>
+      <w:r>
+        <w:rPr>
+          <w:rStyle w:val="VerbatimChar"/>
+        </w:rPr>
+        <w:t xml:space="preserve">  --candidates ../../config/ops_llm_eval_candidates.json \</w:t>
+      </w:r>
+      <w:r>
+        <w:br/>
+      </w:r>
+      <w:r>
+        <w:rPr>
+          <w:rStyle w:val="VerbatimChar"/>
+        </w:rPr>
+        <w:t xml:space="preserve">  --output-dir ../../runs/ops-llm-evaluation-dry-run \</w:t>
+      </w:r>
+      <w:r>
+        <w:br/>
+      </w:r>
+      <w:r>
+        <w:rPr>
+          <w:rStyle w:val="VerbatimChar"/>
+        </w:rPr>
+        <w:t xml:space="preserve">  --dry-run</w:t>
+      </w:r>
+      <w:r>
+        <w:br/>
+      </w:r>
+      <w:r>
+        <w:br/>
+      </w:r>
+      <w:r>
+        <w:rPr>
+          <w:rStyle w:val="VerbatimChar"/>
+        </w:rPr>
+        <w:t xml:space="preserve">go run ./cmd/aiops-service-control evaluate-ops-llm-outputs \</w:t>
+      </w:r>
+      <w:r>
+        <w:br/>
+      </w:r>
+      <w:r>
+        <w:rPr>
+          <w:rStyle w:val="VerbatimChar"/>
+        </w:rPr>
+        <w:t xml:space="preserve">  --scenarios ../../data/ops_llm_eval_scenarios.jsonl \</w:t>
+      </w:r>
+      <w:r>
+        <w:br/>
+      </w:r>
+      <w:r>
+        <w:rPr>
+          <w:rStyle w:val="VerbatimChar"/>
+        </w:rPr>
+        <w:t xml:space="preserve">  --outputs ../../runs/ops-llm-evaluation-dry-run/model_outputs.jsonl \</w:t>
+      </w:r>
+      <w:r>
+        <w:br/>
+      </w:r>
+      <w:r>
+        <w:rPr>
+          <w:rStyle w:val="VerbatimChar"/>
+        </w:rPr>
+        <w:t xml:space="preserve">  --summary ../../runs/ops-llm-evaluation-dry-run/evaluation_summary.json</w:t>
+      </w:r>
+    </w:p>
+    <w:p>
+      <w:pPr>
+        <w:pStyle w:val="FirstParagraph"/>
+      </w:pPr>
+      <w:r>
+        <w:t xml:space="preserve">dry-run 결과는</w:t>
+      </w:r>
+      <w:r>
+        <w:t xml:space="preserve"> </w:t>
+      </w:r>
+      <w:r>
+        <w:rPr>
+          <w:rStyle w:val="VerbatimChar"/>
+        </w:rPr>
+        <w:t xml:space="preserve">benchmark_status = dry_run</w:t>
+      </w:r>
+      <w:r>
+        <w:t xml:space="preserve">으로 기록됩니다.</w:t>
+      </w:r>
+      <w:r>
+        <w:t xml:space="preserve"> </w:t>
+      </w:r>
+      <w:r>
+        <w:rPr>
+          <w:rStyle w:val="VerbatimChar"/>
+        </w:rPr>
+        <w:t xml:space="preserve">benchmark_status = executed</w:t>
+      </w:r>
+      <w:r>
+        <w:t xml:space="preserve">인 실제 모델 응답이 수집되기 전까지는 최종 LLM 품질 평가로 주장하지 않습니다.</w:t>
+      </w:r>
+    </w:p>
+    <w:bookmarkEnd w:id="19"/>
+    <w:bookmarkStart w:id="20" w:name="설계-경계"/>
+    <w:p>
+      <w:pPr>
+        <w:pStyle w:val="Heading2"/>
+      </w:pPr>
+      <w:r>
+        <w:t xml:space="preserve">9. 설계 경계</w:t>
       </w:r>
     </w:p>
     <w:tbl>
@@ -1105,6 +1448,30 @@
               <w:pStyle w:val="Compact"/>
             </w:pPr>
             <w:r>
+              <w:t xml:space="preserve">Actual model 경계</w:t>
+            </w:r>
+          </w:p>
+        </w:tc>
+        <w:tc>
+          <w:tcPr/>
+          <w:p>
+            <w:pPr>
+              <w:pStyle w:val="Compact"/>
+            </w:pPr>
+            <w:r>
+              <w:t xml:space="preserve">role label과 실제 provider model 이름을 분리한다.</w:t>
+            </w:r>
+          </w:p>
+        </w:tc>
+      </w:tr>
+      <w:tr>
+        <w:tc>
+          <w:tcPr/>
+          <w:p>
+            <w:pPr>
+              <w:pStyle w:val="Compact"/>
+            </w:pPr>
+            <w:r>
               <w:t xml:space="preserve">실행 경계</w:t>
             </w:r>
           </w:p>
@@ -1170,8 +1537,8 @@
         </w:tc>
       </w:tr>
     </w:tbl>
-    <w:bookmarkEnd w:id="16"/>
-    <w:bookmarkEnd w:id="17"/>
+    <w:bookmarkEnd w:id="20"/>
+    <w:bookmarkEnd w:id="21"/>
     <w:sectPr>
       <w:footnotePr>
         <w:numRestart w:val="eachSect"/>

</xml_diff>

<commit_message>
Add LLM deployment planner and AppDeploy integration
</commit_message>
<xml_diff>
--- a/docs/deliverables/docx/01_LLM_Operation_Management_Design.docx
+++ b/docs/deliverables/docx/01_LLM_Operation_Management_Design.docx
@@ -2,7 +2,7 @@
 <file path=word/document.xml><?xml version="1.0" encoding="utf-8"?>
 <w:document xmlns:w="http://schemas.openxmlformats.org/wordprocessingml/2006/main" xmlns:m="http://schemas.openxmlformats.org/officeDocument/2006/math" xmlns:r="http://schemas.openxmlformats.org/officeDocument/2006/relationships" xmlns:o="urn:schemas-microsoft-com:office:office" xmlns:v="urn:schemas-microsoft-com:vml" xmlns:w10="urn:schemas-microsoft-com:office:word" xmlns:a="http://schemas.openxmlformats.org/drawingml/2006/main" xmlns:pic="http://schemas.openxmlformats.org/drawingml/2006/picture" xmlns:wp="http://schemas.openxmlformats.org/drawingml/2006/wordprocessingDrawing">
   <w:body>
-    <w:bookmarkStart w:id="21" w:name="llm-운영-관리-구조-설계서"/>
+    <w:bookmarkStart w:id="22" w:name="llm-운영-관리-구조-설계서"/>
     <w:p>
       <w:pPr>
         <w:pStyle w:val="Heading1"/>
@@ -16,7 +16,7 @@
         <w:pStyle w:val="FirstParagraph"/>
       </w:pPr>
       <w:r>
-        <w:t xml:space="preserve">영문 제목: LLM Operation Management Structure Design</w:t>
+        <w:t xml:space="preserve">English title: LLM Operation Management Structure Design</w:t>
       </w:r>
     </w:p>
     <w:bookmarkStart w:id="9" w:name="설계-목적"/>
@@ -53,7 +53,7 @@
       <w:r>
         <w:drawing>
           <wp:inline>
-            <wp:extent cx="5334000" cy="1849693"/>
+            <wp:extent cx="5334000" cy="2823882"/>
             <wp:effectExtent b="0" l="0" r="0" t="0"/>
             <wp:docPr descr="LLM 운영 관리 흐름도" title="" id="11" name="Picture"/>
             <a:graphic>
@@ -74,7 +74,7 @@
                   <pic:spPr bwMode="auto">
                     <a:xfrm>
                       <a:off x="0" y="0"/>
-                      <a:ext cx="5334000" cy="1849693"/>
+                      <a:ext cx="5334000" cy="2823882"/>
                     </a:xfrm>
                     <a:prstGeom prst="rect">
                       <a:avLst/>
@@ -104,7 +104,8 @@
     <w:tbl>
       <w:tblPr>
         <w:tblStyle w:val="Table"/>
-        <w:tblW w:type="auto" w:w="0"/>
+        <w:tblW w:type="pct" w:w="5000"/>
+        <w:tblLayout w:type="fixed"/>
         <w:tblLook w:firstRow="1" w:lastRow="0" w:firstColumn="0" w:lastColumn="0" w:noHBand="0" w:noVBand="0" w:val="0020"/>
       </w:tblPr>
       <w:tblGrid>
@@ -229,7 +230,7 @@
               <w:pStyle w:val="Compact"/>
             </w:pPr>
             <w:r>
-              <w:t xml:space="preserve">agent registry, CPU/GPU placement, AI 응용 배포·제어 계획</w:t>
+              <w:t xml:space="preserve">실제 LLM Action 제안, Agent Registry, VM 적합성, Go Guard와 배포·제어 handoff</w:t>
             </w:r>
           </w:p>
         </w:tc>
@@ -313,7 +314,7 @@
         <w:rPr>
           <w:rStyle w:val="VerbatimChar"/>
         </w:rPr>
-        <w:t xml:space="preserve">-&gt; CPU/GPU VM placement</w:t>
+        <w:t xml:space="preserve">-&gt; actual VM suitability validation</w:t>
       </w:r>
       <w:r>
         <w:br/>
@@ -322,7 +323,16 @@
         <w:rPr>
           <w:rStyle w:val="VerbatimChar"/>
         </w:rPr>
-        <w:t xml:space="preserve">-&gt; AI 응용 배포·제어 계획</w:t>
+        <w:t xml:space="preserve">-&gt; actual LLM Action proposal</w:t>
+      </w:r>
+      <w:r>
+        <w:br/>
+      </w:r>
+      <w:r>
+        <w:rPr>
+          <w:rStyle w:val="VerbatimChar"/>
+        </w:rPr>
+        <w:t xml:space="preserve">-&gt; Go Guard and external handoff</w:t>
       </w:r>
       <w:r>
         <w:br/>
@@ -741,7 +751,7 @@
               <w:pStyle w:val="Compact"/>
             </w:pPr>
             <w:r>
-              <w:t xml:space="preserve">smoke-test 또는 비용 중심 검증</w:t>
+              <w:t xml:space="preserve">기초 검증 또는 비용 중심 검증</w:t>
             </w:r>
           </w:p>
         </w:tc>
@@ -1369,13 +1379,231 @@
       </w:r>
     </w:p>
     <w:bookmarkEnd w:id="19"/>
-    <w:bookmarkStart w:id="20" w:name="설계-경계"/>
+    <w:bookmarkStart w:id="20" w:name="자동화-action-연계"/>
     <w:p>
       <w:pPr>
         <w:pStyle w:val="Heading2"/>
       </w:pPr>
       <w:r>
-        <w:t xml:space="preserve">9. 설계 경계</w:t>
+        <w:t xml:space="preserve">9. 자동화 Action 연계</w:t>
+      </w:r>
+    </w:p>
+    <w:p>
+      <w:pPr>
+        <w:pStyle w:val="FirstParagraph"/>
+      </w:pPr>
+      <w:r>
+        <w:t xml:space="preserve">Benchmark와 실제 자동화 판단은 같은 OpenAI-compatible Go client를 사용하지만 결과 상태를 분리합니다.</w:t>
+      </w:r>
+    </w:p>
+    <w:tbl>
+      <w:tblPr>
+        <w:tblStyle w:val="Table"/>
+        <w:tblW w:type="pct" w:w="5000"/>
+        <w:tblLayout w:type="fixed"/>
+        <w:tblLook w:firstRow="1" w:lastRow="0" w:firstColumn="0" w:lastColumn="0" w:noHBand="0" w:noVBand="0" w:val="0020"/>
+      </w:tblPr>
+      <w:tblGrid>
+        <w:gridCol w:w="2640"/>
+        <w:gridCol w:w="2640"/>
+        <w:gridCol w:w="2640"/>
+      </w:tblGrid>
+      <w:tr>
+        <w:trPr>
+          <w:tblHeader w:val="on"/>
+        </w:trPr>
+        <w:tc>
+          <w:tcPr/>
+          <w:p>
+            <w:pPr>
+              <w:pStyle w:val="Compact"/>
+            </w:pPr>
+            <w:r>
+              <w:t xml:space="preserve">실행</w:t>
+            </w:r>
+          </w:p>
+        </w:tc>
+        <w:tc>
+          <w:tcPr/>
+          <w:p>
+            <w:pPr>
+              <w:pStyle w:val="Compact"/>
+            </w:pPr>
+            <w:r>
+              <w:t xml:space="preserve">상태 필드</w:t>
+            </w:r>
+          </w:p>
+        </w:tc>
+        <w:tc>
+          <w:tcPr/>
+          <w:p>
+            <w:pPr>
+              <w:pStyle w:val="Compact"/>
+            </w:pPr>
+            <w:r>
+              <w:t xml:space="preserve">의미</w:t>
+            </w:r>
+          </w:p>
+        </w:tc>
+      </w:tr>
+      <w:tr>
+        <w:tc>
+          <w:tcPr/>
+          <w:p>
+            <w:pPr>
+              <w:pStyle w:val="Compact"/>
+            </w:pPr>
+            <w:r>
+              <w:t xml:space="preserve">Ops candidate 평가</w:t>
+            </w:r>
+          </w:p>
+        </w:tc>
+        <w:tc>
+          <w:tcPr/>
+          <w:p>
+            <w:pPr>
+              <w:pStyle w:val="Compact"/>
+            </w:pPr>
+            <w:r>
+              <w:rPr>
+                <w:rStyle w:val="VerbatimChar"/>
+              </w:rPr>
+              <w:t xml:space="preserve">benchmark_status</w:t>
+            </w:r>
+          </w:p>
+        </w:tc>
+        <w:tc>
+          <w:tcPr/>
+          <w:p>
+            <w:pPr>
+              <w:pStyle w:val="Compact"/>
+            </w:pPr>
+            <w:r>
+              <w:t xml:space="preserve">후보 모델의 scenario 평가 실행 여부</w:t>
+            </w:r>
+          </w:p>
+        </w:tc>
+      </w:tr>
+      <w:tr>
+        <w:tc>
+          <w:tcPr/>
+          <w:p>
+            <w:pPr>
+              <w:pStyle w:val="Compact"/>
+            </w:pPr>
+            <w:r>
+              <w:t xml:space="preserve">자동화 Action 제안</w:t>
+            </w:r>
+          </w:p>
+        </w:tc>
+        <w:tc>
+          <w:tcPr/>
+          <w:p>
+            <w:pPr>
+              <w:pStyle w:val="Compact"/>
+            </w:pPr>
+            <w:r>
+              <w:rPr>
+                <w:rStyle w:val="VerbatimChar"/>
+              </w:rPr>
+              <w:t xml:space="preserve">decision_execution_status</w:t>
+            </w:r>
+          </w:p>
+        </w:tc>
+        <w:tc>
+          <w:tcPr/>
+          <w:p>
+            <w:pPr>
+              <w:pStyle w:val="Compact"/>
+            </w:pPr>
+            <w:r>
+              <w:t xml:space="preserve">실제 LLM이 현재 workload에 대한 Action을 제안했는지 여부</w:t>
+            </w:r>
+          </w:p>
+        </w:tc>
+      </w:tr>
+      <w:tr>
+        <w:tc>
+          <w:tcPr/>
+          <w:p>
+            <w:pPr>
+              <w:pStyle w:val="Compact"/>
+            </w:pPr>
+            <w:r>
+              <w:t xml:space="preserve">외부 제어</w:t>
+            </w:r>
+          </w:p>
+        </w:tc>
+        <w:tc>
+          <w:tcPr/>
+          <w:p>
+            <w:pPr>
+              <w:pStyle w:val="Compact"/>
+            </w:pPr>
+            <w:r>
+              <w:rPr>
+                <w:rStyle w:val="VerbatimChar"/>
+              </w:rPr>
+              <w:t xml:space="preserve">handoff.execution_status</w:t>
+            </w:r>
+          </w:p>
+        </w:tc>
+        <w:tc>
+          <w:tcPr/>
+          <w:p>
+            <w:pPr>
+              <w:pStyle w:val="Compact"/>
+            </w:pPr>
+            <w:r>
+              <w:t xml:space="preserve">외부 실행 주체가 실제로 제어를 수행했는지 여부</w:t>
+            </w:r>
+          </w:p>
+        </w:tc>
+      </w:tr>
+    </w:tbl>
+    <w:p>
+      <w:pPr>
+        <w:pStyle w:val="BodyText"/>
+      </w:pPr>
+      <w:r>
+        <w:t xml:space="preserve">LLM 자동화 제안은</w:t>
+      </w:r>
+      <w:r>
+        <w:t xml:space="preserve"> </w:t>
+      </w:r>
+      <w:r>
+        <w:rPr>
+          <w:rStyle w:val="VerbatimChar"/>
+        </w:rPr>
+        <w:t xml:space="preserve">plan-llm-automation-action</w:t>
+      </w:r>
+      <w:r>
+        <w:t xml:space="preserve"> </w:t>
+      </w:r>
+      <w:r>
+        <w:t xml:space="preserve">또는</w:t>
+      </w:r>
+      <w:r>
+        <w:t xml:space="preserve"> </w:t>
+      </w:r>
+      <w:r>
+        <w:rPr>
+          <w:rStyle w:val="VerbatimChar"/>
+        </w:rPr>
+        <w:t xml:space="preserve">/api/v1/automation/action-proposals</w:t>
+      </w:r>
+      <w:r>
+        <w:t xml:space="preserve">로 호출합니다. LLM 실패나 잘못된 JSON은 성공 baseline으로 대체하지 않습니다.</w:t>
+      </w:r>
+    </w:p>
+    <w:bookmarkEnd w:id="20"/>
+    <w:bookmarkStart w:id="21" w:name="설계-경계"/>
+    <w:p>
+      <w:pPr>
+        <w:pStyle w:val="Heading2"/>
+      </w:pPr>
+      <w:r>
+        <w:t xml:space="preserve">10. 설계 경계</w:t>
       </w:r>
     </w:p>
     <w:tbl>
@@ -1537,8 +1765,8 @@
         </w:tc>
       </w:tr>
     </w:tbl>
-    <w:bookmarkEnd w:id="20"/>
     <w:bookmarkEnd w:id="21"/>
+    <w:bookmarkEnd w:id="22"/>
     <w:sectPr>
       <w:footnotePr>
         <w:numRestart w:val="eachSect"/>

</xml_diff>